<commit_message>
Record full payment schedule in legal notice draft
Replaces the placeholder payment paragraph with the itemised schedule
totalling Rs. 2,21,200, notes that only Rs. 80,000 reached the supplier
firm's own current account, and adds a demand for a tax invoice covering
the full value. Adds advocate notes on the third-party payments and on
the unverified date of the Rs. 80,000 transfer.

Co-Authored-By: Claude Opus 5 <noreply@anthropic.com>
Claude-Session: https://claude.ai/code/session_01JwS8aN6FDpkQcEk2vsBb7X
</commit_message>
<xml_diff>
--- a/legal/Legal-Notice-Draft-Wood-and-Wood-Products.docx
+++ b/legal/Legal-Notice-Draft-Wood-and-Wood-Products.docx
@@ -585,37 +585,777 @@
           <w:sz w:val="22"/>
           <w:szCs w:val="22"/>
         </w:rPr>
-        <w:t xml:space="preserve">1.5  On your demand my client transferred a further sum of Rs. 80,000/- to your current account on 09.06.2026, and a further sum of Rs. </w:t>
-      </w:r>
-      <w:r>
-        <w:rPr>
-          <w:highlight w:val="yellow"/>
-          <w:highlightCs w:val="yellow"/>
-        </w:rPr>
-        <w:t xml:space="preserve">[AMOUNT]</w:t>
-      </w:r>
-      <w:r>
-        <w:rPr>
-          <w:rFonts w:ascii="Calibri" w:cs="Calibri" w:eastAsia="Calibri" w:hAnsi="Calibri"/>
-          <w:sz w:val="22"/>
-          <w:szCs w:val="22"/>
-        </w:rPr>
-        <w:t xml:space="preserve">/- on </w:t>
-      </w:r>
-      <w:r>
-        <w:rPr>
-          <w:highlight w:val="yellow"/>
-          <w:highlightCs w:val="yellow"/>
-        </w:rPr>
-        <w:t xml:space="preserve">[DATE]</w:t>
-      </w:r>
-      <w:r>
-        <w:rPr>
-          <w:rFonts w:ascii="Calibri" w:cs="Calibri" w:eastAsia="Calibri" w:hAnsi="Calibri"/>
-          <w:sz w:val="22"/>
-          <w:szCs w:val="22"/>
-        </w:rPr>
-        <w:t xml:space="preserve"> to a savings account nominated by you. The entire consideration stood duly paid by my client.</w:t>
+        <w:t xml:space="preserve">1.5  On your instructions and at the accounts nominated by you from time to time, my client paid to you the entire consideration aggregating to Rs. 2,21,200/- as follows:</w:t>
+      </w:r>
+    </w:p>
+    <w:tbl>
+      <w:tblPr>
+        <w:tblW w:type="dxa" w:w="9300"/>
+        <w:tblBorders>
+          <w:top w:val="single" w:color="auto" w:sz="4"/>
+          <w:left w:val="single" w:color="auto" w:sz="4"/>
+          <w:bottom w:val="single" w:color="auto" w:sz="4"/>
+          <w:right w:val="single" w:color="auto" w:sz="4"/>
+          <w:insideH w:val="single" w:color="auto" w:sz="4"/>
+          <w:insideV w:val="single" w:color="auto" w:sz="4"/>
+        </w:tblBorders>
+      </w:tblPr>
+      <w:tblGrid>
+        <w:gridCol w:w="1600"/>
+        <w:gridCol w:w="2100"/>
+        <w:gridCol w:w="3900"/>
+        <w:gridCol w:w="1700"/>
+      </w:tblGrid>
+      <w:tr>
+        <w:trPr>
+          <w:tblHeader/>
+        </w:trPr>
+        <w:tc>
+          <w:tcPr>
+            <w:tcW w:type="dxa" w:w="1600"/>
+            <w:shd w:fill="E8E8E8" w:val="clear"/>
+            <w:tcMar>
+              <w:top w:type="dxa" w:w="80"/>
+              <w:left w:type="dxa" w:w="110"/>
+              <w:bottom w:type="dxa" w:w="80"/>
+              <w:right w:type="dxa" w:w="110"/>
+            </w:tcMar>
+          </w:tcPr>
+          <w:p>
+            <w:pPr>
+              <w:spacing w:after="0" w:line="276"/>
+            </w:pPr>
+            <w:r>
+              <w:rPr>
+                <w:rFonts w:ascii="Calibri" w:cs="Calibri" w:eastAsia="Calibri" w:hAnsi="Calibri"/>
+                <w:b/>
+                <w:bCs/>
+                <w:sz w:val="22"/>
+                <w:szCs w:val="22"/>
+              </w:rPr>
+              <w:t xml:space="preserve">Date</w:t>
+            </w:r>
+          </w:p>
+        </w:tc>
+        <w:tc>
+          <w:tcPr>
+            <w:tcW w:type="dxa" w:w="2100"/>
+            <w:shd w:fill="E8E8E8" w:val="clear"/>
+            <w:tcMar>
+              <w:top w:type="dxa" w:w="80"/>
+              <w:left w:type="dxa" w:w="110"/>
+              <w:bottom w:type="dxa" w:w="80"/>
+              <w:right w:type="dxa" w:w="110"/>
+            </w:tcMar>
+          </w:tcPr>
+          <w:p>
+            <w:pPr>
+              <w:spacing w:after="0" w:line="276"/>
+            </w:pPr>
+            <w:r>
+              <w:rPr>
+                <w:rFonts w:ascii="Calibri" w:cs="Calibri" w:eastAsia="Calibri" w:hAnsi="Calibri"/>
+                <w:b/>
+                <w:bCs/>
+                <w:sz w:val="22"/>
+                <w:szCs w:val="22"/>
+              </w:rPr>
+              <w:t xml:space="preserve">Mode</w:t>
+            </w:r>
+          </w:p>
+        </w:tc>
+        <w:tc>
+          <w:tcPr>
+            <w:tcW w:type="dxa" w:w="3900"/>
+            <w:shd w:fill="E8E8E8" w:val="clear"/>
+            <w:tcMar>
+              <w:top w:type="dxa" w:w="80"/>
+              <w:left w:type="dxa" w:w="110"/>
+              <w:bottom w:type="dxa" w:w="80"/>
+              <w:right w:type="dxa" w:w="110"/>
+            </w:tcMar>
+          </w:tcPr>
+          <w:p>
+            <w:pPr>
+              <w:spacing w:after="0" w:line="276"/>
+            </w:pPr>
+            <w:r>
+              <w:rPr>
+                <w:rFonts w:ascii="Calibri" w:cs="Calibri" w:eastAsia="Calibri" w:hAnsi="Calibri"/>
+                <w:b/>
+                <w:bCs/>
+                <w:sz w:val="22"/>
+                <w:szCs w:val="22"/>
+              </w:rPr>
+              <w:t xml:space="preserve">Paid into</w:t>
+            </w:r>
+          </w:p>
+        </w:tc>
+        <w:tc>
+          <w:tcPr>
+            <w:tcW w:type="dxa" w:w="1700"/>
+            <w:shd w:fill="E8E8E8" w:val="clear"/>
+            <w:tcMar>
+              <w:top w:type="dxa" w:w="80"/>
+              <w:left w:type="dxa" w:w="110"/>
+              <w:bottom w:type="dxa" w:w="80"/>
+              <w:right w:type="dxa" w:w="110"/>
+            </w:tcMar>
+          </w:tcPr>
+          <w:p>
+            <w:pPr>
+              <w:spacing w:after="0" w:line="276"/>
+              <w:jc w:val="right"/>
+            </w:pPr>
+            <w:r>
+              <w:rPr>
+                <w:rFonts w:ascii="Calibri" w:cs="Calibri" w:eastAsia="Calibri" w:hAnsi="Calibri"/>
+                <w:b/>
+                <w:bCs/>
+                <w:sz w:val="22"/>
+                <w:szCs w:val="22"/>
+              </w:rPr>
+              <w:t xml:space="preserve">Amount (Rs.)</w:t>
+            </w:r>
+          </w:p>
+        </w:tc>
+      </w:tr>
+      <w:tr>
+        <w:tc>
+          <w:tcPr>
+            <w:tcW w:type="dxa" w:w="1600"/>
+            <w:tcMar>
+              <w:top w:type="dxa" w:w="80"/>
+              <w:left w:type="dxa" w:w="110"/>
+              <w:bottom w:type="dxa" w:w="80"/>
+              <w:right w:type="dxa" w:w="110"/>
+            </w:tcMar>
+          </w:tcPr>
+          <w:p>
+            <w:pPr>
+              <w:spacing w:after="0" w:line="276"/>
+            </w:pPr>
+            <w:r>
+              <w:rPr>
+                <w:rFonts w:ascii="Calibri" w:cs="Calibri" w:eastAsia="Calibri" w:hAnsi="Calibri"/>
+                <w:sz w:val="22"/>
+                <w:szCs w:val="22"/>
+              </w:rPr>
+              <w:t xml:space="preserve">02.06.2026</w:t>
+            </w:r>
+          </w:p>
+        </w:tc>
+        <w:tc>
+          <w:tcPr>
+            <w:tcW w:type="dxa" w:w="2100"/>
+            <w:tcMar>
+              <w:top w:type="dxa" w:w="80"/>
+              <w:left w:type="dxa" w:w="110"/>
+              <w:bottom w:type="dxa" w:w="80"/>
+              <w:right w:type="dxa" w:w="110"/>
+            </w:tcMar>
+          </w:tcPr>
+          <w:p>
+            <w:pPr>
+              <w:spacing w:after="0" w:line="276"/>
+            </w:pPr>
+            <w:r>
+              <w:rPr>
+                <w:rFonts w:ascii="Calibri" w:cs="Calibri" w:eastAsia="Calibri" w:hAnsi="Calibri"/>
+                <w:sz w:val="22"/>
+                <w:szCs w:val="22"/>
+              </w:rPr>
+              <w:t xml:space="preserve">Cash</w:t>
+            </w:r>
+          </w:p>
+        </w:tc>
+        <w:tc>
+          <w:tcPr>
+            <w:tcW w:type="dxa" w:w="3900"/>
+            <w:tcMar>
+              <w:top w:type="dxa" w:w="80"/>
+              <w:left w:type="dxa" w:w="110"/>
+              <w:bottom w:type="dxa" w:w="80"/>
+              <w:right w:type="dxa" w:w="110"/>
+            </w:tcMar>
+          </w:tcPr>
+          <w:p>
+            <w:pPr>
+              <w:spacing w:after="0" w:line="276"/>
+            </w:pPr>
+            <w:r>
+              <w:rPr>
+                <w:rFonts w:ascii="Calibri" w:cs="Calibri" w:eastAsia="Calibri" w:hAnsi="Calibri"/>
+                <w:sz w:val="22"/>
+                <w:szCs w:val="22"/>
+              </w:rPr>
+              <w:t xml:space="preserve">Paid in hand at the Noticee’s office</w:t>
+            </w:r>
+          </w:p>
+        </w:tc>
+        <w:tc>
+          <w:tcPr>
+            <w:tcW w:type="dxa" w:w="1700"/>
+            <w:tcMar>
+              <w:top w:type="dxa" w:w="80"/>
+              <w:left w:type="dxa" w:w="110"/>
+              <w:bottom w:type="dxa" w:w="80"/>
+              <w:right w:type="dxa" w:w="110"/>
+            </w:tcMar>
+          </w:tcPr>
+          <w:p>
+            <w:pPr>
+              <w:spacing w:after="0" w:line="276"/>
+              <w:jc w:val="right"/>
+            </w:pPr>
+            <w:r>
+              <w:rPr>
+                <w:rFonts w:ascii="Calibri" w:cs="Calibri" w:eastAsia="Calibri" w:hAnsi="Calibri"/>
+                <w:sz w:val="22"/>
+                <w:szCs w:val="22"/>
+              </w:rPr>
+              <w:t xml:space="preserve">20,000</w:t>
+            </w:r>
+          </w:p>
+        </w:tc>
+      </w:tr>
+      <w:tr>
+        <w:tc>
+          <w:tcPr>
+            <w:tcW w:type="dxa" w:w="1600"/>
+            <w:tcMar>
+              <w:top w:type="dxa" w:w="80"/>
+              <w:left w:type="dxa" w:w="110"/>
+              <w:bottom w:type="dxa" w:w="80"/>
+              <w:right w:type="dxa" w:w="110"/>
+            </w:tcMar>
+          </w:tcPr>
+          <w:p>
+            <w:pPr>
+              <w:spacing w:after="0" w:line="276"/>
+            </w:pPr>
+            <w:r>
+              <w:rPr>
+                <w:rFonts w:ascii="Calibri" w:cs="Calibri" w:eastAsia="Calibri" w:hAnsi="Calibri"/>
+                <w:sz w:val="22"/>
+                <w:szCs w:val="22"/>
+              </w:rPr>
+              <w:t xml:space="preserve">09.06.2026</w:t>
+            </w:r>
+          </w:p>
+        </w:tc>
+        <w:tc>
+          <w:tcPr>
+            <w:tcW w:type="dxa" w:w="2100"/>
+            <w:tcMar>
+              <w:top w:type="dxa" w:w="80"/>
+              <w:left w:type="dxa" w:w="110"/>
+              <w:bottom w:type="dxa" w:w="80"/>
+              <w:right w:type="dxa" w:w="110"/>
+            </w:tcMar>
+          </w:tcPr>
+          <w:p>
+            <w:pPr>
+              <w:spacing w:after="0" w:line="276"/>
+            </w:pPr>
+            <w:r>
+              <w:rPr>
+                <w:rFonts w:ascii="Calibri" w:cs="Calibri" w:eastAsia="Calibri" w:hAnsi="Calibri"/>
+                <w:sz w:val="22"/>
+                <w:szCs w:val="22"/>
+              </w:rPr>
+              <w:t xml:space="preserve">Bank transfer</w:t>
+            </w:r>
+          </w:p>
+        </w:tc>
+        <w:tc>
+          <w:tcPr>
+            <w:tcW w:type="dxa" w:w="3900"/>
+            <w:tcMar>
+              <w:top w:type="dxa" w:w="80"/>
+              <w:left w:type="dxa" w:w="110"/>
+              <w:bottom w:type="dxa" w:w="80"/>
+              <w:right w:type="dxa" w:w="110"/>
+            </w:tcMar>
+          </w:tcPr>
+          <w:p>
+            <w:pPr>
+              <w:spacing w:after="0" w:line="276"/>
+            </w:pPr>
+            <w:r>
+              <w:rPr>
+                <w:rFonts w:ascii="Calibri" w:cs="Calibri" w:eastAsia="Calibri" w:hAnsi="Calibri"/>
+                <w:sz w:val="22"/>
+                <w:szCs w:val="22"/>
+              </w:rPr>
+              <w:t xml:space="preserve">Current account of M/s Wood and Wood Products  [VERIFY DATE AGAINST BANK STATEMENT]</w:t>
+            </w:r>
+          </w:p>
+        </w:tc>
+        <w:tc>
+          <w:tcPr>
+            <w:tcW w:type="dxa" w:w="1700"/>
+            <w:tcMar>
+              <w:top w:type="dxa" w:w="80"/>
+              <w:left w:type="dxa" w:w="110"/>
+              <w:bottom w:type="dxa" w:w="80"/>
+              <w:right w:type="dxa" w:w="110"/>
+            </w:tcMar>
+          </w:tcPr>
+          <w:p>
+            <w:pPr>
+              <w:spacing w:after="0" w:line="276"/>
+              <w:jc w:val="right"/>
+            </w:pPr>
+            <w:r>
+              <w:rPr>
+                <w:rFonts w:ascii="Calibri" w:cs="Calibri" w:eastAsia="Calibri" w:hAnsi="Calibri"/>
+                <w:sz w:val="22"/>
+                <w:szCs w:val="22"/>
+              </w:rPr>
+              <w:t xml:space="preserve">80,000</w:t>
+            </w:r>
+          </w:p>
+        </w:tc>
+      </w:tr>
+      <w:tr>
+        <w:tc>
+          <w:tcPr>
+            <w:tcW w:type="dxa" w:w="1600"/>
+            <w:tcMar>
+              <w:top w:type="dxa" w:w="80"/>
+              <w:left w:type="dxa" w:w="110"/>
+              <w:bottom w:type="dxa" w:w="80"/>
+              <w:right w:type="dxa" w:w="110"/>
+            </w:tcMar>
+          </w:tcPr>
+          <w:p>
+            <w:pPr>
+              <w:spacing w:after="0" w:line="276"/>
+            </w:pPr>
+            <w:r>
+              <w:rPr>
+                <w:rFonts w:ascii="Calibri" w:cs="Calibri" w:eastAsia="Calibri" w:hAnsi="Calibri"/>
+                <w:sz w:val="22"/>
+                <w:szCs w:val="22"/>
+              </w:rPr>
+              <w:t xml:space="preserve">08.07.2026</w:t>
+            </w:r>
+          </w:p>
+        </w:tc>
+        <w:tc>
+          <w:tcPr>
+            <w:tcW w:type="dxa" w:w="2100"/>
+            <w:tcMar>
+              <w:top w:type="dxa" w:w="80"/>
+              <w:left w:type="dxa" w:w="110"/>
+              <w:bottom w:type="dxa" w:w="80"/>
+              <w:right w:type="dxa" w:w="110"/>
+            </w:tcMar>
+          </w:tcPr>
+          <w:p>
+            <w:pPr>
+              <w:spacing w:after="0" w:line="276"/>
+            </w:pPr>
+            <w:r>
+              <w:rPr>
+                <w:rFonts w:ascii="Calibri" w:cs="Calibri" w:eastAsia="Calibri" w:hAnsi="Calibri"/>
+                <w:sz w:val="22"/>
+                <w:szCs w:val="22"/>
+              </w:rPr>
+              <w:t xml:space="preserve">Bank transfer</w:t>
+            </w:r>
+          </w:p>
+        </w:tc>
+        <w:tc>
+          <w:tcPr>
+            <w:tcW w:type="dxa" w:w="3900"/>
+            <w:tcMar>
+              <w:top w:type="dxa" w:w="80"/>
+              <w:left w:type="dxa" w:w="110"/>
+              <w:bottom w:type="dxa" w:w="80"/>
+              <w:right w:type="dxa" w:w="110"/>
+            </w:tcMar>
+          </w:tcPr>
+          <w:p>
+            <w:pPr>
+              <w:spacing w:after="0" w:line="276"/>
+            </w:pPr>
+            <w:r>
+              <w:rPr>
+                <w:rFonts w:ascii="Calibri" w:cs="Calibri" w:eastAsia="Calibri" w:hAnsi="Calibri"/>
+                <w:sz w:val="22"/>
+                <w:szCs w:val="22"/>
+              </w:rPr>
+              <w:t xml:space="preserve">Savings account in the name of Sri Ramkrishna Mandal, as nominated by the Noticee</w:t>
+            </w:r>
+          </w:p>
+        </w:tc>
+        <w:tc>
+          <w:tcPr>
+            <w:tcW w:type="dxa" w:w="1700"/>
+            <w:tcMar>
+              <w:top w:type="dxa" w:w="80"/>
+              <w:left w:type="dxa" w:w="110"/>
+              <w:bottom w:type="dxa" w:w="80"/>
+              <w:right w:type="dxa" w:w="110"/>
+            </w:tcMar>
+          </w:tcPr>
+          <w:p>
+            <w:pPr>
+              <w:spacing w:after="0" w:line="276"/>
+              <w:jc w:val="right"/>
+            </w:pPr>
+            <w:r>
+              <w:rPr>
+                <w:rFonts w:ascii="Calibri" w:cs="Calibri" w:eastAsia="Calibri" w:hAnsi="Calibri"/>
+                <w:sz w:val="22"/>
+                <w:szCs w:val="22"/>
+              </w:rPr>
+              <w:t xml:space="preserve">50,000</w:t>
+            </w:r>
+          </w:p>
+        </w:tc>
+      </w:tr>
+      <w:tr>
+        <w:tc>
+          <w:tcPr>
+            <w:tcW w:type="dxa" w:w="1600"/>
+            <w:tcMar>
+              <w:top w:type="dxa" w:w="80"/>
+              <w:left w:type="dxa" w:w="110"/>
+              <w:bottom w:type="dxa" w:w="80"/>
+              <w:right w:type="dxa" w:w="110"/>
+            </w:tcMar>
+          </w:tcPr>
+          <w:p>
+            <w:pPr>
+              <w:spacing w:after="0" w:line="276"/>
+            </w:pPr>
+            <w:r>
+              <w:rPr>
+                <w:rFonts w:ascii="Calibri" w:cs="Calibri" w:eastAsia="Calibri" w:hAnsi="Calibri"/>
+                <w:sz w:val="22"/>
+                <w:szCs w:val="22"/>
+              </w:rPr>
+              <w:t xml:space="preserve">08.07.2026</w:t>
+            </w:r>
+          </w:p>
+        </w:tc>
+        <w:tc>
+          <w:tcPr>
+            <w:tcW w:type="dxa" w:w="2100"/>
+            <w:tcMar>
+              <w:top w:type="dxa" w:w="80"/>
+              <w:left w:type="dxa" w:w="110"/>
+              <w:bottom w:type="dxa" w:w="80"/>
+              <w:right w:type="dxa" w:w="110"/>
+            </w:tcMar>
+          </w:tcPr>
+          <w:p>
+            <w:pPr>
+              <w:spacing w:after="0" w:line="276"/>
+            </w:pPr>
+            <w:r>
+              <w:rPr>
+                <w:rFonts w:ascii="Calibri" w:cs="Calibri" w:eastAsia="Calibri" w:hAnsi="Calibri"/>
+                <w:sz w:val="22"/>
+                <w:szCs w:val="22"/>
+              </w:rPr>
+              <w:t xml:space="preserve">Bank transfer</w:t>
+            </w:r>
+          </w:p>
+        </w:tc>
+        <w:tc>
+          <w:tcPr>
+            <w:tcW w:type="dxa" w:w="3900"/>
+            <w:tcMar>
+              <w:top w:type="dxa" w:w="80"/>
+              <w:left w:type="dxa" w:w="110"/>
+              <w:bottom w:type="dxa" w:w="80"/>
+              <w:right w:type="dxa" w:w="110"/>
+            </w:tcMar>
+          </w:tcPr>
+          <w:p>
+            <w:pPr>
+              <w:spacing w:after="0" w:line="276"/>
+            </w:pPr>
+            <w:r>
+              <w:rPr>
+                <w:rFonts w:ascii="Calibri" w:cs="Calibri" w:eastAsia="Calibri" w:hAnsi="Calibri"/>
+                <w:sz w:val="22"/>
+                <w:szCs w:val="22"/>
+              </w:rPr>
+              <w:t xml:space="preserve">Savings account in the name of Sri Ajay Sharma, as nominated by the Noticee</w:t>
+            </w:r>
+          </w:p>
+        </w:tc>
+        <w:tc>
+          <w:tcPr>
+            <w:tcW w:type="dxa" w:w="1700"/>
+            <w:tcMar>
+              <w:top w:type="dxa" w:w="80"/>
+              <w:left w:type="dxa" w:w="110"/>
+              <w:bottom w:type="dxa" w:w="80"/>
+              <w:right w:type="dxa" w:w="110"/>
+            </w:tcMar>
+          </w:tcPr>
+          <w:p>
+            <w:pPr>
+              <w:spacing w:after="0" w:line="276"/>
+              <w:jc w:val="right"/>
+            </w:pPr>
+            <w:r>
+              <w:rPr>
+                <w:rFonts w:ascii="Calibri" w:cs="Calibri" w:eastAsia="Calibri" w:hAnsi="Calibri"/>
+                <w:sz w:val="22"/>
+                <w:szCs w:val="22"/>
+              </w:rPr>
+              <w:t xml:space="preserve">20,000</w:t>
+            </w:r>
+          </w:p>
+        </w:tc>
+      </w:tr>
+      <w:tr>
+        <w:tc>
+          <w:tcPr>
+            <w:tcW w:type="dxa" w:w="1600"/>
+            <w:tcMar>
+              <w:top w:type="dxa" w:w="80"/>
+              <w:left w:type="dxa" w:w="110"/>
+              <w:bottom w:type="dxa" w:w="80"/>
+              <w:right w:type="dxa" w:w="110"/>
+            </w:tcMar>
+          </w:tcPr>
+          <w:p>
+            <w:pPr>
+              <w:spacing w:after="0" w:line="276"/>
+            </w:pPr>
+            <w:r>
+              <w:rPr>
+                <w:rFonts w:ascii="Calibri" w:cs="Calibri" w:eastAsia="Calibri" w:hAnsi="Calibri"/>
+                <w:sz w:val="22"/>
+                <w:szCs w:val="22"/>
+              </w:rPr>
+              <w:t xml:space="preserve">11.07.2026</w:t>
+            </w:r>
+          </w:p>
+        </w:tc>
+        <w:tc>
+          <w:tcPr>
+            <w:tcW w:type="dxa" w:w="2100"/>
+            <w:tcMar>
+              <w:top w:type="dxa" w:w="80"/>
+              <w:left w:type="dxa" w:w="110"/>
+              <w:bottom w:type="dxa" w:w="80"/>
+              <w:right w:type="dxa" w:w="110"/>
+            </w:tcMar>
+          </w:tcPr>
+          <w:p>
+            <w:pPr>
+              <w:spacing w:after="0" w:line="276"/>
+            </w:pPr>
+            <w:r>
+              <w:rPr>
+                <w:rFonts w:ascii="Calibri" w:cs="Calibri" w:eastAsia="Calibri" w:hAnsi="Calibri"/>
+                <w:sz w:val="22"/>
+                <w:szCs w:val="22"/>
+              </w:rPr>
+              <w:t xml:space="preserve">Bank transfer</w:t>
+            </w:r>
+          </w:p>
+        </w:tc>
+        <w:tc>
+          <w:tcPr>
+            <w:tcW w:type="dxa" w:w="3900"/>
+            <w:tcMar>
+              <w:top w:type="dxa" w:w="80"/>
+              <w:left w:type="dxa" w:w="110"/>
+              <w:bottom w:type="dxa" w:w="80"/>
+              <w:right w:type="dxa" w:w="110"/>
+            </w:tcMar>
+          </w:tcPr>
+          <w:p>
+            <w:pPr>
+              <w:spacing w:after="0" w:line="276"/>
+            </w:pPr>
+            <w:r>
+              <w:rPr>
+                <w:rFonts w:ascii="Calibri" w:cs="Calibri" w:eastAsia="Calibri" w:hAnsi="Calibri"/>
+                <w:sz w:val="22"/>
+                <w:szCs w:val="22"/>
+              </w:rPr>
+              <w:t xml:space="preserve">Savings account in the name of Sri Ajay Sharma, as nominated by the Noticee</w:t>
+            </w:r>
+          </w:p>
+        </w:tc>
+        <w:tc>
+          <w:tcPr>
+            <w:tcW w:type="dxa" w:w="1700"/>
+            <w:tcMar>
+              <w:top w:type="dxa" w:w="80"/>
+              <w:left w:type="dxa" w:w="110"/>
+              <w:bottom w:type="dxa" w:w="80"/>
+              <w:right w:type="dxa" w:w="110"/>
+            </w:tcMar>
+          </w:tcPr>
+          <w:p>
+            <w:pPr>
+              <w:spacing w:after="0" w:line="276"/>
+              <w:jc w:val="right"/>
+            </w:pPr>
+            <w:r>
+              <w:rPr>
+                <w:rFonts w:ascii="Calibri" w:cs="Calibri" w:eastAsia="Calibri" w:hAnsi="Calibri"/>
+                <w:sz w:val="22"/>
+                <w:szCs w:val="22"/>
+              </w:rPr>
+              <w:t xml:space="preserve">51,200</w:t>
+            </w:r>
+          </w:p>
+        </w:tc>
+      </w:tr>
+      <w:tr>
+        <w:tc>
+          <w:tcPr>
+            <w:tcW w:type="dxa" w:w="1600"/>
+            <w:tcMar>
+              <w:top w:type="dxa" w:w="80"/>
+              <w:left w:type="dxa" w:w="110"/>
+              <w:bottom w:type="dxa" w:w="80"/>
+              <w:right w:type="dxa" w:w="110"/>
+            </w:tcMar>
+          </w:tcPr>
+          <w:p>
+            <w:pPr>
+              <w:spacing w:after="0" w:line="276"/>
+            </w:pPr>
+            <w:r>
+              <w:rPr>
+                <w:rFonts w:ascii="Calibri" w:cs="Calibri" w:eastAsia="Calibri" w:hAnsi="Calibri"/>
+                <w:sz w:val="22"/>
+                <w:szCs w:val="22"/>
+              </w:rPr>
+              <w:t xml:space="preserve"/>
+            </w:r>
+          </w:p>
+        </w:tc>
+        <w:tc>
+          <w:tcPr>
+            <w:tcW w:type="dxa" w:w="2100"/>
+            <w:tcMar>
+              <w:top w:type="dxa" w:w="80"/>
+              <w:left w:type="dxa" w:w="110"/>
+              <w:bottom w:type="dxa" w:w="80"/>
+              <w:right w:type="dxa" w:w="110"/>
+            </w:tcMar>
+          </w:tcPr>
+          <w:p>
+            <w:pPr>
+              <w:spacing w:after="0" w:line="276"/>
+            </w:pPr>
+            <w:r>
+              <w:rPr>
+                <w:rFonts w:ascii="Calibri" w:cs="Calibri" w:eastAsia="Calibri" w:hAnsi="Calibri"/>
+                <w:sz w:val="22"/>
+                <w:szCs w:val="22"/>
+              </w:rPr>
+              <w:t xml:space="preserve"/>
+            </w:r>
+          </w:p>
+        </w:tc>
+        <w:tc>
+          <w:tcPr>
+            <w:tcW w:type="dxa" w:w="3900"/>
+            <w:tcMar>
+              <w:top w:type="dxa" w:w="80"/>
+              <w:left w:type="dxa" w:w="110"/>
+              <w:bottom w:type="dxa" w:w="80"/>
+              <w:right w:type="dxa" w:w="110"/>
+            </w:tcMar>
+          </w:tcPr>
+          <w:p>
+            <w:pPr>
+              <w:spacing w:after="0" w:line="276"/>
+            </w:pPr>
+            <w:r>
+              <w:rPr>
+                <w:rFonts w:ascii="Calibri" w:cs="Calibri" w:eastAsia="Calibri" w:hAnsi="Calibri"/>
+                <w:b/>
+                <w:bCs/>
+                <w:sz w:val="22"/>
+                <w:szCs w:val="22"/>
+              </w:rPr>
+              <w:t xml:space="preserve">Total consideration paid</w:t>
+            </w:r>
+          </w:p>
+        </w:tc>
+        <w:tc>
+          <w:tcPr>
+            <w:tcW w:type="dxa" w:w="1700"/>
+            <w:tcMar>
+              <w:top w:type="dxa" w:w="80"/>
+              <w:left w:type="dxa" w:w="110"/>
+              <w:bottom w:type="dxa" w:w="80"/>
+              <w:right w:type="dxa" w:w="110"/>
+            </w:tcMar>
+          </w:tcPr>
+          <w:p>
+            <w:pPr>
+              <w:spacing w:after="0" w:line="276"/>
+              <w:jc w:val="right"/>
+            </w:pPr>
+            <w:r>
+              <w:rPr>
+                <w:rFonts w:ascii="Calibri" w:cs="Calibri" w:eastAsia="Calibri" w:hAnsi="Calibri"/>
+                <w:b/>
+                <w:bCs/>
+                <w:sz w:val="22"/>
+                <w:szCs w:val="22"/>
+              </w:rPr>
+              <w:t xml:space="preserve">2,21,200</w:t>
+            </w:r>
+          </w:p>
+        </w:tc>
+      </w:tr>
+    </w:tbl>
+    <w:p>
+      <w:pPr>
+        <w:spacing w:after="120" w:line="276"/>
+      </w:pPr>
+      <w:r>
+        <w:rPr>
+          <w:rFonts w:ascii="Calibri" w:cs="Calibri" w:eastAsia="Calibri" w:hAnsi="Calibri"/>
+          <w:sz w:val="22"/>
+          <w:szCs w:val="22"/>
+        </w:rPr>
+        <w:t xml:space="preserve"/>
+      </w:r>
+    </w:p>
+    <w:p>
+      <w:pPr>
+        <w:spacing w:after="120" w:line="276"/>
+      </w:pPr>
+      <w:r>
+        <w:rPr>
+          <w:rFonts w:ascii="Calibri" w:cs="Calibri" w:eastAsia="Calibri" w:hAnsi="Calibri"/>
+          <w:sz w:val="22"/>
+          <w:szCs w:val="22"/>
+        </w:rPr>
+        <w:t xml:space="preserve">1.6  It is material to record that of the said aggregate sum of Rs. 2,21,200/-, only Rs. 80,000/- was received into the current account maintained in the name of M/s Wood and Wood Products. The balance was taken by you in cash and into savings bank accounts standing in the names of third parties nominated by you, namely Sri Ramkrishna Mandal and Sri Ajay Sharma, neither of whom is a party to the contract. The particulars of each such account were furnished by you to my client in writing on WhatsApp, and those messages are on record.</w:t>
+      </w:r>
+    </w:p>
+    <w:p>
+      <w:pPr>
+        <w:spacing w:after="120" w:line="276"/>
+      </w:pPr>
+      <w:r>
+        <w:rPr>
+          <w:rFonts w:ascii="Calibri" w:cs="Calibri" w:eastAsia="Calibri" w:hAnsi="Calibri"/>
+          <w:sz w:val="22"/>
+          <w:szCs w:val="22"/>
+        </w:rPr>
+        <w:t xml:space="preserve">1.7  Despite receipt of the entire consideration, you have to date failed and neglected to issue to my client a tax invoice for the full value of the goods supplied. My client calls upon you to do so forthwith.</w:t>
       </w:r>
     </w:p>
     <w:p>
@@ -872,7 +1612,7 @@
                 <w:sz w:val="22"/>
                 <w:szCs w:val="22"/>
               </w:rPr>
-              <w:t xml:space="preserve">Rs. 80,000/- transferred to the Noticee’s current account on his demand.</w:t>
+              <w:t xml:space="preserve">Rs. 80,000/- transferred to the current account of M/s Wood and Wood Products on the Noticee’s demand.</w:t>
             </w:r>
           </w:p>
         </w:tc>
@@ -900,7 +1640,7 @@
                 <w:sz w:val="22"/>
                 <w:szCs w:val="22"/>
               </w:rPr>
-              <w:t xml:space="preserve">[DATE]</w:t>
+              <w:t xml:space="preserve">08.07.2026</w:t>
             </w:r>
           </w:p>
         </w:tc>
@@ -924,7 +1664,59 @@
                 <w:sz w:val="22"/>
                 <w:szCs w:val="22"/>
               </w:rPr>
-              <w:t xml:space="preserve">Balance of Rs. [AMOUNT]/- transferred to the savings account nominated by the Noticee.</w:t>
+              <w:t xml:space="preserve">Rs. 50,000/- and Rs. 20,000/- transferred to savings accounts of two third parties nominated by the Noticee.</w:t>
+            </w:r>
+          </w:p>
+        </w:tc>
+      </w:tr>
+      <w:tr>
+        <w:tc>
+          <w:tcPr>
+            <w:tcW w:type="dxa" w:w="2100"/>
+            <w:tcMar>
+              <w:top w:type="dxa" w:w="80"/>
+              <w:left w:type="dxa" w:w="110"/>
+              <w:bottom w:type="dxa" w:w="80"/>
+              <w:right w:type="dxa" w:w="110"/>
+            </w:tcMar>
+          </w:tcPr>
+          <w:p>
+            <w:pPr>
+              <w:spacing w:after="0" w:line="276"/>
+            </w:pPr>
+            <w:r>
+              <w:rPr>
+                <w:rFonts w:ascii="Calibri" w:cs="Calibri" w:eastAsia="Calibri" w:hAnsi="Calibri"/>
+                <w:b/>
+                <w:bCs/>
+                <w:sz w:val="22"/>
+                <w:szCs w:val="22"/>
+              </w:rPr>
+              <w:t xml:space="preserve">11.07.2026</w:t>
+            </w:r>
+          </w:p>
+        </w:tc>
+        <w:tc>
+          <w:tcPr>
+            <w:tcW w:type="dxa" w:w="7200"/>
+            <w:tcMar>
+              <w:top w:type="dxa" w:w="80"/>
+              <w:left w:type="dxa" w:w="110"/>
+              <w:bottom w:type="dxa" w:w="80"/>
+              <w:right w:type="dxa" w:w="110"/>
+            </w:tcMar>
+          </w:tcPr>
+          <w:p>
+            <w:pPr>
+              <w:spacing w:after="0" w:line="276"/>
+            </w:pPr>
+            <w:r>
+              <w:rPr>
+                <w:rFonts w:ascii="Calibri" w:cs="Calibri" w:eastAsia="Calibri" w:hAnsi="Calibri"/>
+                <w:sz w:val="22"/>
+                <w:szCs w:val="22"/>
+              </w:rPr>
+              <w:t xml:space="preserve">Rs. 51,200/- transferred to a savings account of a third party nominated by the Noticee, on the very date of dispatch. Total consideration of Rs. 2,21,200/- thereby stood fully paid.</w:t>
             </w:r>
           </w:p>
         </w:tc>
@@ -2474,7 +3266,25 @@
           <w:sz w:val="22"/>
           <w:szCs w:val="22"/>
         </w:rPr>
-        <w:t xml:space="preserve">Issue to my client a proper credit note and/or delivery challan in respect of the 21 pcs returned to you on 30.07.2026, so as to enable my client to correctly reflect the transaction in his statutory returns; and</w:t>
+        <w:t xml:space="preserve">Issue to my client a proper credit note and/or delivery challan in respect of the 21 pcs returned to you on 30.07.2026, so as to enable my client to correctly reflect the transaction in his statutory returns;</w:t>
+      </w:r>
+    </w:p>
+    <w:p>
+      <w:pPr>
+        <w:pStyle w:val="ListParagraph"/>
+        <w:numPr>
+          <w:ilvl w:val="0"/>
+          <w:numId w:val="2"/>
+        </w:numPr>
+        <w:spacing w:after="100" w:line="276"/>
+      </w:pPr>
+      <w:r>
+        <w:rPr>
+          <w:rFonts w:ascii="Calibri" w:cs="Calibri" w:eastAsia="Calibri" w:hAnsi="Calibri"/>
+          <w:sz w:val="22"/>
+          <w:szCs w:val="22"/>
+        </w:rPr>
+        <w:t xml:space="preserve">Issue to my client a proper tax invoice for the full value of the goods supplied, namely Rs. 2,21,200/-, in accordance with Section 31 of the Central Goods and Services Tax Act, 2017, my client having paid the said sum in its entirety; and</w:t>
       </w:r>
     </w:p>
     <w:p>
@@ -3010,6 +3820,46 @@
           <w:szCs w:val="22"/>
         </w:rPr>
         <w:t xml:space="preserve">The client holds audio recordings of the conversations to which he was himself a party. Please preserve the original recordings on the original device and prepare the certificate under Section 63 of the Bharatiya Sakshya Adhiniyam, 2023.</w:t>
+      </w:r>
+    </w:p>
+    <w:p>
+      <w:pPr>
+        <w:pStyle w:val="ListParagraph"/>
+        <w:numPr>
+          <w:ilvl w:val="0"/>
+          <w:numId w:val="3"/>
+        </w:numPr>
+        <w:spacing w:after="80" w:line="276"/>
+      </w:pPr>
+      <w:r>
+        <w:rPr>
+          <w:rFonts w:ascii="Calibri" w:cs="Calibri" w:eastAsia="Calibri" w:hAnsi="Calibri"/>
+          <w:i/>
+          <w:iCs/>
+          <w:sz w:val="22"/>
+          <w:szCs w:val="22"/>
+        </w:rPr>
+        <w:t xml:space="preserve">IMPORTANT — of the total consideration of Rs. 2,21,200/-, only Rs. 80,000/- was paid into the Noticee firm’s own current account. Rs. 20,000/- was paid in cash and Rs. 1,21,200/- into savings accounts of two individuals nominated by the Noticee. Please satisfy yourself, from the WhatsApp record, that the Noticee himself furnished those account particulars, as proof of payment will otherwise be contested. Please also advise the client separately on his own position under Section 40A(3) of the Income-tax Act, 1961 in respect of the cash payment, and on his invoicing and input tax credit position, before this notice is issued.</w:t>
+      </w:r>
+    </w:p>
+    <w:p>
+      <w:pPr>
+        <w:pStyle w:val="ListParagraph"/>
+        <w:numPr>
+          <w:ilvl w:val="0"/>
+          <w:numId w:val="3"/>
+        </w:numPr>
+        <w:spacing w:after="80" w:line="276"/>
+      </w:pPr>
+      <w:r>
+        <w:rPr>
+          <w:rFonts w:ascii="Calibri" w:cs="Calibri" w:eastAsia="Calibri" w:hAnsi="Calibri"/>
+          <w:i/>
+          <w:iCs/>
+          <w:sz w:val="22"/>
+          <w:szCs w:val="22"/>
+        </w:rPr>
+        <w:t xml:space="preserve">The date of the Rs. 80,000/- transfer must be verified against the bank statement — the client has stated it variously as 09.06.2026 and 09.07.2026, and the delay computation in this notice turns on it.</w:t>
       </w:r>
     </w:p>
     <w:p>

</xml_diff>

<commit_message>
Correct payment dates and replacement-document demand in notice
Fixes the 08.07 / 09.07 transfers, drops the stale date-verification
note now that the bank dates are confirmed, and changes the invoicing
demand to a Rule 55 delivery challan plus e-way bill, the 21 pcs being
a replacement against goods already invoiced rather than a fresh supply.

Co-Authored-By: Claude Opus 5 <noreply@anthropic.com>
Claude-Session: https://claude.ai/code/session_01JwS8aN6FDpkQcEk2vsBb7X
</commit_message>
<xml_diff>
--- a/legal/Legal-Notice-Draft-Wood-and-Wood-Products.docx
+++ b/legal/Legal-Notice-Draft-Wood-and-Wood-Products.docx
@@ -888,7 +888,7 @@
                 <w:sz w:val="22"/>
                 <w:szCs w:val="22"/>
               </w:rPr>
-              <w:t xml:space="preserve">Current account of M/s Wood and Wood Products  [VERIFY DATE AGAINST BANK STATEMENT]</w:t>
+              <w:t xml:space="preserve">Current account of M/s Wood and Wood Products</w:t>
             </w:r>
           </w:p>
         </w:tc>
@@ -987,7 +987,7 @@
                 <w:sz w:val="22"/>
                 <w:szCs w:val="22"/>
               </w:rPr>
-              <w:t xml:space="preserve">Savings account in the name of Sri Ramkrishna Mandal, as nominated by the Noticee</w:t>
+              <w:t xml:space="preserve">Savings account in the name of Sri Ajay Sharma, as nominated by the Noticee</w:t>
             </w:r>
           </w:p>
         </w:tc>
@@ -1012,7 +1012,7 @@
                 <w:sz w:val="22"/>
                 <w:szCs w:val="22"/>
               </w:rPr>
-              <w:t xml:space="preserve">50,000</w:t>
+              <w:t xml:space="preserve">20,000</w:t>
             </w:r>
           </w:p>
         </w:tc>
@@ -1038,7 +1038,7 @@
                 <w:sz w:val="22"/>
                 <w:szCs w:val="22"/>
               </w:rPr>
-              <w:t xml:space="preserve">08.07.2026</w:t>
+              <w:t xml:space="preserve">09.07.2026</w:t>
             </w:r>
           </w:p>
         </w:tc>
@@ -1086,7 +1086,7 @@
                 <w:sz w:val="22"/>
                 <w:szCs w:val="22"/>
               </w:rPr>
-              <w:t xml:space="preserve">Savings account in the name of Sri Ajay Sharma, as nominated by the Noticee</w:t>
+              <w:t xml:space="preserve">Savings account in the name of Sri Ramkrishna Mandal, as nominated by the Noticee</w:t>
             </w:r>
           </w:p>
         </w:tc>
@@ -1111,7 +1111,7 @@
                 <w:sz w:val="22"/>
                 <w:szCs w:val="22"/>
               </w:rPr>
-              <w:t xml:space="preserve">20,000</w:t>
+              <w:t xml:space="preserve">50,000</w:t>
             </w:r>
           </w:p>
         </w:tc>
@@ -1640,7 +1640,7 @@
                 <w:sz w:val="22"/>
                 <w:szCs w:val="22"/>
               </w:rPr>
-              <w:t xml:space="preserve">08.07.2026</w:t>
+              <w:t xml:space="preserve">08.07.2026 and 09.07.2026</w:t>
             </w:r>
           </w:p>
         </w:tc>
@@ -1664,7 +1664,7 @@
                 <w:sz w:val="22"/>
                 <w:szCs w:val="22"/>
               </w:rPr>
-              <w:t xml:space="preserve">Rs. 50,000/- and Rs. 20,000/- transferred to savings accounts of two third parties nominated by the Noticee.</w:t>
+              <w:t xml:space="preserve">Rs. 20,000/- and Rs. 50,000/- respectively transferred to savings accounts of two third parties nominated by the Noticee.</w:t>
             </w:r>
           </w:p>
         </w:tc>
@@ -3284,7 +3284,7 @@
           <w:sz w:val="22"/>
           <w:szCs w:val="22"/>
         </w:rPr>
-        <w:t xml:space="preserve">Issue to my client a proper tax invoice for the full value of the goods supplied, namely Rs. 2,21,200/-, in accordance with Section 31 of the Central Goods and Services Tax Act, 2017, my client having paid the said sum in its entirety; and</w:t>
+        <w:t xml:space="preserve">Issue to my client, in respect of the 21 pcs now being re-supplied by way of replacement against the original supply, a proper delivery challan under Rule 55 of the Central Goods and Services Tax Rules, 2017 together with the corresponding e-way bill, and not a fresh tax invoice, the said goods being a replacement of goods already invoiced; and</w:t>
       </w:r>
     </w:p>
     <w:p>
@@ -3859,7 +3859,7 @@
           <w:sz w:val="22"/>
           <w:szCs w:val="22"/>
         </w:rPr>
-        <w:t xml:space="preserve">The date of the Rs. 80,000/- transfer must be verified against the bank statement — the client has stated it variously as 09.06.2026 and 09.07.2026, and the delay computation in this notice turns on it.</w:t>
+        <w:t xml:space="preserve">The client has been supplied a tax invoice for Rs. 80,000/- against the original consignment and has raised a corresponding invoice on his own customer for the same value, the customer being aware from the outset that the balance would not be invoiced. The claim for the unbilled balance of Rs. 1,41,200/- therefore rests entirely on the bank trail and on the WhatsApp messages by which the Noticee nominated the third-party accounts. Please examine that record before settling the figures in this notice.</w:t>
       </w:r>
     </w:p>
     <w:p>

</xml_diff>

<commit_message>
Record 22 Aug despatch without documents in legal notice
Adds the 21 Aug invoice request and the 22 Aug events: four-hour vehicle
detention with 156 minutes of billed waiting, release of goods at 6:40 pm
with no invoice, challan or e-way bill, refusal of the staff to speak,
and the resin/skin defects found in the replacement doors. Adds the
Rs. 546 waiting charge to the damages, a demand for the missing despatch
documents, and the corresponding annexures.

Co-Authored-By: Claude Opus 5 <noreply@anthropic.com>
Claude-Session: https://claude.ai/code/session_01JwS8aN6FDpkQcEk2vsBb7X
</commit_message>
<xml_diff>
--- a/legal/Legal-Notice-Draft-Wood-and-Wood-Products.docx
+++ b/legal/Legal-Notice-Draft-Wood-and-Wood-Products.docx
@@ -2212,6 +2212,58 @@
                 <w:sz w:val="22"/>
                 <w:szCs w:val="22"/>
               </w:rPr>
+              <w:t xml:space="preserve">21.08.2026</w:t>
+            </w:r>
+          </w:p>
+        </w:tc>
+        <w:tc>
+          <w:tcPr>
+            <w:tcW w:type="dxa" w:w="7200"/>
+            <w:tcMar>
+              <w:top w:type="dxa" w:w="80"/>
+              <w:left w:type="dxa" w:w="110"/>
+              <w:bottom w:type="dxa" w:w="80"/>
+              <w:right w:type="dxa" w:w="110"/>
+            </w:tcMar>
+          </w:tcPr>
+          <w:p>
+            <w:pPr>
+              <w:spacing w:after="0" w:line="276"/>
+            </w:pPr>
+            <w:r>
+              <w:rPr>
+                <w:rFonts w:ascii="Calibri" w:cs="Calibri" w:eastAsia="Calibri" w:hAnsi="Calibri"/>
+                <w:sz w:val="22"/>
+                <w:szCs w:val="22"/>
+              </w:rPr>
+              <w:t xml:space="preserve">The Noticee asked that a vehicle be sent that evening, representing that the goods were ready and were being packed. The Complainant messaged the Noticee at 5:30 p.m. asking that the invoice be prepared. No reply was received.</w:t>
+            </w:r>
+          </w:p>
+        </w:tc>
+      </w:tr>
+      <w:tr>
+        <w:tc>
+          <w:tcPr>
+            <w:tcW w:type="dxa" w:w="2100"/>
+            <w:tcMar>
+              <w:top w:type="dxa" w:w="80"/>
+              <w:left w:type="dxa" w:w="110"/>
+              <w:bottom w:type="dxa" w:w="80"/>
+              <w:right w:type="dxa" w:w="110"/>
+            </w:tcMar>
+          </w:tcPr>
+          <w:p>
+            <w:pPr>
+              <w:spacing w:after="0" w:line="276"/>
+            </w:pPr>
+            <w:r>
+              <w:rPr>
+                <w:rFonts w:ascii="Calibri" w:cs="Calibri" w:eastAsia="Calibri" w:hAnsi="Calibri"/>
+                <w:b/>
+                <w:bCs/>
+                <w:sz w:val="22"/>
+                <w:szCs w:val="22"/>
+              </w:rPr>
               <w:t xml:space="preserve">22.08.2026</w:t>
             </w:r>
           </w:p>
@@ -2236,7 +2288,111 @@
                 <w:sz w:val="22"/>
                 <w:szCs w:val="22"/>
               </w:rPr>
-              <w:t xml:space="preserve">Loading time shifted from 10:30 a.m. to 2:00 p.m. The Complainant attended the factory with a vehicle at the appointed time and found that only 18 of the 21 doors had been made, and those still under manufacture. He was made to wait several hours.</w:t>
+              <w:t xml:space="preserve">Loading time shifted from 10:30 a.m. to 2:00 p.m. The Complainant attended the factory with a hired vehicle at the appointed time and found that only 18 of the 21 doors had been made, and those still under manufacture. The vehicle was detained at the factory for 4 hours 06 minutes, of which 156 minutes were charged to the Complainant as waiting time.</w:t>
+            </w:r>
+          </w:p>
+        </w:tc>
+      </w:tr>
+      <w:tr>
+        <w:tc>
+          <w:tcPr>
+            <w:tcW w:type="dxa" w:w="2100"/>
+            <w:tcMar>
+              <w:top w:type="dxa" w:w="80"/>
+              <w:left w:type="dxa" w:w="110"/>
+              <w:bottom w:type="dxa" w:w="80"/>
+              <w:right w:type="dxa" w:w="110"/>
+            </w:tcMar>
+          </w:tcPr>
+          <w:p>
+            <w:pPr>
+              <w:spacing w:after="0" w:line="276"/>
+            </w:pPr>
+            <w:r>
+              <w:rPr>
+                <w:rFonts w:ascii="Calibri" w:cs="Calibri" w:eastAsia="Calibri" w:hAnsi="Calibri"/>
+                <w:b/>
+                <w:bCs/>
+                <w:sz w:val="22"/>
+                <w:szCs w:val="22"/>
+              </w:rPr>
+              <w:t xml:space="preserve">22.08.2026, 6:40 p.m.</w:t>
+            </w:r>
+          </w:p>
+        </w:tc>
+        <w:tc>
+          <w:tcPr>
+            <w:tcW w:type="dxa" w:w="7200"/>
+            <w:tcMar>
+              <w:top w:type="dxa" w:w="80"/>
+              <w:left w:type="dxa" w:w="110"/>
+              <w:bottom w:type="dxa" w:w="80"/>
+              <w:right w:type="dxa" w:w="110"/>
+            </w:tcMar>
+          </w:tcPr>
+          <w:p>
+            <w:pPr>
+              <w:spacing w:after="0" w:line="276"/>
+            </w:pPr>
+            <w:r>
+              <w:rPr>
+                <w:rFonts w:ascii="Calibri" w:cs="Calibri" w:eastAsia="Calibri" w:hAnsi="Calibri"/>
+                <w:sz w:val="22"/>
+                <w:szCs w:val="22"/>
+              </w:rPr>
+              <w:t xml:space="preserve">The goods finally left the factory. The Noticee issued NO document whatsoever — no tax invoice, no delivery challan, no e-way bill. The Complainant telephoned the Noticee twice and also approached his staff and his manager; the Noticee did not take the calls and the staff refused to speak. The Noticee’s refusal to issue any document, and the Complainant’s attempts to obtain one, stand recorded on video.</w:t>
+            </w:r>
+          </w:p>
+        </w:tc>
+      </w:tr>
+      <w:tr>
+        <w:tc>
+          <w:tcPr>
+            <w:tcW w:type="dxa" w:w="2100"/>
+            <w:tcMar>
+              <w:top w:type="dxa" w:w="80"/>
+              <w:left w:type="dxa" w:w="110"/>
+              <w:bottom w:type="dxa" w:w="80"/>
+              <w:right w:type="dxa" w:w="110"/>
+            </w:tcMar>
+          </w:tcPr>
+          <w:p>
+            <w:pPr>
+              <w:spacing w:after="0" w:line="276"/>
+            </w:pPr>
+            <w:r>
+              <w:rPr>
+                <w:rFonts w:ascii="Calibri" w:cs="Calibri" w:eastAsia="Calibri" w:hAnsi="Calibri"/>
+                <w:b/>
+                <w:bCs/>
+                <w:sz w:val="22"/>
+                <w:szCs w:val="22"/>
+              </w:rPr>
+              <w:t xml:space="preserve">22.08.2026</w:t>
+            </w:r>
+          </w:p>
+        </w:tc>
+        <w:tc>
+          <w:tcPr>
+            <w:tcW w:type="dxa" w:w="7200"/>
+            <w:tcMar>
+              <w:top w:type="dxa" w:w="80"/>
+              <w:left w:type="dxa" w:w="110"/>
+              <w:bottom w:type="dxa" w:w="80"/>
+              <w:right w:type="dxa" w:w="110"/>
+            </w:tcMar>
+          </w:tcPr>
+          <w:p>
+            <w:pPr>
+              <w:spacing w:after="0" w:line="276"/>
+            </w:pPr>
+            <w:r>
+              <w:rPr>
+                <w:rFonts w:ascii="Calibri" w:cs="Calibri" w:eastAsia="Calibri" w:hAnsi="Calibri"/>
+                <w:sz w:val="22"/>
+                <w:szCs w:val="22"/>
+              </w:rPr>
+              <w:t xml:space="preserve">On inspection at the factory the replacement doors were themselves found defective, the resin and skin not having adhered properly in several pieces, with the core paper visible.</w:t>
             </w:r>
           </w:p>
         </w:tc>
@@ -2359,6 +2515,32 @@
           <w:szCs w:val="22"/>
         </w:rPr>
         <w:t xml:space="preserve">3.7  CONTINUING BREACH IN RESPECT OF THE REPLACEMENT. The 21 defective pieces were returned to your factory on 30.07.2026. On 17.08.2026 you stated that manufacture required only one day. Thereafter, from 18.08.2026 onwards, you shifted the ready-date daily. On 21.08.2026 you directed my client to send a vehicle that very evening on the representation that the goods were ready and were being packed; had my client done so, his vehicle would have stood idle overnight at his cost. On 22.08.2026 you first fixed loading for 10:30 a.m., then deferred it to 2:00 p.m., and when my client attended with a vehicle at the appointed hour only 18 of the 21 pieces had been made and those were still under manufacture, my client being made to wait for several hours at your premises.</w:t>
+      </w:r>
+    </w:p>
+    <w:p>
+      <w:pPr>
+        <w:spacing w:after="120" w:line="276"/>
+      </w:pPr>
+      <w:r>
+        <w:rPr>
+          <w:rFonts w:ascii="Calibri" w:cs="Calibri" w:eastAsia="Calibri" w:hAnsi="Calibri"/>
+          <w:sz w:val="22"/>
+          <w:szCs w:val="22"/>
+        </w:rPr>
+        <w:t xml:space="preserve">3.8  REFUSAL TO ISSUE ANY DOCUMENT AT ALL. On 22.08.2026 the replacement goods were released from your factory at about 6:40 p.m. without any document whatsoever — without a tax invoice, without a delivery challan under Rule 55 of the Central Goods and Services Tax Rules, 2017, and without an e-way bill. My client had requested the document in writing at 5:30 p.m. on 21.08.2026 and thereafter by two telephone calls and in person through your staff and your manager. You neither took the calls nor caused any document to be issued, and your staff declined to speak to my client. My client was thereby compelled to move goods for which he had paid in full without any document from you. Your refusal, and my client’s attempts to obtain the document, are recorded on video and will be relied upon.</w:t>
+      </w:r>
+    </w:p>
+    <w:p>
+      <w:pPr>
+        <w:spacing w:after="120" w:line="276"/>
+      </w:pPr>
+      <w:r>
+        <w:rPr>
+          <w:rFonts w:ascii="Calibri" w:cs="Calibri" w:eastAsia="Calibri" w:hAnsi="Calibri"/>
+          <w:sz w:val="22"/>
+          <w:szCs w:val="22"/>
+        </w:rPr>
+        <w:t xml:space="preserve">3.9  THE REPLACEMENT GOODS ARE THEMSELVES DEFECTIVE. On inspection at your factory on 22.08.2026 it was found that in several of the replacement doors the resin and the skin had not adhered properly, leaving the core paper visible. My client reserves all his rights in respect of the said defects, which are being separately documented on receipt of the consignment.</w:t>
       </w:r>
     </w:p>
     <w:p>
@@ -2835,7 +3017,7 @@
                 <w:sz w:val="22"/>
                 <w:szCs w:val="22"/>
               </w:rPr>
-              <w:t xml:space="preserve">Cutting charge of Rs. 2/- per sq. ft. levied in the invoice without prior disclosure</w:t>
+              <w:t xml:space="preserve">Vehicle waiting charges on 22.08.2026 — 156 minutes at Rs. 3.50 per minute, the vehicle having been detained at the Noticee’s factory for 4 hours 06 minutes (Trip CRN113083391386, vehicle WB-01-BB-8397)</w:t>
             </w:r>
           </w:p>
         </w:tc>
@@ -2860,7 +3042,7 @@
                 <w:sz w:val="22"/>
                 <w:szCs w:val="22"/>
               </w:rPr>
-              <w:t xml:space="preserve">[AMOUNT]</w:t>
+              <w:t xml:space="preserve">546</w:t>
             </w:r>
           </w:p>
         </w:tc>
@@ -2910,7 +3092,7 @@
                 <w:sz w:val="22"/>
                 <w:szCs w:val="22"/>
               </w:rPr>
-              <w:t xml:space="preserve">Loading charge levied in the invoice without prior disclosure</w:t>
+              <w:t xml:space="preserve">Cutting charge of Rs. 2/- per sq. ft. levied in the invoice without prior disclosure</w:t>
             </w:r>
           </w:p>
         </w:tc>
@@ -2935,7 +3117,7 @@
                 <w:sz w:val="22"/>
                 <w:szCs w:val="22"/>
               </w:rPr>
-              <w:t xml:space="preserve">1,000</w:t>
+              <w:t xml:space="preserve">[AMOUNT]</w:t>
             </w:r>
           </w:p>
         </w:tc>
@@ -2985,7 +3167,7 @@
                 <w:sz w:val="22"/>
                 <w:szCs w:val="22"/>
               </w:rPr>
-              <w:t xml:space="preserve">Travel, lodging and incidental expenses incurred at Kolkata on 09.07.2026 to 11.07.2026 and on 22.08.2026</w:t>
+              <w:t xml:space="preserve">Loading charge levied in the invoice without prior disclosure</w:t>
             </w:r>
           </w:p>
         </w:tc>
@@ -3010,7 +3192,7 @@
                 <w:sz w:val="22"/>
                 <w:szCs w:val="22"/>
               </w:rPr>
-              <w:t xml:space="preserve">[AMOUNT]</w:t>
+              <w:t xml:space="preserve">1,000</w:t>
             </w:r>
           </w:p>
         </w:tc>
@@ -3033,6 +3215,81 @@
             <w:r>
               <w:rPr>
                 <w:rFonts w:ascii="Calibri" w:cs="Calibri" w:eastAsia="Calibri" w:hAnsi="Calibri"/>
+                <w:sz w:val="22"/>
+                <w:szCs w:val="22"/>
+              </w:rPr>
+              <w:t xml:space="preserve">8.</w:t>
+            </w:r>
+          </w:p>
+        </w:tc>
+        <w:tc>
+          <w:tcPr>
+            <w:tcW w:type="dxa" w:w="6800"/>
+            <w:tcMar>
+              <w:top w:type="dxa" w:w="80"/>
+              <w:left w:type="dxa" w:w="110"/>
+              <w:bottom w:type="dxa" w:w="80"/>
+              <w:right w:type="dxa" w:w="110"/>
+            </w:tcMar>
+          </w:tcPr>
+          <w:p>
+            <w:pPr>
+              <w:spacing w:after="0" w:line="276"/>
+            </w:pPr>
+            <w:r>
+              <w:rPr>
+                <w:rFonts w:ascii="Calibri" w:cs="Calibri" w:eastAsia="Calibri" w:hAnsi="Calibri"/>
+                <w:sz w:val="22"/>
+                <w:szCs w:val="22"/>
+              </w:rPr>
+              <w:t xml:space="preserve">Travel, lodging and incidental expenses incurred at Kolkata on 09.07.2026 to 11.07.2026 and on 22.08.2026</w:t>
+            </w:r>
+          </w:p>
+        </w:tc>
+        <w:tc>
+          <w:tcPr>
+            <w:tcW w:type="dxa" w:w="1800"/>
+            <w:tcMar>
+              <w:top w:type="dxa" w:w="80"/>
+              <w:left w:type="dxa" w:w="110"/>
+              <w:bottom w:type="dxa" w:w="80"/>
+              <w:right w:type="dxa" w:w="110"/>
+            </w:tcMar>
+          </w:tcPr>
+          <w:p>
+            <w:pPr>
+              <w:spacing w:after="0" w:line="276"/>
+              <w:jc w:val="right"/>
+            </w:pPr>
+            <w:r>
+              <w:rPr>
+                <w:rFonts w:ascii="Calibri" w:cs="Calibri" w:eastAsia="Calibri" w:hAnsi="Calibri"/>
+                <w:sz w:val="22"/>
+                <w:szCs w:val="22"/>
+              </w:rPr>
+              <w:t xml:space="preserve">[AMOUNT]</w:t>
+            </w:r>
+          </w:p>
+        </w:tc>
+      </w:tr>
+      <w:tr>
+        <w:tc>
+          <w:tcPr>
+            <w:tcW w:type="dxa" w:w="700"/>
+            <w:tcMar>
+              <w:top w:type="dxa" w:w="80"/>
+              <w:left w:type="dxa" w:w="110"/>
+              <w:bottom w:type="dxa" w:w="80"/>
+              <w:right w:type="dxa" w:w="110"/>
+            </w:tcMar>
+          </w:tcPr>
+          <w:p>
+            <w:pPr>
+              <w:spacing w:after="0" w:line="276"/>
+            </w:pPr>
+            <w:r>
+              <w:rPr>
+                <w:rFonts w:ascii="Calibri" w:cs="Calibri" w:eastAsia="Calibri" w:hAnsi="Calibri"/>
                 <w:b/>
                 <w:bCs/>
                 <w:sz w:val="22"/>
@@ -3091,7 +3348,7 @@
                 <w:sz w:val="22"/>
                 <w:szCs w:val="22"/>
               </w:rPr>
-              <w:t xml:space="preserve">15,000</w:t>
+              <w:t xml:space="preserve">15,546</w:t>
             </w:r>
           </w:p>
         </w:tc>
@@ -3302,6 +3559,24 @@
           <w:sz w:val="22"/>
           <w:szCs w:val="22"/>
         </w:rPr>
+        <w:t xml:space="preserve">Issue forthwith the delivery challan and, where required, the e-way bill in respect of the goods released from your factory on 22.08.2026, no document of any kind having been issued at the time of despatch;</w:t>
+      </w:r>
+    </w:p>
+    <w:p>
+      <w:pPr>
+        <w:pStyle w:val="ListParagraph"/>
+        <w:numPr>
+          <w:ilvl w:val="0"/>
+          <w:numId w:val="2"/>
+        </w:numPr>
+        <w:spacing w:after="160" w:line="276"/>
+      </w:pPr>
+      <w:r>
+        <w:rPr>
+          <w:rFonts w:ascii="Calibri" w:cs="Calibri" w:eastAsia="Calibri" w:hAnsi="Calibri"/>
+          <w:sz w:val="22"/>
+          <w:szCs w:val="22"/>
+        </w:rPr>
         <w:t xml:space="preserve">Confirm in writing that the full value of the goods supplied has been duly reported by you in your outward supply returns under the Central Goods and Services Tax Act, 2017, so that my client may avail of the input tax credit to which he is lawfully entitled.</w:t>
       </w:r>
     </w:p>
@@ -3658,6 +3933,60 @@
           <w:szCs w:val="22"/>
         </w:rPr>
         <w:t xml:space="preserve">Photographs and measurement records of the 21 non-conforming doors.</w:t>
+      </w:r>
+    </w:p>
+    <w:p>
+      <w:pPr>
+        <w:pStyle w:val="ListParagraph"/>
+        <w:numPr>
+          <w:ilvl w:val="0"/>
+          <w:numId w:val="3"/>
+        </w:numPr>
+        <w:spacing w:after="80" w:line="276"/>
+      </w:pPr>
+      <w:r>
+        <w:rPr>
+          <w:rFonts w:ascii="Calibri" w:cs="Calibri" w:eastAsia="Calibri" w:hAnsi="Calibri"/>
+          <w:sz w:val="22"/>
+          <w:szCs w:val="22"/>
+        </w:rPr>
+        <w:t xml:space="preserve">Screenshot of the transport operator’s trip record dated 22.08.2026 (Trip CRN113083391386, vehicle WB-01-BB-8397) showing detention of 4 hours 06 minutes and 156 minutes of billed waiting time.</w:t>
+      </w:r>
+    </w:p>
+    <w:p>
+      <w:pPr>
+        <w:pStyle w:val="ListParagraph"/>
+        <w:numPr>
+          <w:ilvl w:val="0"/>
+          <w:numId w:val="3"/>
+        </w:numPr>
+        <w:spacing w:after="80" w:line="276"/>
+      </w:pPr>
+      <w:r>
+        <w:rPr>
+          <w:rFonts w:ascii="Calibri" w:cs="Calibri" w:eastAsia="Calibri" w:hAnsi="Calibri"/>
+          <w:sz w:val="22"/>
+          <w:szCs w:val="22"/>
+        </w:rPr>
+        <w:t xml:space="preserve">Video recordings made at the Noticee’s factory on 22.08.2026 evidencing the refusal to issue any despatch document, together with a certificate under Section 63 of the Bharatiya Sakshya Adhiniyam, 2023.</w:t>
+      </w:r>
+    </w:p>
+    <w:p>
+      <w:pPr>
+        <w:pStyle w:val="ListParagraph"/>
+        <w:numPr>
+          <w:ilvl w:val="0"/>
+          <w:numId w:val="3"/>
+        </w:numPr>
+        <w:spacing w:after="80" w:line="276"/>
+      </w:pPr>
+      <w:r>
+        <w:rPr>
+          <w:rFonts w:ascii="Calibri" w:cs="Calibri" w:eastAsia="Calibri" w:hAnsi="Calibri"/>
+          <w:sz w:val="22"/>
+          <w:szCs w:val="22"/>
+        </w:rPr>
+        <w:t xml:space="preserve">Photographs of the defective resin and skin adhesion in the replacement doors.</w:t>
       </w:r>
     </w:p>
     <w:p>

</xml_diff>

<commit_message>
Rebuild legal notice from the verified WhatsApp record
Reads the full chat history and replaces the reconstructed account with
the documented one: correct parties and GSTINs, the signed order note of
2 June recording delivery at Jhargram and 50% billing, the written
"40% advance / 12-13 days delivery" and capacity representations, the
five payments nominated by the supplier, the ASF Plywood invoice and its
correction, the precise defects (10 pcs oversize, 11 pcs membrane for
lamination, one-side design, thickness), the undisclosed cutting, loading
and rate-differential charges, and the 22 August detention and undocumented
despatch. Damages restated at Rs 35,936 plus travel. Adds a facts file and
records in the advocate notes the three points in the record that run
against the client.

Co-Authored-By: Claude Opus 5 <noreply@anthropic.com>
Claude-Session: https://claude.ai/code/session_01JwS8aN6FDpkQcEk2vsBb7X
</commit_message>
<xml_diff>
--- a/legal/Legal-Notice-Draft-Wood-and-Wood-Products.docx
+++ b/legal/Legal-Notice-Draft-Wood-and-Wood-Products.docx
@@ -160,14 +160,7 @@
           <w:sz w:val="22"/>
           <w:szCs w:val="22"/>
         </w:rPr>
-        <w:t xml:space="preserve">1.  Sri Akshat </w:t>
-      </w:r>
-      <w:r>
-        <w:rPr>
-          <w:highlight w:val="yellow"/>
-          <w:highlightCs w:val="yellow"/>
-        </w:rPr>
-        <w:t xml:space="preserve">[VERIFY FULL NAME AND SPELLING]</w:t>
+        <w:t xml:space="preserve">1.  Sri Akshat Musaddi</w:t>
       </w:r>
     </w:p>
     <w:p>
@@ -180,7 +173,28 @@
           <w:sz w:val="22"/>
           <w:szCs w:val="22"/>
         </w:rPr>
-        <w:t xml:space="preserve">     Proprietor / Partner / Authorised Signatory</w:t>
+        <w:t xml:space="preserve">     Sri Arun Musaddi</w:t>
+      </w:r>
+      <w:r>
+        <w:rPr>
+          <w:rFonts w:ascii="Calibri" w:cs="Calibri" w:eastAsia="Calibri" w:hAnsi="Calibri"/>
+          <w:sz w:val="22"/>
+          <w:szCs w:val="22"/>
+        </w:rPr>
+        <w:t xml:space="preserve">  (Mob. 9831168888)</w:t>
+      </w:r>
+    </w:p>
+    <w:p>
+      <w:pPr>
+        <w:spacing w:after="120" w:line="276"/>
+      </w:pPr>
+      <w:r>
+        <w:rPr>
+          <w:rFonts w:ascii="Calibri" w:cs="Calibri" w:eastAsia="Calibri" w:hAnsi="Calibri"/>
+          <w:sz w:val="22"/>
+          <w:szCs w:val="22"/>
+        </w:rPr>
+        <w:t xml:space="preserve">     Proprietors / Partners / Persons in management of:</w:t>
       </w:r>
     </w:p>
     <w:p>
@@ -195,7 +209,7 @@
           <w:sz w:val="22"/>
           <w:szCs w:val="22"/>
         </w:rPr>
-        <w:t xml:space="preserve">     M/s Wood and Wood Products</w:t>
+        <w:t xml:space="preserve">     M/s WOOD &amp; WOOD PRODUCTS</w:t>
       </w:r>
     </w:p>
     <w:p>
@@ -208,14 +222,7 @@
           <w:sz w:val="22"/>
           <w:szCs w:val="22"/>
         </w:rPr>
-        <w:t xml:space="preserve">     Factory and Registered Office: </w:t>
-      </w:r>
-      <w:r>
-        <w:rPr>
-          <w:highlight w:val="yellow"/>
-          <w:highlightCs w:val="yellow"/>
-        </w:rPr>
-        <w:t xml:space="preserve">[FULL POSTAL ADDRESS]</w:t>
+        <w:t xml:space="preserve">     4/3, Foreshore Road, Howrah – 711103, West Bengal</w:t>
       </w:r>
     </w:p>
     <w:p>
@@ -228,14 +235,7 @@
           <w:sz w:val="22"/>
           <w:szCs w:val="22"/>
         </w:rPr>
-        <w:t xml:space="preserve">     GSTIN: </w:t>
-      </w:r>
-      <w:r>
-        <w:rPr>
-          <w:highlight w:val="yellow"/>
-          <w:highlightCs w:val="yellow"/>
-        </w:rPr>
-        <w:t xml:space="preserve">[GSTIN FROM INVOICE]</w:t>
+        <w:t xml:space="preserve">     GSTIN: 19AADFW7733P1ZB    State Code: 19</w:t>
       </w:r>
     </w:p>
     <w:p>
@@ -250,15 +250,7 @@
           <w:sz w:val="22"/>
           <w:szCs w:val="22"/>
         </w:rPr>
-        <w:t xml:space="preserve">2.  M/s BG Timber</w:t>
-      </w:r>
-      <w:r>
-        <w:rPr>
-          <w:rFonts w:ascii="Calibri" w:cs="Calibri" w:eastAsia="Calibri" w:hAnsi="Calibri"/>
-          <w:sz w:val="22"/>
-          <w:szCs w:val="22"/>
-        </w:rPr>
-        <w:t xml:space="preserve"> (sister concern / associated firm of the above)</w:t>
+        <w:t xml:space="preserve">     M/s BG TIMBER</w:t>
       </w:r>
     </w:p>
     <w:p>
@@ -271,14 +263,7 @@
           <w:sz w:val="22"/>
           <w:szCs w:val="22"/>
         </w:rPr>
-        <w:t xml:space="preserve">     Office: Neem Tala, Kolkata, West Bengal — </w:t>
-      </w:r>
-      <w:r>
-        <w:rPr>
-          <w:highlight w:val="yellow"/>
-          <w:highlightCs w:val="yellow"/>
-        </w:rPr>
-        <w:t xml:space="preserve">[FULL ADDRESS AND PIN]</w:t>
+        <w:t xml:space="preserve">     67/25, Strand Road, Nimtalla, Kolkata – 700006, West Bengal</w:t>
       </w:r>
     </w:p>
     <w:p>
@@ -338,92 +323,74 @@
       <w:r>
         <w:rPr>
           <w:rFonts w:ascii="Calibri" w:cs="Calibri" w:eastAsia="Calibri" w:hAnsi="Calibri"/>
-          <w:sz w:val="22"/>
-          <w:szCs w:val="22"/>
-        </w:rPr>
-        <w:t xml:space="preserve">Sri </w:t>
+          <w:b/>
+          <w:bCs/>
+          <w:sz w:val="22"/>
+          <w:szCs w:val="22"/>
+        </w:rPr>
+        <w:t xml:space="preserve">M/s KOLKATA PLYWOOD AND COMPANY</w:t>
+      </w:r>
+      <w:r>
+        <w:rPr>
+          <w:rFonts w:ascii="Calibri" w:cs="Calibri" w:eastAsia="Calibri" w:hAnsi="Calibri"/>
+          <w:sz w:val="22"/>
+          <w:szCs w:val="22"/>
+        </w:rPr>
+        <w:t xml:space="preserve">  (a Partnership Firm)</w:t>
+      </w:r>
+    </w:p>
+    <w:p>
+      <w:pPr>
+        <w:spacing w:after="60" w:line="276"/>
+      </w:pPr>
+      <w:r>
+        <w:rPr>
+          <w:rFonts w:ascii="Calibri" w:cs="Calibri" w:eastAsia="Calibri" w:hAnsi="Calibri"/>
+          <w:sz w:val="22"/>
+          <w:szCs w:val="22"/>
+        </w:rPr>
+        <w:t xml:space="preserve">10/3, Kings Road, Golabari, Howrah – 711101, West Bengal</w:t>
+      </w:r>
+    </w:p>
+    <w:p>
+      <w:pPr>
+        <w:spacing w:after="60" w:line="276"/>
+      </w:pPr>
+      <w:r>
+        <w:rPr>
+          <w:rFonts w:ascii="Calibri" w:cs="Calibri" w:eastAsia="Calibri" w:hAnsi="Calibri"/>
+          <w:sz w:val="22"/>
+          <w:szCs w:val="22"/>
+        </w:rPr>
+        <w:t xml:space="preserve">GSTIN: 19ABCFK2821J1ZB    E-mail: kolkataplywoodcompany@gmail.com</w:t>
+      </w:r>
+    </w:p>
+    <w:p>
+      <w:pPr>
+        <w:spacing w:after="60" w:line="276"/>
+      </w:pPr>
+      <w:r>
+        <w:rPr>
+          <w:rFonts w:ascii="Calibri" w:cs="Calibri" w:eastAsia="Calibri" w:hAnsi="Calibri"/>
+          <w:sz w:val="22"/>
+          <w:szCs w:val="22"/>
+        </w:rPr>
+        <w:t xml:space="preserve">Through its Partner, Sri </w:t>
       </w:r>
       <w:r>
         <w:rPr>
           <w:highlight w:val="yellow"/>
           <w:highlightCs w:val="yellow"/>
         </w:rPr>
-        <w:t xml:space="preserve">[FULL NAME OF COMPLAINANT]</w:t>
-      </w:r>
-    </w:p>
-    <w:p>
-      <w:pPr>
-        <w:spacing w:after="60" w:line="276"/>
-      </w:pPr>
-      <w:r>
-        <w:rPr>
-          <w:rFonts w:ascii="Calibri" w:cs="Calibri" w:eastAsia="Calibri" w:hAnsi="Calibri"/>
-          <w:sz w:val="22"/>
-          <w:szCs w:val="22"/>
-        </w:rPr>
-        <w:t xml:space="preserve">Proprietor / Partner, </w:t>
-      </w:r>
-      <w:r>
-        <w:rPr>
-          <w:highlight w:val="yellow"/>
-          <w:highlightCs w:val="yellow"/>
-        </w:rPr>
-        <w:t xml:space="preserve">[FULL NAME OF FIRM]</w:t>
-      </w:r>
-    </w:p>
-    <w:p>
-      <w:pPr>
-        <w:spacing w:after="60" w:line="276"/>
-      </w:pPr>
-      <w:r>
-        <w:rPr>
-          <w:rFonts w:ascii="Calibri" w:cs="Calibri" w:eastAsia="Calibri" w:hAnsi="Calibri"/>
-          <w:sz w:val="22"/>
-          <w:szCs w:val="22"/>
-        </w:rPr>
-        <w:t xml:space="preserve">Address: </w:t>
-      </w:r>
-      <w:r>
-        <w:rPr>
-          <w:highlight w:val="yellow"/>
-          <w:highlightCs w:val="yellow"/>
-        </w:rPr>
-        <w:t xml:space="preserve">[FULL POSTAL ADDRESS]</w:t>
-      </w:r>
-    </w:p>
-    <w:p>
-      <w:pPr>
-        <w:spacing w:after="60" w:line="276"/>
-      </w:pPr>
-      <w:r>
-        <w:rPr>
-          <w:rFonts w:ascii="Calibri" w:cs="Calibri" w:eastAsia="Calibri" w:hAnsi="Calibri"/>
-          <w:sz w:val="22"/>
-          <w:szCs w:val="22"/>
-        </w:rPr>
-        <w:t xml:space="preserve">GSTIN: </w:t>
-      </w:r>
-      <w:r>
-        <w:rPr>
-          <w:highlight w:val="yellow"/>
-          <w:highlightCs w:val="yellow"/>
-        </w:rPr>
-        <w:t xml:space="preserve">[YOUR GSTIN]</w:t>
-      </w:r>
-      <w:r>
-        <w:rPr>
-          <w:rFonts w:ascii="Calibri" w:cs="Calibri" w:eastAsia="Calibri" w:hAnsi="Calibri"/>
-          <w:sz w:val="22"/>
-          <w:szCs w:val="22"/>
-        </w:rPr>
-        <w:t xml:space="preserve">    Mobile: </w:t>
-      </w:r>
-      <w:r>
-        <w:rPr>
-          <w:highlight w:val="yellow"/>
-          <w:highlightCs w:val="yellow"/>
-        </w:rPr>
-        <w:t xml:space="preserve">[NUMBER]</w:t>
+        <w:t xml:space="preserve">[FULL NAME — PRINCE SONI?]</w:t>
+      </w:r>
+      <w:r>
+        <w:rPr>
+          <w:rFonts w:ascii="Calibri" w:cs="Calibri" w:eastAsia="Calibri" w:hAnsi="Calibri"/>
+          <w:sz w:val="22"/>
+          <w:szCs w:val="22"/>
+        </w:rPr>
+        <w:t xml:space="preserve">    Mob. 8104234567 / 7300119098</w:t>
       </w:r>
     </w:p>
     <w:p>
@@ -479,7 +446,7 @@
           <w:sz w:val="22"/>
           <w:szCs w:val="22"/>
         </w:rPr>
-        <w:t xml:space="preserve">Notice demanding delivery of conforming goods, refund of undisclosed charges and compensation for loss and damage caused by inordinate delay and supply of defective and non-conforming goods against order dated 04.06.2026 for 94 pcs flush doors.</w:t>
+        <w:t xml:space="preserve">Notice demanding delivery of conforming goods, refund of excess and undisclosed charges, and compensation for loss and damage caused by inordinate delay and by the supply of defective and non-conforming goods against the order dated 02.06.2026 for 94 pcs lamination and membrane doors, invoice no. 18/WWP/26-27 dated 13.07.2026.</w:t>
       </w:r>
     </w:p>
     <w:p>
@@ -789,7 +756,7 @@
                 <w:sz w:val="22"/>
                 <w:szCs w:val="22"/>
               </w:rPr>
-              <w:t xml:space="preserve">Paid in hand at the Noticee’s office</w:t>
+              <w:t xml:space="preserve">Paid in hand at the Noticee’s office to M/s BG Timber</w:t>
             </w:r>
           </w:p>
         </w:tc>
@@ -888,7 +855,7 @@
                 <w:sz w:val="22"/>
                 <w:szCs w:val="22"/>
               </w:rPr>
-              <w:t xml:space="preserve">Current account of M/s Wood and Wood Products</w:t>
+              <w:t xml:space="preserve">Current account of M/s Wood and Wood Products, HDFC Bank A/c 50200095517481</w:t>
             </w:r>
           </w:p>
         </w:tc>
@@ -987,7 +954,7 @@
                 <w:sz w:val="22"/>
                 <w:szCs w:val="22"/>
               </w:rPr>
-              <w:t xml:space="preserve">Savings account in the name of Sri Ajay Sharma, as nominated by the Noticee</w:t>
+              <w:t xml:space="preserve">Savings account of Sri Ajay Sharma, nominated by the Noticee at 15:41 hrs</w:t>
             </w:r>
           </w:p>
         </w:tc>
@@ -1038,7 +1005,7 @@
                 <w:sz w:val="22"/>
                 <w:szCs w:val="22"/>
               </w:rPr>
-              <w:t xml:space="preserve">09.07.2026</w:t>
+              <w:t xml:space="preserve">08.07.2026</w:t>
             </w:r>
           </w:p>
         </w:tc>
@@ -1086,7 +1053,7 @@
                 <w:sz w:val="22"/>
                 <w:szCs w:val="22"/>
               </w:rPr>
-              <w:t xml:space="preserve">Savings account in the name of Sri Ramkrishna Mandal, as nominated by the Noticee</w:t>
+              <w:t xml:space="preserve">Savings account of Sri Ramkrishna Mondal, nominated by the Noticee at 15:40 hrs</w:t>
             </w:r>
           </w:p>
         </w:tc>
@@ -1185,7 +1152,7 @@
                 <w:sz w:val="22"/>
                 <w:szCs w:val="22"/>
               </w:rPr>
-              <w:t xml:space="preserve">Savings account in the name of Sri Ajay Sharma, as nominated by the Noticee</w:t>
+              <w:t xml:space="preserve">Savings account of Sri Ajay Sharma, nominated by the Noticee at 14:39 hrs</w:t>
             </w:r>
           </w:p>
         </w:tc>
@@ -1484,7 +1451,7 @@
                 <w:sz w:val="22"/>
                 <w:szCs w:val="22"/>
               </w:rPr>
-              <w:t xml:space="preserve">02.06.2026</w:t>
+              <w:t xml:space="preserve">19.07.2025</w:t>
             </w:r>
           </w:p>
         </w:tc>
@@ -1508,7 +1475,7 @@
                 <w:sz w:val="22"/>
                 <w:szCs w:val="22"/>
               </w:rPr>
-              <w:t xml:space="preserve">Meeting at the Noticee’s office. Advance of Rs. 20,000/- paid in cash. Noticee represented that delivery would be completed within 10 to 15 days.</w:t>
+              <w:t xml:space="preserve">In the course of negotiations the Noticee represented in writing on WhatsApp: “40% advance / 12-13 days delivery”.</w:t>
             </w:r>
           </w:p>
         </w:tc>
@@ -1536,7 +1503,7 @@
                 <w:sz w:val="22"/>
                 <w:szCs w:val="22"/>
               </w:rPr>
-              <w:t xml:space="preserve">04.06.2026</w:t>
+              <w:t xml:space="preserve">25.07.2025</w:t>
             </w:r>
           </w:p>
         </w:tc>
@@ -1560,7 +1527,7 @@
                 <w:sz w:val="22"/>
                 <w:szCs w:val="22"/>
               </w:rPr>
-              <w:t xml:space="preserve">Complete door size list (94 pcs) sent to the Noticee on WhatsApp.</w:t>
+              <w:t xml:space="preserve">On being asked whether there would be any complaint as to quality, the Noticee represented in writing: “Sir humlog 3000-3500 monthly banate hai, aisse toh koi dikkat aata nai.”</w:t>
             </w:r>
           </w:p>
         </w:tc>
@@ -1588,7 +1555,7 @@
                 <w:sz w:val="22"/>
                 <w:szCs w:val="22"/>
               </w:rPr>
-              <w:t xml:space="preserve">09.06.2026</w:t>
+              <w:t xml:space="preserve">01.06.2026</w:t>
             </w:r>
           </w:p>
         </w:tc>
@@ -1612,7 +1579,7 @@
                 <w:sz w:val="22"/>
                 <w:szCs w:val="22"/>
               </w:rPr>
-              <w:t xml:space="preserve">Rs. 80,000/- transferred to the current account of M/s Wood and Wood Products on the Noticee’s demand.</w:t>
+              <w:t xml:space="preserve">The Noticee quoted MEMBRANE HW Rs 105, LAMINATION Rs 112, SIDE PINE + Rs 15. No cutting charge, loading charge or any other charge was mentioned.</w:t>
             </w:r>
           </w:p>
         </w:tc>
@@ -1640,7 +1607,7 @@
                 <w:sz w:val="22"/>
                 <w:szCs w:val="22"/>
               </w:rPr>
-              <w:t xml:space="preserve">08.07.2026 and 09.07.2026</w:t>
+              <w:t xml:space="preserve">02.06.2026</w:t>
             </w:r>
           </w:p>
         </w:tc>
@@ -1664,7 +1631,7 @@
                 <w:sz w:val="22"/>
                 <w:szCs w:val="22"/>
               </w:rPr>
-              <w:t xml:space="preserve">Rs. 20,000/- and Rs. 50,000/- respectively transferred to savings accounts of two third parties nominated by the Noticee.</w:t>
+              <w:t xml:space="preserve">My client and his customer attended the Noticee’s office. The order was recorded in the Noticee’s own order book, dated and signed 2/06/26, in the following terms: “Kolkata Plywood 2/6/26 — (1) BGL 10 Lamination 140/- (2) BG 26 Membrane Rosewood 135/- — + Delivery Jhargram — + 50% Bill — 2/6 20000 Advance — Total 40% Advance”. Rs 20,000 was paid in cash to M/s BG Timber the same day. DELIVERY AT JHARGRAM WAS THUS PART OF THE CONTRACT.</w:t>
             </w:r>
           </w:p>
         </w:tc>
@@ -1692,7 +1659,7 @@
                 <w:sz w:val="22"/>
                 <w:szCs w:val="22"/>
               </w:rPr>
-              <w:t xml:space="preserve">11.07.2026</w:t>
+              <w:t xml:space="preserve">03.06.2026</w:t>
             </w:r>
           </w:p>
         </w:tc>
@@ -1716,7 +1683,7 @@
                 <w:sz w:val="22"/>
                 <w:szCs w:val="22"/>
               </w:rPr>
-              <w:t xml:space="preserve">Rs. 51,200/- transferred to a savings account of a third party nominated by the Noticee, on the very date of dispatch. Total consideration of Rs. 2,21,200/- thereby stood fully paid.</w:t>
+              <w:t xml:space="preserve">The Noticee furnished the account of M/s Wood and Wood Products, HDFC Bank A/c 50200095517481, IFSC HDFC0004339, and asked for a transfer of Rs 80,000.</w:t>
             </w:r>
           </w:p>
         </w:tc>
@@ -1744,7 +1711,7 @@
                 <w:sz w:val="22"/>
                 <w:szCs w:val="22"/>
               </w:rPr>
-              <w:t xml:space="preserve">24.06.2026</w:t>
+              <w:t xml:space="preserve">04.06.2026</w:t>
             </w:r>
           </w:p>
         </w:tc>
@@ -1768,7 +1735,7 @@
                 <w:sz w:val="22"/>
                 <w:szCs w:val="22"/>
               </w:rPr>
-              <w:t xml:space="preserve">Outer limit of the promised 15-day delivery period expired. No delivery made.</w:t>
+              <w:t xml:space="preserve">My client furnished the complete size list of all 94 doors on WhatsApp — 25 pcs membrane and 69 pcs lamination. That list is the contractual specification.</w:t>
             </w:r>
           </w:p>
         </w:tc>
@@ -1796,7 +1763,7 @@
                 <w:sz w:val="22"/>
                 <w:szCs w:val="22"/>
               </w:rPr>
-              <w:t xml:space="preserve">25.06.2026 to 10.07.2026</w:t>
+              <w:t xml:space="preserve">09.06.2026</w:t>
             </w:r>
           </w:p>
         </w:tc>
@@ -1820,7 +1787,7 @@
                 <w:sz w:val="22"/>
                 <w:szCs w:val="22"/>
               </w:rPr>
-              <w:t xml:space="preserve">Delivery repeatedly postponed by the Noticee on varying pretexts (rain, delayed payment, vehicle problems). Assurances of 30.06, 02.07, 09.07, 10.07 and 11.07 given and broken in turn.</w:t>
+              <w:t xml:space="preserve">Rs 80,000 transferred to the said account of M/s Wood and Wood Products.</w:t>
             </w:r>
           </w:p>
         </w:tc>
@@ -1848,7 +1815,7 @@
                 <w:sz w:val="22"/>
                 <w:szCs w:val="22"/>
               </w:rPr>
-              <w:t xml:space="preserve">09.07.2026 to 11.07.2026</w:t>
+              <w:t xml:space="preserve">22.06.2026</w:t>
             </w:r>
           </w:p>
         </w:tc>
@@ -1872,7 +1839,7 @@
                 <w:sz w:val="22"/>
                 <w:szCs w:val="22"/>
               </w:rPr>
-              <w:t xml:space="preserve">The Complainant travelled to and stayed at Kolkata for three days specifically to be present at the time of loading, having informed the Noticee in advance in writing. The Noticee assured him that his attendance was unnecessary as the goods were correct.</w:t>
+              <w:t xml:space="preserve">My client recorded in writing: “13-Days ho gya hai Payment kiye ?? 10-15din Maximum bole thy…” No delivery was made.</w:t>
             </w:r>
           </w:p>
         </w:tc>
@@ -1900,7 +1867,7 @@
                 <w:sz w:val="22"/>
                 <w:szCs w:val="22"/>
               </w:rPr>
-              <w:t xml:space="preserve">11.07.2026</w:t>
+              <w:t xml:space="preserve">08.07.2026</w:t>
             </w:r>
           </w:p>
         </w:tc>
@@ -1924,7 +1891,7 @@
                 <w:sz w:val="22"/>
                 <w:szCs w:val="22"/>
               </w:rPr>
-              <w:t xml:space="preserve">Goods dispatched. No invoice, no challan and no transporter contact was shared at the time of dispatch, despite repeated requests. The transporter’s number was furnished only past midnight after repeated calls.</w:t>
+              <w:t xml:space="preserve">The Noticee furnished the details of two savings accounts of third parties — a PhonePe collect code of Sri Ramkrishna Mondal and the number +91 90621 80929 of Sri Ajay Sharma — against which Rs 50,000 and Rs 20,000 respectively were paid the same evening.</w:t>
             </w:r>
           </w:p>
         </w:tc>
@@ -1952,7 +1919,7 @@
                 <w:sz w:val="22"/>
                 <w:szCs w:val="22"/>
               </w:rPr>
-              <w:t xml:space="preserve">12.07.2026</w:t>
+              <w:t xml:space="preserve">11.07.2026</w:t>
             </w:r>
           </w:p>
         </w:tc>
@@ -1976,7 +1943,7 @@
                 <w:sz w:val="22"/>
                 <w:szCs w:val="22"/>
               </w:rPr>
-              <w:t xml:space="preserve">Goods received at the client’s site at Jhargram. On inspection, 21 pcs found wholly wrong — 10 pcs manufactured at 36" against an order of 32", and 11 pcs manufactured in a design never ordered. The remaining pieces were not manufactured to the exact sizes furnished on 04.06.2026.</w:t>
+              <w:t xml:space="preserve">The Noticee again nominated the account of Sri Ajay Sharma and Rs 51,200 was transferred. The goods were despatched. The tax invoice sent was made out in the name of a stranger, “ASF PLYWOOD, 163 Ishwaripur, PS Rahara”, and not in the name of my client.</w:t>
             </w:r>
           </w:p>
         </w:tc>
@@ -2004,7 +1971,7 @@
                 <w:sz w:val="22"/>
                 <w:szCs w:val="22"/>
               </w:rPr>
-              <w:t xml:space="preserve">13.07.2026 to 29.07.2026</w:t>
+              <w:t xml:space="preserve">12.07.2026</w:t>
             </w:r>
           </w:p>
         </w:tc>
@@ -2028,7 +1995,7 @@
                 <w:sz w:val="22"/>
                 <w:szCs w:val="22"/>
               </w:rPr>
-              <w:t xml:space="preserve">The Complainant engaged his own carpenter for two days to re-measure and segregate the entire consignment (Rs. 1,000/-), and the client’s carpenters had to cut and re-fit 73 doors at Rs. 100/- per door (Rs. 7,000/-).</w:t>
+              <w:t xml:space="preserve">The goods reached the customer’s site at Jhargram — 37 days after the order. My client pointed out at 11:18 hrs that the invoice was in the name of ASF Plywood. The Noticee replied that a revised invoice would be sent.</w:t>
             </w:r>
           </w:p>
         </w:tc>
@@ -2056,7 +2023,7 @@
                 <w:sz w:val="22"/>
                 <w:szCs w:val="22"/>
               </w:rPr>
-              <w:t xml:space="preserve">30.07.2026</w:t>
+              <w:t xml:space="preserve">13.07.2026</w:t>
             </w:r>
           </w:p>
         </w:tc>
@@ -2080,7 +2047,7 @@
                 <w:sz w:val="22"/>
                 <w:szCs w:val="22"/>
               </w:rPr>
-              <w:t xml:space="preserve">The 21 defective doors returned to the Noticee’s factory at the Complainant’s own cost of Rs. 7,000/- towards freight, the Noticee having expressly refused to bear the same.</w:t>
+              <w:t xml:space="preserve">Revised tax invoice no. 18/WWP/26-27 dated 13-07-2026 issued, billed to my client and shipped to M/s Kriti Construction, Jhargram, along with e-way bill no. 8517 1317 0306 and motor vehicle no. WB19S0857.</w:t>
             </w:r>
           </w:p>
         </w:tc>
@@ -2108,7 +2075,7 @@
                 <w:sz w:val="22"/>
                 <w:szCs w:val="22"/>
               </w:rPr>
-              <w:t xml:space="preserve">17.08.2026</w:t>
+              <w:t xml:space="preserve">16.07.2026</w:t>
             </w:r>
           </w:p>
         </w:tc>
@@ -2132,7 +2099,7 @@
                 <w:sz w:val="22"/>
                 <w:szCs w:val="22"/>
               </w:rPr>
-              <w:t xml:space="preserve">The Noticee stated that manufacture requires only one day and that the goods would be ready on the first clear day.</w:t>
+              <w:t xml:space="preserve">On inspection my client recorded the defects in writing: of the 69 pcs lamination ordered (all widths within 32″), 10 pcs had been manufactured 36″/36.5″ wide, and 11 pcs had been supplied in MEMBRANE where LAMINATION had been ordered. Several lamination doors were supplied with one-side design although both-side design had been agreed, and the thickness was not uniform.</w:t>
             </w:r>
           </w:p>
         </w:tc>
@@ -2160,7 +2127,7 @@
                 <w:sz w:val="22"/>
                 <w:szCs w:val="22"/>
               </w:rPr>
-              <w:t xml:space="preserve">18.08.2026 to 21.08.2026</w:t>
+              <w:t xml:space="preserve">17.07.2026</w:t>
             </w:r>
           </w:p>
         </w:tc>
@@ -2184,7 +2151,7 @@
                 <w:sz w:val="22"/>
                 <w:szCs w:val="22"/>
               </w:rPr>
-              <w:t xml:space="preserve">Ready-date shifted daily. On 21.08.2026 the Noticee asked that a vehicle be sent that evening, stating the goods were ready and being packed.</w:t>
+              <w:t xml:space="preserve">The Noticee admitted the defect in writing: “Aur isko return karwa dijiye, change karke bhejwa denge.” On being asked who would bear the freight and by when the replacement would come, the Noticee replied only “Jab ayega usko dhek ke Bata panga”.</w:t>
             </w:r>
           </w:p>
         </w:tc>
@@ -2212,7 +2179,7 @@
                 <w:sz w:val="22"/>
                 <w:szCs w:val="22"/>
               </w:rPr>
-              <w:t xml:space="preserve">21.08.2026</w:t>
+              <w:t xml:space="preserve">20.07.2026</w:t>
             </w:r>
           </w:p>
         </w:tc>
@@ -2236,7 +2203,7 @@
                 <w:sz w:val="22"/>
                 <w:szCs w:val="22"/>
               </w:rPr>
-              <w:t xml:space="preserve">The Noticee asked that a vehicle be sent that evening, representing that the goods were ready and were being packed. The Complainant messaged the Noticee at 5:30 p.m. asking that the invoice be prepared. No reply was received.</w:t>
+              <w:t xml:space="preserve">My client sent five pages of measurements comparing the ordered size against the size actually supplied, recording that the sizes were out by 2 suta to 1 inch throughout, and that two carpenters had spent a full day measuring. He recorded that the customer would bear no extra cost and that the freight of Rs 7,000 each way arose from the Noticee’s default.</w:t>
             </w:r>
           </w:p>
         </w:tc>
@@ -2264,7 +2231,7 @@
                 <w:sz w:val="22"/>
                 <w:szCs w:val="22"/>
               </w:rPr>
-              <w:t xml:space="preserve">22.08.2026</w:t>
+              <w:t xml:space="preserve">29.07.2026</w:t>
             </w:r>
           </w:p>
         </w:tc>
@@ -2288,7 +2255,7 @@
                 <w:sz w:val="22"/>
                 <w:szCs w:val="22"/>
               </w:rPr>
-              <w:t xml:space="preserve">Loading time shifted from 10:30 a.m. to 2:00 p.m. The Complainant attended the factory with a hired vehicle at the appointed time and found that only 18 of the 21 doors had been made, and those still under manufacture. The vehicle was detained at the factory for 4 hours 06 minutes, of which 156 minutes were charged to the Complainant as waiting time.</w:t>
+              <w:t xml:space="preserve">The 21 defective doors were despatched to the Noticee’s factory at my client’s own cost of Rs 7,000, the Noticee having refused to bear it.</w:t>
             </w:r>
           </w:p>
         </w:tc>
@@ -2316,7 +2283,7 @@
                 <w:sz w:val="22"/>
                 <w:szCs w:val="22"/>
               </w:rPr>
-              <w:t xml:space="preserve">22.08.2026, 6:40 p.m.</w:t>
+              <w:t xml:space="preserve">30.07.2026</w:t>
             </w:r>
           </w:p>
         </w:tc>
@@ -2340,7 +2307,7 @@
                 <w:sz w:val="22"/>
                 <w:szCs w:val="22"/>
               </w:rPr>
-              <w:t xml:space="preserve">The goods finally left the factory. The Noticee issued NO document whatsoever — no tax invoice, no delivery challan, no e-way bill. The Complainant telephoned the Noticee twice and also approached his staff and his manager; the Noticee did not take the calls and the staff refused to speak. The Noticee’s refusal to issue any document, and the Complainant’s attempts to obtain one, stand recorded on video.</w:t>
+              <w:t xml:space="preserve">The goods reached the factory and were measured and noted by the Noticee’s own man. The Noticee stated: “This will take time — Will rectify and send — Cannot confirm exact time now.” My client called upon the Noticee to refund the price of the 21 pcs if they could not be delivered by Tuesday. No refund was made.</w:t>
             </w:r>
           </w:p>
         </w:tc>
@@ -2368,7 +2335,7 @@
                 <w:sz w:val="22"/>
                 <w:szCs w:val="22"/>
               </w:rPr>
-              <w:t xml:space="preserve">22.08.2026</w:t>
+              <w:t xml:space="preserve">31.07.2026</w:t>
             </w:r>
           </w:p>
         </w:tc>
@@ -2392,7 +2359,319 @@
                 <w:sz w:val="22"/>
                 <w:szCs w:val="22"/>
               </w:rPr>
-              <w:t xml:space="preserve">On inspection at the factory the replacement doors were themselves found defective, the resin and skin not having adhered properly in several pieces, with the core paper visible.</w:t>
+              <w:t xml:space="preserve">My client had set out for the factory to inspect. The Noticee messaged “No need to come.”</w:t>
+            </w:r>
+          </w:p>
+        </w:tc>
+      </w:tr>
+      <w:tr>
+        <w:tc>
+          <w:tcPr>
+            <w:tcW w:type="dxa" w:w="2100"/>
+            <w:tcMar>
+              <w:top w:type="dxa" w:w="80"/>
+              <w:left w:type="dxa" w:w="110"/>
+              <w:bottom w:type="dxa" w:w="80"/>
+              <w:right w:type="dxa" w:w="110"/>
+            </w:tcMar>
+          </w:tcPr>
+          <w:p>
+            <w:pPr>
+              <w:spacing w:after="0" w:line="276"/>
+            </w:pPr>
+            <w:r>
+              <w:rPr>
+                <w:rFonts w:ascii="Calibri" w:cs="Calibri" w:eastAsia="Calibri" w:hAnsi="Calibri"/>
+                <w:b/>
+                <w:bCs/>
+                <w:sz w:val="22"/>
+                <w:szCs w:val="22"/>
+              </w:rPr>
+              <w:t xml:space="preserve">07.08.2026 &amp; 11.08.2026</w:t>
+            </w:r>
+          </w:p>
+        </w:tc>
+        <w:tc>
+          <w:tcPr>
+            <w:tcW w:type="dxa" w:w="7200"/>
+            <w:tcMar>
+              <w:top w:type="dxa" w:w="80"/>
+              <w:left w:type="dxa" w:w="110"/>
+              <w:bottom w:type="dxa" w:w="80"/>
+              <w:right w:type="dxa" w:w="110"/>
+            </w:tcMar>
+          </w:tcPr>
+          <w:p>
+            <w:pPr>
+              <w:spacing w:after="0" w:line="276"/>
+            </w:pPr>
+            <w:r>
+              <w:rPr>
+                <w:rFonts w:ascii="Calibri" w:cs="Calibri" w:eastAsia="Calibri" w:hAnsi="Calibri"/>
+                <w:sz w:val="22"/>
+                <w:szCs w:val="22"/>
+              </w:rPr>
+              <w:t xml:space="preserve">My client’s customer abused him and attended his office. On being pressed, the Noticee replied: “Then wait kariye”, “I don’t care. Mereko mat boliye” and “But koi bakwass nai sunuenga”.</w:t>
+            </w:r>
+          </w:p>
+        </w:tc>
+      </w:tr>
+      <w:tr>
+        <w:tc>
+          <w:tcPr>
+            <w:tcW w:type="dxa" w:w="2100"/>
+            <w:tcMar>
+              <w:top w:type="dxa" w:w="80"/>
+              <w:left w:type="dxa" w:w="110"/>
+              <w:bottom w:type="dxa" w:w="80"/>
+              <w:right w:type="dxa" w:w="110"/>
+            </w:tcMar>
+          </w:tcPr>
+          <w:p>
+            <w:pPr>
+              <w:spacing w:after="0" w:line="276"/>
+            </w:pPr>
+            <w:r>
+              <w:rPr>
+                <w:rFonts w:ascii="Calibri" w:cs="Calibri" w:eastAsia="Calibri" w:hAnsi="Calibri"/>
+                <w:b/>
+                <w:bCs/>
+                <w:sz w:val="22"/>
+                <w:szCs w:val="22"/>
+              </w:rPr>
+              <w:t xml:space="preserve">12.08.2026 to 21.08.2026</w:t>
+            </w:r>
+          </w:p>
+        </w:tc>
+        <w:tc>
+          <w:tcPr>
+            <w:tcW w:type="dxa" w:w="7200"/>
+            <w:tcMar>
+              <w:top w:type="dxa" w:w="80"/>
+              <w:left w:type="dxa" w:w="110"/>
+              <w:bottom w:type="dxa" w:w="80"/>
+              <w:right w:type="dxa" w:w="110"/>
+            </w:tcMar>
+          </w:tcPr>
+          <w:p>
+            <w:pPr>
+              <w:spacing w:after="0" w:line="276"/>
+            </w:pPr>
+            <w:r>
+              <w:rPr>
+                <w:rFonts w:ascii="Calibri" w:cs="Calibri" w:eastAsia="Calibri" w:hAnsi="Calibri"/>
+                <w:sz w:val="22"/>
+                <w:szCs w:val="22"/>
+              </w:rPr>
+              <w:t xml:space="preserve">The ready-date was shifted from Friday, to “Tomorrow evening”, to Monday (confirmed “Pakka Final Na??” — “Yes.”), and then abandoned on 17.08.2026 with “Nai. Weather dhek rhe hai?”.</w:t>
+            </w:r>
+          </w:p>
+        </w:tc>
+      </w:tr>
+      <w:tr>
+        <w:tc>
+          <w:tcPr>
+            <w:tcW w:type="dxa" w:w="2100"/>
+            <w:tcMar>
+              <w:top w:type="dxa" w:w="80"/>
+              <w:left w:type="dxa" w:w="110"/>
+              <w:bottom w:type="dxa" w:w="80"/>
+              <w:right w:type="dxa" w:w="110"/>
+            </w:tcMar>
+          </w:tcPr>
+          <w:p>
+            <w:pPr>
+              <w:spacing w:after="0" w:line="276"/>
+            </w:pPr>
+            <w:r>
+              <w:rPr>
+                <w:rFonts w:ascii="Calibri" w:cs="Calibri" w:eastAsia="Calibri" w:hAnsi="Calibri"/>
+                <w:b/>
+                <w:bCs/>
+                <w:sz w:val="22"/>
+                <w:szCs w:val="22"/>
+              </w:rPr>
+              <w:t xml:space="preserve">21.08.2026</w:t>
+            </w:r>
+          </w:p>
+        </w:tc>
+        <w:tc>
+          <w:tcPr>
+            <w:tcW w:type="dxa" w:w="7200"/>
+            <w:tcMar>
+              <w:top w:type="dxa" w:w="80"/>
+              <w:left w:type="dxa" w:w="110"/>
+              <w:bottom w:type="dxa" w:w="80"/>
+              <w:right w:type="dxa" w:w="110"/>
+            </w:tcMar>
+          </w:tcPr>
+          <w:p>
+            <w:pPr>
+              <w:spacing w:after="0" w:line="276"/>
+            </w:pPr>
+            <w:r>
+              <w:rPr>
+                <w:rFonts w:ascii="Calibri" w:cs="Calibri" w:eastAsia="Calibri" w:hAnsi="Calibri"/>
+                <w:sz w:val="22"/>
+                <w:szCs w:val="22"/>
+              </w:rPr>
+              <w:t xml:space="preserve">The Noticee stated the factory opens at 8:30, the manager comes by 9 and loading would be around 10:00–10:30. My client confirmed in writing that he would place a vehicle at 10:00 a.m. and asked that the challan be prepared.</w:t>
+            </w:r>
+          </w:p>
+        </w:tc>
+      </w:tr>
+      <w:tr>
+        <w:tc>
+          <w:tcPr>
+            <w:tcW w:type="dxa" w:w="2100"/>
+            <w:tcMar>
+              <w:top w:type="dxa" w:w="80"/>
+              <w:left w:type="dxa" w:w="110"/>
+              <w:bottom w:type="dxa" w:w="80"/>
+              <w:right w:type="dxa" w:w="110"/>
+            </w:tcMar>
+          </w:tcPr>
+          <w:p>
+            <w:pPr>
+              <w:spacing w:after="0" w:line="276"/>
+            </w:pPr>
+            <w:r>
+              <w:rPr>
+                <w:rFonts w:ascii="Calibri" w:cs="Calibri" w:eastAsia="Calibri" w:hAnsi="Calibri"/>
+                <w:b/>
+                <w:bCs/>
+                <w:sz w:val="22"/>
+                <w:szCs w:val="22"/>
+              </w:rPr>
+              <w:t xml:space="preserve">22.08.2026, morning</w:t>
+            </w:r>
+          </w:p>
+        </w:tc>
+        <w:tc>
+          <w:tcPr>
+            <w:tcW w:type="dxa" w:w="7200"/>
+            <w:tcMar>
+              <w:top w:type="dxa" w:w="80"/>
+              <w:left w:type="dxa" w:w="110"/>
+              <w:bottom w:type="dxa" w:w="80"/>
+              <w:right w:type="dxa" w:w="110"/>
+            </w:tcMar>
+          </w:tcPr>
+          <w:p>
+            <w:pPr>
+              <w:spacing w:after="0" w:line="276"/>
+            </w:pPr>
+            <w:r>
+              <w:rPr>
+                <w:rFonts w:ascii="Calibri" w:cs="Calibri" w:eastAsia="Calibri" w:hAnsi="Calibri"/>
+                <w:sz w:val="22"/>
+                <w:szCs w:val="22"/>
+              </w:rPr>
+              <w:t xml:space="preserve">The Noticee resiled and stated loading would happen only after lunch, at 2:00 p.m., adding “Baad mein hum kuch nai sunega”.</w:t>
+            </w:r>
+          </w:p>
+        </w:tc>
+      </w:tr>
+      <w:tr>
+        <w:tc>
+          <w:tcPr>
+            <w:tcW w:type="dxa" w:w="2100"/>
+            <w:tcMar>
+              <w:top w:type="dxa" w:w="80"/>
+              <w:left w:type="dxa" w:w="110"/>
+              <w:bottom w:type="dxa" w:w="80"/>
+              <w:right w:type="dxa" w:w="110"/>
+            </w:tcMar>
+          </w:tcPr>
+          <w:p>
+            <w:pPr>
+              <w:spacing w:after="0" w:line="276"/>
+            </w:pPr>
+            <w:r>
+              <w:rPr>
+                <w:rFonts w:ascii="Calibri" w:cs="Calibri" w:eastAsia="Calibri" w:hAnsi="Calibri"/>
+                <w:b/>
+                <w:bCs/>
+                <w:sz w:val="22"/>
+                <w:szCs w:val="22"/>
+              </w:rPr>
+              <w:t xml:space="preserve">22.08.2026, afternoon</w:t>
+            </w:r>
+          </w:p>
+        </w:tc>
+        <w:tc>
+          <w:tcPr>
+            <w:tcW w:type="dxa" w:w="7200"/>
+            <w:tcMar>
+              <w:top w:type="dxa" w:w="80"/>
+              <w:left w:type="dxa" w:w="110"/>
+              <w:bottom w:type="dxa" w:w="80"/>
+              <w:right w:type="dxa" w:w="110"/>
+            </w:tcMar>
+          </w:tcPr>
+          <w:p>
+            <w:pPr>
+              <w:spacing w:after="0" w:line="276"/>
+            </w:pPr>
+            <w:r>
+              <w:rPr>
+                <w:rFonts w:ascii="Calibri" w:cs="Calibri" w:eastAsia="Calibri" w:hAnsi="Calibri"/>
+                <w:sz w:val="22"/>
+                <w:szCs w:val="22"/>
+              </w:rPr>
+              <w:t xml:space="preserve">My client attended with a hired vehicle at the appointed hour. Only 18 of the 21 doors had been made and those were still under manufacture. The vehicle was detained 4 hours 06 minutes, of which 156 minutes were charged as waiting time (Trip CRN113083391386, vehicle WB-01-BB-8397). At 17:03 hrs my client recorded that he had waited three hours without lunch and again asked for the challan.</w:t>
+            </w:r>
+          </w:p>
+        </w:tc>
+      </w:tr>
+      <w:tr>
+        <w:tc>
+          <w:tcPr>
+            <w:tcW w:type="dxa" w:w="2100"/>
+            <w:tcMar>
+              <w:top w:type="dxa" w:w="80"/>
+              <w:left w:type="dxa" w:w="110"/>
+              <w:bottom w:type="dxa" w:w="80"/>
+              <w:right w:type="dxa" w:w="110"/>
+            </w:tcMar>
+          </w:tcPr>
+          <w:p>
+            <w:pPr>
+              <w:spacing w:after="0" w:line="276"/>
+            </w:pPr>
+            <w:r>
+              <w:rPr>
+                <w:rFonts w:ascii="Calibri" w:cs="Calibri" w:eastAsia="Calibri" w:hAnsi="Calibri"/>
+                <w:b/>
+                <w:bCs/>
+                <w:sz w:val="22"/>
+                <w:szCs w:val="22"/>
+              </w:rPr>
+              <w:t xml:space="preserve">22.08.2026, evening</w:t>
+            </w:r>
+          </w:p>
+        </w:tc>
+        <w:tc>
+          <w:tcPr>
+            <w:tcW w:type="dxa" w:w="7200"/>
+            <w:tcMar>
+              <w:top w:type="dxa" w:w="80"/>
+              <w:left w:type="dxa" w:w="110"/>
+              <w:bottom w:type="dxa" w:w="80"/>
+              <w:right w:type="dxa" w:w="110"/>
+            </w:tcMar>
+          </w:tcPr>
+          <w:p>
+            <w:pPr>
+              <w:spacing w:after="0" w:line="276"/>
+            </w:pPr>
+            <w:r>
+              <w:rPr>
+                <w:rFonts w:ascii="Calibri" w:cs="Calibri" w:eastAsia="Calibri" w:hAnsi="Calibri"/>
+                <w:sz w:val="22"/>
+                <w:szCs w:val="22"/>
+              </w:rPr>
+              <w:t xml:space="preserve">The goods were released at about 6:40 p.m. WITHOUT ANY DOCUMENT — no delivery challan, no invoice, no e-way bill — notwithstanding my client’s written request of 21.08.2026 and his repeated requests on the day. On inspection the replacement doors were themselves found defective, the resin and skin not having adhered in several pieces, leaving the core paper visible.</w:t>
             </w:r>
           </w:p>
         </w:tc>
@@ -2436,7 +2715,7 @@
           <w:sz w:val="22"/>
           <w:szCs w:val="22"/>
         </w:rPr>
-        <w:t xml:space="preserve">3.1  DELAY IN DELIVERY. Against a firm assurance of 10 to 15 days, delivery was effected only on 11.07.2026, being approximately 38 days from the date of the order dated 04.06.2026 and approximately 32 days from the date of the payment of 09.06.2026. Time was of the essence, as you were fully aware that the goods were required for onward supply to my client’s customer at a construction site.</w:t>
+        <w:t xml:space="preserve">3.1  DELAY IN DELIVERY. On 19.07.2025 you represented in writing that your terms were “40% advance / 12-13 days delivery”. The order was placed on 02.06.2026, the specification furnished on 04.06.2026, and 40% of the price stood paid by 09.06.2026. Delivery was nevertheless effected only on 11.07.2026 and the goods reached the site on 12.07.2026, being 37 days from the date of the order. Time was of the essence and you were aware throughout that the goods were required for onward supply to a builder at a live construction site.</w:t>
       </w:r>
     </w:p>
     <w:p>
@@ -2449,7 +2728,7 @@
           <w:sz w:val="22"/>
           <w:szCs w:val="22"/>
         </w:rPr>
-        <w:t xml:space="preserve">3.2  THE PLEA OF RAIN IS FALSE. You have throughout attributed the delay to the monsoon. That plea is untenable. My client has personally observed the manufacturing process at your factory on 22.08.2026: the resin application, skin pressing and levelling of a flush door takes approximately twenty minutes to set, and within half an hour three doors were completed in his presence. On that basis the entire order of 94 pcs was capable of being manufactured within a matter of days. In any event, there was at no point a continuous spell of rain of such duration as could account for a delay of this magnitude.</w:t>
+        <w:t xml:space="preserve">3.2  MISREPRESENTATION AS TO CAPACITY. When my client asked, before placing the order, whether there would be any difficulty as to quality, you represented in writing that “humlog 3000-3500 monthly banate hai, aisse toh koi dikkat aata nai”. On the strength of that representation my client placed the order. An order of 94 pieces then took 37 days, and the replacement of 21 pieces has taken a further six weeks and is still incomplete.</w:t>
       </w:r>
     </w:p>
     <w:p>
@@ -2462,7 +2741,7 @@
           <w:sz w:val="22"/>
           <w:szCs w:val="22"/>
         </w:rPr>
-        <w:t xml:space="preserve">3.3  SUPPLY OF NON-CONFORMING GOODS. Of the 94 pcs supplied, 21 pcs were wholly non-conforming: 10 pcs were manufactured at 36 inches against an ordered size of 32 inches, and 11 pcs were manufactured in a design that was never ordered by my client at all. The remaining pieces were not manufactured to the exact sizes furnished in the size list dated 04.06.2026, and my client’s customer was compelled to engage carpenters to cut and re-fit 73 doors at site.</w:t>
+        <w:t xml:space="preserve">3.3  THE PLEA OF WEATHER IS UNTENABLE. From 17.08.2026 onwards you attributed the delay to the absence of sunshine. On 14.08.2026 you had confirmed, in answer to the express question “Pakka Final Na ??”, simply “Yes.” My client has since observed the manufacturing process at your factory and the setting of resin and skin on a door takes about twenty minutes, three doors having been completed in his presence within half an hour. The delay is not attributable to the weather.</w:t>
       </w:r>
     </w:p>
     <w:p>
@@ -2475,7 +2754,7 @@
           <w:sz w:val="22"/>
           <w:szCs w:val="22"/>
         </w:rPr>
-        <w:t xml:space="preserve">3.4  UNDISCLOSED CHARGES. At the time of final dispatch you levied for the first time a cutting charge of Rs. 2/- per sq. ft. and a loading charge of Rs. 1,000/-. Neither of these charges was disclosed to my client on 02.06.2026 when the order was placed, or on 04.06.2026 when the size list was furnished, or on 09.06.2026 when payment was made. Such unilateral imposition of charges after the contract was concluded and paid for is wholly impermissible. It is further material that, having charged separately for cutting, you failed to deliver even a single door in the exact ordered size.</w:t>
+        <w:t xml:space="preserve">3.4  SUPPLY OF NON-CONFORMING GOODS. Against the size list of 04.06.2026, in which every lamination door was within 32 inches in width, you manufactured 10 pcs at 36 inches and 36.5 inches. You further supplied 11 pcs in MEMBRANE where LAMINATION had been ordered. You supplied lamination doors with a design on one side only although both-side design had been agreed, and the thickness of the doors was not uniform. The sizes of the remaining doors were out by between 2 suta and 1 inch, so that my client’s customer had to engage carpenters to cut and re-fit the consignment.</w:t>
       </w:r>
     </w:p>
     <w:p>
@@ -2488,7 +2767,7 @@
           <w:sz w:val="22"/>
           <w:szCs w:val="22"/>
         </w:rPr>
-        <w:t xml:space="preserve">3.5  REFUSAL TO BEAR THE COST OF YOUR OWN DEFECT. Upon the defect being pointed out, you admitted in terms (and the said admission stands recorded) that the goods were wrongly manufactured by you and that you would rectify the same. You nevertheless refused to bear the freight for the return of the defective goods, requiring my client to bear Rs. 7,000/- out of his own pocket, and have since refused to commit to bearing the freight for their re-delivery.</w:t>
+        <w:t xml:space="preserve">3.5  CHARGES LEVIED WITHOUT DISCLOSURE. The signed order note of 02.06.2026 records only the rates, delivery at Jhargram, 50% billing and the advance. It contains no cutting charge, no loading charge and no differential rate. Your own rate message of 01.06.2026 likewise contains none. Yet at the time of despatch you levied for the first time a “cutting extra for different sizes” of Rs 2 per sq. ft. on 1622.907 sq. ft., amounting to Rs 3,245.81, a loading charge of Rs 1,000, and a rate of Rs 132 per sq. ft. on 15 pcs described as “lamination short sizes less than 25 inches” as against Rs 122 for the rest. Having charged separately for cutting, you delivered scarcely a single door in the exact ordered size.</w:t>
       </w:r>
     </w:p>
     <w:p>
@@ -2501,7 +2780,7 @@
           <w:sz w:val="22"/>
           <w:szCs w:val="22"/>
         </w:rPr>
-        <w:t xml:space="preserve">3.6  FAILURE OF DUTIES AT DISPATCH. At the time of dispatch on 11.07.2026 you failed to furnish the invoice, the challan or the transporter’s contact details, despite my client requesting the same in writing from the early evening onwards. As a consequence my client was unable to make arrangements for unloading labour at the destination and was compelled to telephone you past midnight, whereupon you responded with objection rather than with the information sought.</w:t>
+        <w:t xml:space="preserve">3.6  EXCESS RECOVERY. Your own statement of account of 08.07.2026 put the final sum payable at Rs 2,13,738. My client has in fact paid Rs 2,21,200 at your instance, being Rs 7,462 in excess of your own figure. That excess is refundable.</w:t>
       </w:r>
     </w:p>
     <w:p>
@@ -2514,7 +2793,7 @@
           <w:sz w:val="22"/>
           <w:szCs w:val="22"/>
         </w:rPr>
-        <w:t xml:space="preserve">3.7  CONTINUING BREACH IN RESPECT OF THE REPLACEMENT. The 21 defective pieces were returned to your factory on 30.07.2026. On 17.08.2026 you stated that manufacture required only one day. Thereafter, from 18.08.2026 onwards, you shifted the ready-date daily. On 21.08.2026 you directed my client to send a vehicle that very evening on the representation that the goods were ready and were being packed; had my client done so, his vehicle would have stood idle overnight at his cost. On 22.08.2026 you first fixed loading for 10:30 a.m., then deferred it to 2:00 p.m., and when my client attended with a vehicle at the appointed hour only 18 of the 21 pieces had been made and those were still under manufacture, my client being made to wait for several hours at your premises.</w:t>
+        <w:t xml:space="preserve">3.7  FAILURE AS TO DOCUMENTS. The invoice issued on 11.07.2026 was made out in the name of a stranger, “ASF Plywood”, and had to be corrected only after my client pointed it out. Worse, on 22.08.2026 the replacement goods were released from your factory at about 6:40 p.m. without any document at all — no delivery challan under Rule 55 of the Central Goods and Services Tax Rules, 2017, no invoice and no e-way bill — although my client had asked for the challan in writing on 21.08.2026 at 16:14 hrs and again on 22.08.2026 at 17:03 hrs.</w:t>
       </w:r>
     </w:p>
     <w:p>
@@ -2527,7 +2806,7 @@
           <w:sz w:val="22"/>
           <w:szCs w:val="22"/>
         </w:rPr>
-        <w:t xml:space="preserve">3.8  REFUSAL TO ISSUE ANY DOCUMENT AT ALL. On 22.08.2026 the replacement goods were released from your factory at about 6:40 p.m. without any document whatsoever — without a tax invoice, without a delivery challan under Rule 55 of the Central Goods and Services Tax Rules, 2017, and without an e-way bill. My client had requested the document in writing at 5:30 p.m. on 21.08.2026 and thereafter by two telephone calls and in person through your staff and your manager. You neither took the calls nor caused any document to be issued, and your staff declined to speak to my client. My client was thereby compelled to move goods for which he had paid in full without any document from you. Your refusal, and my client’s attempts to obtain the document, are recorded on video and will be relied upon.</w:t>
+        <w:t xml:space="preserve">3.8  DELIVERY AT JHARGRAM WAS YOUR OBLIGATION. Your own signed order note of 02.06.2026 records “+ Delivery Jhargram”. Delivery at the customer’s site therefore formed part of the bargain and the freight was to your account. Notwithstanding this, and notwithstanding that the return of the goods was occasioned wholly by your own admitted default, you refused to bear either the freight of Rs 7,000 for the return of the 21 defective doors on 29.07.2026 or the freight of Rs 6,940 for their re-transport on 22.08.2026, both of which my client has borne out of his own pocket.</w:t>
       </w:r>
     </w:p>
     <w:p>
@@ -2540,7 +2819,33 @@
           <w:sz w:val="22"/>
           <w:szCs w:val="22"/>
         </w:rPr>
-        <w:t xml:space="preserve">3.9  THE REPLACEMENT GOODS ARE THEMSELVES DEFECTIVE. On inspection at your factory on 22.08.2026 it was found that in several of the replacement doors the resin and the skin had not adhered properly, leaving the core paper visible. My client reserves all his rights in respect of the said defects, which are being separately documented on receipt of the consignment.</w:t>
+        <w:t xml:space="preserve">3.9  ADMISSION OF DEFAULT. On 17.07.2026 you stated “Aur isko return karwa dijiye, change karke bhejwa denge” and on 30.07.2026 “Will rectify and send — Cannot confirm exact time now”. The defect and your liability to rectify it are therefore admitted. What is in issue is only the delay and the cost, both of which you have declined to answer for.</w:t>
+      </w:r>
+    </w:p>
+    <w:p>
+      <w:pPr>
+        <w:spacing w:after="120" w:line="276"/>
+      </w:pPr>
+      <w:r>
+        <w:rPr>
+          <w:rFonts w:ascii="Calibri" w:cs="Calibri" w:eastAsia="Calibri" w:hAnsi="Calibri"/>
+          <w:sz w:val="22"/>
+          <w:szCs w:val="22"/>
+        </w:rPr>
+        <w:t xml:space="preserve">3.10  CONDUCT. When pressed for a date, you replied “Then wait kariye”, “I don’t care. Mereko mat boliye”, “But koi bakwass nai sunuenga” and “Baad mein hum kuch nai sunega”. On 31.07.2026, when my client had already set out for your factory to inspect the goods, you messaged “No need to come.” On 09.07.2026 and repeatedly thereafter my client informed you in writing that he wished to be present at the time of loading; you dissuaded him, and the defects that were not caught at loading are the direct consequence.</w:t>
+      </w:r>
+    </w:p>
+    <w:p>
+      <w:pPr>
+        <w:spacing w:after="120" w:line="276"/>
+      </w:pPr>
+      <w:r>
+        <w:rPr>
+          <w:rFonts w:ascii="Calibri" w:cs="Calibri" w:eastAsia="Calibri" w:hAnsi="Calibri"/>
+          <w:sz w:val="22"/>
+          <w:szCs w:val="22"/>
+        </w:rPr>
+        <w:t xml:space="preserve">3.11  THE REPLACEMENT GOODS ARE THEMSELVES DEFECTIVE. On inspection at your factory on 22.08.2026 the resin and skin in several of the replacement doors were found not to have adhered properly, leaving the core paper visible. My client reserves all his rights in respect of these defects, which are being separately documented upon receipt.</w:t>
       </w:r>
     </w:p>
     <w:p>
@@ -2717,7 +3022,7 @@
                 <w:sz w:val="22"/>
                 <w:szCs w:val="22"/>
               </w:rPr>
-              <w:t xml:space="preserve">Freight paid for returning 21 defective doors to the Noticee’s factory on 30.07.2026</w:t>
+              <w:t xml:space="preserve">Freight paid on 29.07.2026 for returning the 21 defective doors to the Noticee’s factory</w:t>
             </w:r>
           </w:p>
         </w:tc>
@@ -2792,7 +3097,7 @@
                 <w:sz w:val="22"/>
                 <w:szCs w:val="22"/>
               </w:rPr>
-              <w:t xml:space="preserve">Freight now payable for re-transporting the replaced doors to the client’s site</w:t>
+              <w:t xml:space="preserve">Freight paid on 22.08.2026 for re-transporting the replaced doors (Trip CRN113083391386, vehicle WB-01-BB-8397), inclusive of the waiting charge at item 3</w:t>
             </w:r>
           </w:p>
         </w:tc>
@@ -2817,7 +3122,7 @@
                 <w:sz w:val="22"/>
                 <w:szCs w:val="22"/>
               </w:rPr>
-              <w:t xml:space="preserve">[AMOUNT]</w:t>
+              <w:t xml:space="preserve">6,940</w:t>
             </w:r>
           </w:p>
         </w:tc>
@@ -2867,7 +3172,7 @@
                 <w:sz w:val="22"/>
                 <w:szCs w:val="22"/>
               </w:rPr>
-              <w:t xml:space="preserve">Charges paid to the Complainant’s own carpenter for two days’ re-measurement and segregation of the consignment</w:t>
+              <w:t xml:space="preserve">of which vehicle waiting charges — 156 minutes at Rs 3.50 per minute, the vehicle having been detained at the Noticee’s factory for 4 hours 06 minutes</w:t>
             </w:r>
           </w:p>
         </w:tc>
@@ -2892,7 +3197,7 @@
                 <w:sz w:val="22"/>
                 <w:szCs w:val="22"/>
               </w:rPr>
-              <w:t xml:space="preserve">1,000</w:t>
+              <w:t xml:space="preserve">(546)</w:t>
             </w:r>
           </w:p>
         </w:tc>
@@ -2942,7 +3247,7 @@
                 <w:sz w:val="22"/>
                 <w:szCs w:val="22"/>
               </w:rPr>
-              <w:t xml:space="preserve">Cutting and re-fitting charges for 73 doors at Rs. 100/- per door, paid to the client’s carpenters</w:t>
+              <w:t xml:space="preserve">Charges paid to my client’s own carpenter for re-measurement and segregation of the consignment</w:t>
             </w:r>
           </w:p>
         </w:tc>
@@ -2967,7 +3272,7 @@
                 <w:sz w:val="22"/>
                 <w:szCs w:val="22"/>
               </w:rPr>
-              <w:t xml:space="preserve">7,000</w:t>
+              <w:t xml:space="preserve">1,000</w:t>
             </w:r>
           </w:p>
         </w:tc>
@@ -3017,7 +3322,7 @@
                 <w:sz w:val="22"/>
                 <w:szCs w:val="22"/>
               </w:rPr>
-              <w:t xml:space="preserve">Vehicle waiting charges on 22.08.2026 — 156 minutes at Rs. 3.50 per minute, the vehicle having been detained at the Noticee’s factory for 4 hours 06 minutes (Trip CRN113083391386, vehicle WB-01-BB-8397)</w:t>
+              <w:t xml:space="preserve">Cutting and re-fitting charges for 73 doors at Rs 100 per door, paid to the customer’s carpenters</w:t>
             </w:r>
           </w:p>
         </w:tc>
@@ -3042,7 +3347,7 @@
                 <w:sz w:val="22"/>
                 <w:szCs w:val="22"/>
               </w:rPr>
-              <w:t xml:space="preserve">546</w:t>
+              <w:t xml:space="preserve">7,000</w:t>
             </w:r>
           </w:p>
         </w:tc>
@@ -3092,7 +3397,7 @@
                 <w:sz w:val="22"/>
                 <w:szCs w:val="22"/>
               </w:rPr>
-              <w:t xml:space="preserve">Cutting charge of Rs. 2/- per sq. ft. levied in the invoice without prior disclosure</w:t>
+              <w:t xml:space="preserve">Excess recovered over the Noticee’s own final figure of Rs 2,13,738</w:t>
             </w:r>
           </w:p>
         </w:tc>
@@ -3117,7 +3422,7 @@
                 <w:sz w:val="22"/>
                 <w:szCs w:val="22"/>
               </w:rPr>
-              <w:t xml:space="preserve">[AMOUNT]</w:t>
+              <w:t xml:space="preserve">7,462</w:t>
             </w:r>
           </w:p>
         </w:tc>
@@ -3167,7 +3472,7 @@
                 <w:sz w:val="22"/>
                 <w:szCs w:val="22"/>
               </w:rPr>
-              <w:t xml:space="preserve">Loading charge levied in the invoice without prior disclosure</w:t>
+              <w:t xml:space="preserve">Cutting charge of Rs 2 per sq. ft. on 1622.907 sq. ft. levied without prior disclosure</w:t>
             </w:r>
           </w:p>
         </w:tc>
@@ -3192,7 +3497,7 @@
                 <w:sz w:val="22"/>
                 <w:szCs w:val="22"/>
               </w:rPr>
-              <w:t xml:space="preserve">1,000</w:t>
+              <w:t xml:space="preserve">3,246</w:t>
             </w:r>
           </w:p>
         </w:tc>
@@ -3242,7 +3547,7 @@
                 <w:sz w:val="22"/>
                 <w:szCs w:val="22"/>
               </w:rPr>
-              <w:t xml:space="preserve">Travel, lodging and incidental expenses incurred at Kolkata on 09.07.2026 to 11.07.2026 and on 22.08.2026</w:t>
+              <w:t xml:space="preserve">Loading charge levied without prior disclosure</w:t>
             </w:r>
           </w:p>
         </w:tc>
@@ -3267,7 +3572,7 @@
                 <w:sz w:val="22"/>
                 <w:szCs w:val="22"/>
               </w:rPr>
-              <w:t xml:space="preserve">[AMOUNT]</w:t>
+              <w:t xml:space="preserve">1,000</w:t>
             </w:r>
           </w:p>
         </w:tc>
@@ -3290,6 +3595,156 @@
             <w:r>
               <w:rPr>
                 <w:rFonts w:ascii="Calibri" w:cs="Calibri" w:eastAsia="Calibri" w:hAnsi="Calibri"/>
+                <w:sz w:val="22"/>
+                <w:szCs w:val="22"/>
+              </w:rPr>
+              <w:t xml:space="preserve">9.</w:t>
+            </w:r>
+          </w:p>
+        </w:tc>
+        <w:tc>
+          <w:tcPr>
+            <w:tcW w:type="dxa" w:w="6800"/>
+            <w:tcMar>
+              <w:top w:type="dxa" w:w="80"/>
+              <w:left w:type="dxa" w:w="110"/>
+              <w:bottom w:type="dxa" w:w="80"/>
+              <w:right w:type="dxa" w:w="110"/>
+            </w:tcMar>
+          </w:tcPr>
+          <w:p>
+            <w:pPr>
+              <w:spacing w:after="0" w:line="276"/>
+            </w:pPr>
+            <w:r>
+              <w:rPr>
+                <w:rFonts w:ascii="Calibri" w:cs="Calibri" w:eastAsia="Calibri" w:hAnsi="Calibri"/>
+                <w:sz w:val="22"/>
+                <w:szCs w:val="22"/>
+              </w:rPr>
+              <w:t xml:space="preserve">Differential of Rs 10 per sq. ft. on 228.79 sq. ft. charged at Rs 132 in place of Rs 122, without prior disclosure</w:t>
+            </w:r>
+          </w:p>
+        </w:tc>
+        <w:tc>
+          <w:tcPr>
+            <w:tcW w:type="dxa" w:w="1800"/>
+            <w:tcMar>
+              <w:top w:type="dxa" w:w="80"/>
+              <w:left w:type="dxa" w:w="110"/>
+              <w:bottom w:type="dxa" w:w="80"/>
+              <w:right w:type="dxa" w:w="110"/>
+            </w:tcMar>
+          </w:tcPr>
+          <w:p>
+            <w:pPr>
+              <w:spacing w:after="0" w:line="276"/>
+              <w:jc w:val="right"/>
+            </w:pPr>
+            <w:r>
+              <w:rPr>
+                <w:rFonts w:ascii="Calibri" w:cs="Calibri" w:eastAsia="Calibri" w:hAnsi="Calibri"/>
+                <w:sz w:val="22"/>
+                <w:szCs w:val="22"/>
+              </w:rPr>
+              <w:t xml:space="preserve">2,288</w:t>
+            </w:r>
+          </w:p>
+        </w:tc>
+      </w:tr>
+      <w:tr>
+        <w:tc>
+          <w:tcPr>
+            <w:tcW w:type="dxa" w:w="700"/>
+            <w:tcMar>
+              <w:top w:type="dxa" w:w="80"/>
+              <w:left w:type="dxa" w:w="110"/>
+              <w:bottom w:type="dxa" w:w="80"/>
+              <w:right w:type="dxa" w:w="110"/>
+            </w:tcMar>
+          </w:tcPr>
+          <w:p>
+            <w:pPr>
+              <w:spacing w:after="0" w:line="276"/>
+            </w:pPr>
+            <w:r>
+              <w:rPr>
+                <w:rFonts w:ascii="Calibri" w:cs="Calibri" w:eastAsia="Calibri" w:hAnsi="Calibri"/>
+                <w:sz w:val="22"/>
+                <w:szCs w:val="22"/>
+              </w:rPr>
+              <w:t xml:space="preserve">10.</w:t>
+            </w:r>
+          </w:p>
+        </w:tc>
+        <w:tc>
+          <w:tcPr>
+            <w:tcW w:type="dxa" w:w="6800"/>
+            <w:tcMar>
+              <w:top w:type="dxa" w:w="80"/>
+              <w:left w:type="dxa" w:w="110"/>
+              <w:bottom w:type="dxa" w:w="80"/>
+              <w:right w:type="dxa" w:w="110"/>
+            </w:tcMar>
+          </w:tcPr>
+          <w:p>
+            <w:pPr>
+              <w:spacing w:after="0" w:line="276"/>
+            </w:pPr>
+            <w:r>
+              <w:rPr>
+                <w:rFonts w:ascii="Calibri" w:cs="Calibri" w:eastAsia="Calibri" w:hAnsi="Calibri"/>
+                <w:sz w:val="22"/>
+                <w:szCs w:val="22"/>
+              </w:rPr>
+              <w:t xml:space="preserve">Travel, lodging and incidental expenses at Kolkata on 09.07.2026 to 11.07.2026 and on 22.08.2026</w:t>
+            </w:r>
+          </w:p>
+        </w:tc>
+        <w:tc>
+          <w:tcPr>
+            <w:tcW w:type="dxa" w:w="1800"/>
+            <w:tcMar>
+              <w:top w:type="dxa" w:w="80"/>
+              <w:left w:type="dxa" w:w="110"/>
+              <w:bottom w:type="dxa" w:w="80"/>
+              <w:right w:type="dxa" w:w="110"/>
+            </w:tcMar>
+          </w:tcPr>
+          <w:p>
+            <w:pPr>
+              <w:spacing w:after="0" w:line="276"/>
+              <w:jc w:val="right"/>
+            </w:pPr>
+            <w:r>
+              <w:rPr>
+                <w:rFonts w:ascii="Calibri" w:cs="Calibri" w:eastAsia="Calibri" w:hAnsi="Calibri"/>
+                <w:sz w:val="22"/>
+                <w:szCs w:val="22"/>
+              </w:rPr>
+              <w:t xml:space="preserve">[AMOUNT]</w:t>
+            </w:r>
+          </w:p>
+        </w:tc>
+      </w:tr>
+      <w:tr>
+        <w:tc>
+          <w:tcPr>
+            <w:tcW w:type="dxa" w:w="700"/>
+            <w:tcMar>
+              <w:top w:type="dxa" w:w="80"/>
+              <w:left w:type="dxa" w:w="110"/>
+              <w:bottom w:type="dxa" w:w="80"/>
+              <w:right w:type="dxa" w:w="110"/>
+            </w:tcMar>
+          </w:tcPr>
+          <w:p>
+            <w:pPr>
+              <w:spacing w:after="0" w:line="276"/>
+            </w:pPr>
+            <w:r>
+              <w:rPr>
+                <w:rFonts w:ascii="Calibri" w:cs="Calibri" w:eastAsia="Calibri" w:hAnsi="Calibri"/>
                 <w:b/>
                 <w:bCs/>
                 <w:sz w:val="22"/>
@@ -3321,7 +3776,7 @@
                 <w:sz w:val="22"/>
                 <w:szCs w:val="22"/>
               </w:rPr>
-              <w:t xml:space="preserve">Total quantified out-of-pocket loss (excluding items to be filled in)</w:t>
+              <w:t xml:space="preserve">Total quantified out-of-pocket loss (item 3 being included within item 2, and excluding item 10)</w:t>
             </w:r>
           </w:p>
         </w:tc>
@@ -3348,7 +3803,7 @@
                 <w:sz w:val="22"/>
                 <w:szCs w:val="22"/>
               </w:rPr>
-              <w:t xml:space="preserve">15,546</w:t>
+              <w:t xml:space="preserve">35,936</w:t>
             </w:r>
           </w:p>
         </w:tc>
@@ -3377,7 +3832,7 @@
           <w:sz w:val="22"/>
           <w:szCs w:val="22"/>
         </w:rPr>
-        <w:t xml:space="preserve">4.2  In addition to the above, my client has suffered a loss of business and of reputation. The goods were required for a customer of my client who is a builder and promoter engaged in construction on a substantial scale and who was a prospective source of continuing business worth several lakhs of rupees to my client. By reason of your delay of approximately 38 days and your supply of non-conforming goods, my client has been put to serious embarrassment before the said customer and his commercial relationship with him stands gravely prejudiced. My client reserves the right to quantify and claim this loss separately.</w:t>
+        <w:t xml:space="preserve">4.2  In addition to the above, my client has suffered a loss of business and of reputation. The goods were required for M/s Kriti Construction, a builder and promoter engaged in construction on a substantial scale, whose further project was nearing completion and against which an order for a further 150 pcs of doors was in prospect, and who had two to three further projects due to commence. By reason of your delay and your supply of non-conforming goods that customer has abused my client, attended his office and, on 11.08.2026, humiliated him before his own staff, and my client’s commercial relationship with him stands gravely prejudiced. My client reserves the right to quantify and claim this loss separately.</w:t>
       </w:r>
     </w:p>
     <w:p>
@@ -3451,7 +3906,7 @@
           <w:sz w:val="22"/>
           <w:szCs w:val="22"/>
         </w:rPr>
-        <w:t xml:space="preserve">Deliver to my client, at your own cost and risk including all freight and loading charges, the 21 pcs of flush doors manufactured strictly in accordance with the size list furnished on 04.06.2026, together with a proper tax invoice, delivery challan and e-way bill;</w:t>
+        <w:t xml:space="preserve">Deliver to my client, at your own cost and risk including all freight and loading charges, the balance of the 21 pcs of lamination doors manufactured strictly in accordance with the size list furnished on 04.06.2026, and replace any of the doors despatched on 22.08.2026 in which the resin and skin have not properly adhered;</w:t>
       </w:r>
     </w:p>
     <w:p>
@@ -3469,7 +3924,7 @@
           <w:sz w:val="22"/>
           <w:szCs w:val="22"/>
         </w:rPr>
-        <w:t xml:space="preserve">Reimburse to my client the sum of Rs. 7,000/- paid by him towards freight for the return of the defective goods on 30.07.2026;</w:t>
+        <w:t xml:space="preserve">Issue forthwith the delivery challan under Rule 55 of the Central Goods and Services Tax Rules, 2017 and, where required, the e-way bill, in respect of the goods released from your factory on 22.08.2026, no document of any kind having been issued at the time of despatch, and likewise in respect of the balance pieces;</w:t>
       </w:r>
     </w:p>
     <w:p>
@@ -3487,7 +3942,7 @@
           <w:sz w:val="22"/>
           <w:szCs w:val="22"/>
         </w:rPr>
-        <w:t xml:space="preserve">Reimburse to my client the sums of Rs. 1,000/- and Rs. 7,000/- paid by him towards re-measurement and towards the cutting and re-fitting of 73 doors respectively;</w:t>
+        <w:t xml:space="preserve">Reimburse to my client the freight of Rs 7,000 paid on 29.07.2026 and Rs 6,940 paid on 22.08.2026, delivery at Jhargram being your obligation under your own signed order note of 02.06.2026;</w:t>
       </w:r>
     </w:p>
     <w:p>
@@ -3505,7 +3960,7 @@
           <w:sz w:val="22"/>
           <w:szCs w:val="22"/>
         </w:rPr>
-        <w:t xml:space="preserve">Refund to my client the cutting charge of Rs. 2/- per sq. ft. and the loading charge of Rs. 1,000/- levied without prior disclosure, together with a corresponding credit note under the Central Goods and Services Tax Act, 2017;</w:t>
+        <w:t xml:space="preserve">Reimburse to my client Rs 1,000 towards re-measurement and Rs 7,000 towards the cutting and re-fitting of 73 doors at the customer’s site;</w:t>
       </w:r>
     </w:p>
     <w:p>
@@ -3523,7 +3978,7 @@
           <w:sz w:val="22"/>
           <w:szCs w:val="22"/>
         </w:rPr>
-        <w:t xml:space="preserve">Issue to my client a proper credit note and/or delivery challan in respect of the 21 pcs returned to you on 30.07.2026, so as to enable my client to correctly reflect the transaction in his statutory returns;</w:t>
+        <w:t xml:space="preserve">Refund the sum of Rs 7,462 recovered in excess of your own final figure of Rs 2,13,738;</w:t>
       </w:r>
     </w:p>
     <w:p>
@@ -3541,7 +3996,7 @@
           <w:sz w:val="22"/>
           <w:szCs w:val="22"/>
         </w:rPr>
-        <w:t xml:space="preserve">Issue to my client, in respect of the 21 pcs now being re-supplied by way of replacement against the original supply, a proper delivery challan under Rule 55 of the Central Goods and Services Tax Rules, 2017 together with the corresponding e-way bill, and not a fresh tax invoice, the said goods being a replacement of goods already invoiced; and</w:t>
+        <w:t xml:space="preserve">Refund the cutting charge of Rs 3,245.81, the loading charge of Rs 1,000 and the undisclosed rate differential of Rs 2,287.90, none of which was disclosed at the time of the order, at the time of the size list or at the time of payment, together with a corresponding credit note under the Central Goods and Services Tax Act, 2017; and</w:t>
       </w:r>
     </w:p>
     <w:p>
@@ -3559,25 +4014,7 @@
           <w:sz w:val="22"/>
           <w:szCs w:val="22"/>
         </w:rPr>
-        <w:t xml:space="preserve">Issue forthwith the delivery challan and, where required, the e-way bill in respect of the goods released from your factory on 22.08.2026, no document of any kind having been issued at the time of despatch;</w:t>
-      </w:r>
-    </w:p>
-    <w:p>
-      <w:pPr>
-        <w:pStyle w:val="ListParagraph"/>
-        <w:numPr>
-          <w:ilvl w:val="0"/>
-          <w:numId w:val="2"/>
-        </w:numPr>
-        <w:spacing w:after="160" w:line="276"/>
-      </w:pPr>
-      <w:r>
-        <w:rPr>
-          <w:rFonts w:ascii="Calibri" w:cs="Calibri" w:eastAsia="Calibri" w:hAnsi="Calibri"/>
-          <w:sz w:val="22"/>
-          <w:szCs w:val="22"/>
-        </w:rPr>
-        <w:t xml:space="preserve">Confirm in writing that the full value of the goods supplied has been duly reported by you in your outward supply returns under the Central Goods and Services Tax Act, 2017, so that my client may avail of the input tax credit to which he is lawfully entitled.</w:t>
+        <w:t xml:space="preserve">Issue a credit note and/or delivery challan in respect of the 21 pcs returned to you on 30.07.2026, so as to enable my client to correctly reflect the transaction in his statutory records.</w:t>
       </w:r>
     </w:p>
     <w:p>
@@ -3806,7 +4243,7 @@
           <w:sz w:val="22"/>
           <w:szCs w:val="22"/>
         </w:rPr>
-        <w:t xml:space="preserve">Copy of the WhatsApp message dated 04.06.2026 enclosing the size list of 94 doors.</w:t>
+        <w:t xml:space="preserve">Photograph of the Noticee’s signed order note dated 2/06/26 recording the rates, “+ Delivery Jhargram”, “+ 50% Bill” and the advance.</w:t>
       </w:r>
     </w:p>
     <w:p>
@@ -3824,7 +4261,7 @@
           <w:sz w:val="22"/>
           <w:szCs w:val="22"/>
         </w:rPr>
-        <w:t xml:space="preserve">Copies of the WhatsApp messages recording the assurance of delivery within 10 to 15 days and the representation as to manufacturing capacity.</w:t>
+        <w:t xml:space="preserve">WhatsApp message dated 19.07.2025 recording “40% advance / 12-13 days delivery”.</w:t>
       </w:r>
     </w:p>
     <w:p>
@@ -3842,7 +4279,7 @@
           <w:sz w:val="22"/>
           <w:szCs w:val="22"/>
         </w:rPr>
-        <w:t xml:space="preserve">Bank statement / transaction receipts evidencing the payments dated 09.06.2026 and thereafter.</w:t>
+        <w:t xml:space="preserve">WhatsApp message dated 25.07.2025 recording “humlog 3000-3500 monthly banate hai”.</w:t>
       </w:r>
     </w:p>
     <w:p>
@@ -3860,7 +4297,7 @@
           <w:sz w:val="22"/>
           <w:szCs w:val="22"/>
         </w:rPr>
-        <w:t xml:space="preserve">Copy of the tax invoice dated 11.07.2026 showing the cutting and loading charges.</w:t>
+        <w:t xml:space="preserve">WhatsApp rate message dated 01.06.2026 (Membrane 105 / Lamination 112 / Side Pine +15).</w:t>
       </w:r>
     </w:p>
     <w:p>
@@ -3878,7 +4315,7 @@
           <w:sz w:val="22"/>
           <w:szCs w:val="22"/>
         </w:rPr>
-        <w:t xml:space="preserve">Copy of the e-way bill(s) generated in respect of the consignment dispatched on 11.07.2026.</w:t>
+        <w:t xml:space="preserve">WhatsApp messages dated 04.06.2026 enclosing the size list of 25 pcs membrane and 69 pcs lamination.</w:t>
       </w:r>
     </w:p>
     <w:p>
@@ -3896,7 +4333,7 @@
           <w:sz w:val="22"/>
           <w:szCs w:val="22"/>
         </w:rPr>
-        <w:t xml:space="preserve">Transport receipt / bilty dated 30.07.2026 evidencing payment of Rs. 7,000/- towards return freight.</w:t>
+        <w:t xml:space="preserve">Bank statements and transaction receipts for all five payments aggregating Rs 2,21,200, together with the WhatsApp messages by which the Noticee nominated each account.</w:t>
       </w:r>
     </w:p>
     <w:p>
@@ -3914,7 +4351,7 @@
           <w:sz w:val="22"/>
           <w:szCs w:val="22"/>
         </w:rPr>
-        <w:t xml:space="preserve">Receipts or acknowledgements in respect of the carpentry charges of Rs. 1,000/- and Rs. 7,000/-.</w:t>
+        <w:t xml:space="preserve">The Noticee’s statement of account dated 08.07.2026 showing the final figure of Rs 2,13,738.</w:t>
       </w:r>
     </w:p>
     <w:p>
@@ -3932,7 +4369,7 @@
           <w:sz w:val="22"/>
           <w:szCs w:val="22"/>
         </w:rPr>
-        <w:t xml:space="preserve">Photographs and measurement records of the 21 non-conforming doors.</w:t>
+        <w:t xml:space="preserve">Tax invoice no. 18/WWP/26-27 dated 11.07.2026 in the name of ASF Plywood, and the revised invoice of the same number dated 13.07.2026 in my client’s name.</w:t>
       </w:r>
     </w:p>
     <w:p>
@@ -3950,7 +4387,7 @@
           <w:sz w:val="22"/>
           <w:szCs w:val="22"/>
         </w:rPr>
-        <w:t xml:space="preserve">Screenshot of the transport operator’s trip record dated 22.08.2026 (Trip CRN113083391386, vehicle WB-01-BB-8397) showing detention of 4 hours 06 minutes and 156 minutes of billed waiting time.</w:t>
+        <w:t xml:space="preserve">E-way bill no. 8517 1317 0306 dated 13.07.2026.</w:t>
       </w:r>
     </w:p>
     <w:p>
@@ -3968,7 +4405,7 @@
           <w:sz w:val="22"/>
           <w:szCs w:val="22"/>
         </w:rPr>
-        <w:t xml:space="preserve">Video recordings made at the Noticee’s factory on 22.08.2026 evidencing the refusal to issue any despatch document, together with a certificate under Section 63 of the Bharatiya Sakshya Adhiniyam, 2023.</w:t>
+        <w:t xml:space="preserve">WhatsApp messages dated 16.07.2026 recording the defects, and the five pages of comparative measurements sent on 20.07.2026.</w:t>
       </w:r>
     </w:p>
     <w:p>
@@ -3986,7 +4423,7 @@
           <w:sz w:val="22"/>
           <w:szCs w:val="22"/>
         </w:rPr>
-        <w:t xml:space="preserve">Photographs of the defective resin and skin adhesion in the replacement doors.</w:t>
+        <w:t xml:space="preserve">WhatsApp messages dated 17.07.2026 and 30.07.2026 containing the Noticee’s admissions.</w:t>
       </w:r>
     </w:p>
     <w:p>
@@ -4004,51 +4441,7 @@
           <w:sz w:val="22"/>
           <w:szCs w:val="22"/>
         </w:rPr>
-        <w:t xml:space="preserve">Index of the audio recordings relied upon, together with a certificate under Section 63 of the Bharatiya Sakshya Adhiniyam, 2023.</w:t>
-      </w:r>
-    </w:p>
-    <w:p>
-      <w:pPr>
-        <w:spacing w:after="200" w:line="276"/>
-      </w:pPr>
-      <w:r>
-        <w:rPr>
-          <w:rFonts w:ascii="Calibri" w:cs="Calibri" w:eastAsia="Calibri" w:hAnsi="Calibri"/>
-          <w:sz w:val="22"/>
-          <w:szCs w:val="22"/>
-        </w:rPr>
-        <w:t xml:space="preserve"/>
-      </w:r>
-    </w:p>
-    <w:p>
-      <w:pPr>
-        <w:pBdr>
-          <w:bottom w:val="single" w:color="999999" w:sz="6" w:space="1"/>
-        </w:pBdr>
-        <w:spacing w:after="160" w:before="100"/>
-      </w:pPr>
-      <w:r>
-        <w:rPr>
-          <w:rFonts w:ascii="Calibri" w:cs="Calibri" w:eastAsia="Calibri" w:hAnsi="Calibri"/>
-          <w:sz w:val="2"/>
-          <w:szCs w:val="2"/>
-        </w:rPr>
-        <w:t xml:space="preserve"/>
-      </w:r>
-    </w:p>
-    <w:p>
-      <w:pPr>
-        <w:spacing w:after="140" w:before="260"/>
-      </w:pPr>
-      <w:r>
-        <w:rPr>
-          <w:rFonts w:ascii="Calibri" w:cs="Calibri" w:eastAsia="Calibri" w:hAnsi="Calibri"/>
-          <w:b/>
-          <w:bCs/>
-          <w:sz w:val="24"/>
-          <w:szCs w:val="24"/>
-        </w:rPr>
-        <w:t xml:space="preserve">NOTES FOR THE ADVOCATE (to be deleted before issue)</w:t>
+        <w:t xml:space="preserve">Transport receipt dated 29.07.2026 evidencing payment of Rs 7,000 towards return freight.</w:t>
       </w:r>
     </w:p>
     <w:p>
@@ -4063,12 +4456,10 @@
       <w:r>
         <w:rPr>
           <w:rFonts w:ascii="Calibri" w:cs="Calibri" w:eastAsia="Calibri" w:hAnsi="Calibri"/>
-          <w:i/>
-          <w:iCs/>
-          <w:sz w:val="22"/>
-          <w:szCs w:val="22"/>
-        </w:rPr>
-        <w:t xml:space="preserve">Please verify the correct legal name, constitution and address of both firms from the tax invoice and from the GST portal before issue. The notice is addressed to both concerns on the footing that they are commonly controlled; please confirm this before proceeding against both.</w:t>
+          <w:sz w:val="22"/>
+          <w:szCs w:val="22"/>
+        </w:rPr>
+        <w:t xml:space="preserve">Receipts for the carpentry charges of Rs 1,000 and Rs 7,000.</w:t>
       </w:r>
     </w:p>
     <w:p>
@@ -4083,12 +4474,10 @@
       <w:r>
         <w:rPr>
           <w:rFonts w:ascii="Calibri" w:cs="Calibri" w:eastAsia="Calibri" w:hAnsi="Calibri"/>
-          <w:i/>
-          <w:iCs/>
-          <w:sz w:val="22"/>
-          <w:szCs w:val="22"/>
-        </w:rPr>
-        <w:t xml:space="preserve">All highlighted fields require figures or dates from the client’s records.</w:t>
+          <w:sz w:val="22"/>
+          <w:szCs w:val="22"/>
+        </w:rPr>
+        <w:t xml:space="preserve">Transport operator’s trip record for 22.08.2026 (Trip CRN113083391386, vehicle WB-01-BB-8397) showing detention of 4 hours 06 minutes, 156 minutes of billed waiting time and a fare of Rs 6,940.</w:t>
       </w:r>
     </w:p>
     <w:p>
@@ -4103,12 +4492,10 @@
       <w:r>
         <w:rPr>
           <w:rFonts w:ascii="Calibri" w:cs="Calibri" w:eastAsia="Calibri" w:hAnsi="Calibri"/>
-          <w:i/>
-          <w:iCs/>
-          <w:sz w:val="22"/>
-          <w:szCs w:val="22"/>
-        </w:rPr>
-        <w:t xml:space="preserve">If the aggregate claim exceeds the specified value of Rs. 3,00,000/-, the suit will lie before the Commercial Court and pre-institution mediation under Section 12A of the Commercial Courts Act, 2015 will be mandatory save where urgent interim relief is sought. Please advise the client accordingly.</w:t>
+          <w:sz w:val="22"/>
+          <w:szCs w:val="22"/>
+        </w:rPr>
+        <w:t xml:space="preserve">Photographs of the non-conforming doors and of the defective resin and skin adhesion in the replacement doors.</w:t>
       </w:r>
     </w:p>
     <w:p>
@@ -4123,12 +4510,10 @@
       <w:r>
         <w:rPr>
           <w:rFonts w:ascii="Calibri" w:cs="Calibri" w:eastAsia="Calibri" w:hAnsi="Calibri"/>
-          <w:i/>
-          <w:iCs/>
-          <w:sz w:val="22"/>
-          <w:szCs w:val="22"/>
-        </w:rPr>
-        <w:t xml:space="preserve">The client is a trader who purchased the goods for onward resale; the availability of a remedy under the Consumer Protection Act, 2019 in view of Section 2(7) may require consideration.</w:t>
+          <w:sz w:val="22"/>
+          <w:szCs w:val="22"/>
+        </w:rPr>
+        <w:t xml:space="preserve">Video recordings made at the Noticee’s factory on 22.08.2026 evidencing the refusal to issue any despatch document.</w:t>
       </w:r>
     </w:p>
     <w:p>
@@ -4143,12 +4528,54 @@
       <w:r>
         <w:rPr>
           <w:rFonts w:ascii="Calibri" w:cs="Calibri" w:eastAsia="Calibri" w:hAnsi="Calibri"/>
-          <w:i/>
-          <w:iCs/>
-          <w:sz w:val="22"/>
-          <w:szCs w:val="22"/>
-        </w:rPr>
-        <w:t xml:space="preserve">The client holds audio recordings of the conversations to which he was himself a party. Please preserve the original recordings on the original device and prepare the certificate under Section 63 of the Bharatiya Sakshya Adhiniyam, 2023.</w:t>
+          <w:sz w:val="22"/>
+          <w:szCs w:val="22"/>
+        </w:rPr>
+        <w:t xml:space="preserve">Index of the audio recordings relied upon, with a certificate under Section 63 of the Bharatiya Sakshya Adhiniyam, 2023.</w:t>
+      </w:r>
+    </w:p>
+    <w:p>
+      <w:pPr>
+        <w:spacing w:after="200" w:line="276"/>
+      </w:pPr>
+      <w:r>
+        <w:rPr>
+          <w:rFonts w:ascii="Calibri" w:cs="Calibri" w:eastAsia="Calibri" w:hAnsi="Calibri"/>
+          <w:sz w:val="22"/>
+          <w:szCs w:val="22"/>
+        </w:rPr>
+        <w:t xml:space="preserve"/>
+      </w:r>
+    </w:p>
+    <w:p>
+      <w:pPr>
+        <w:pBdr>
+          <w:bottom w:val="single" w:color="999999" w:sz="6" w:space="1"/>
+        </w:pBdr>
+        <w:spacing w:after="160" w:before="100"/>
+      </w:pPr>
+      <w:r>
+        <w:rPr>
+          <w:rFonts w:ascii="Calibri" w:cs="Calibri" w:eastAsia="Calibri" w:hAnsi="Calibri"/>
+          <w:sz w:val="2"/>
+          <w:szCs w:val="2"/>
+        </w:rPr>
+        <w:t xml:space="preserve"/>
+      </w:r>
+    </w:p>
+    <w:p>
+      <w:pPr>
+        <w:spacing w:after="140" w:before="260"/>
+      </w:pPr>
+      <w:r>
+        <w:rPr>
+          <w:rFonts w:ascii="Calibri" w:cs="Calibri" w:eastAsia="Calibri" w:hAnsi="Calibri"/>
+          <w:b/>
+          <w:bCs/>
+          <w:sz w:val="24"/>
+          <w:szCs w:val="24"/>
+        </w:rPr>
+        <w:t xml:space="preserve">NOTES FOR THE ADVOCATE (to be deleted before issue)</w:t>
       </w:r>
     </w:p>
     <w:p>
@@ -4168,7 +4595,7 @@
           <w:sz w:val="22"/>
           <w:szCs w:val="22"/>
         </w:rPr>
-        <w:t xml:space="preserve">IMPORTANT — of the total consideration of Rs. 2,21,200/-, only Rs. 80,000/- was paid into the Noticee firm’s own current account. Rs. 20,000/- was paid in cash and Rs. 1,21,200/- into savings accounts of two individuals nominated by the Noticee. Please satisfy yourself, from the WhatsApp record, that the Noticee himself furnished those account particulars, as proof of payment will otherwise be contested. Please also advise the client separately on his own position under Section 40A(3) of the Income-tax Act, 1961 in respect of the cash payment, and on his invoicing and input tax credit position, before this notice is issued.</w:t>
+        <w:t xml:space="preserve">Please verify the constitution and correct legal names of M/s Wood &amp; Wood Products and M/s BG Timber from the GST portal before issue, and satisfy yourself that both are commonly controlled before proceeding against both. The tax invoice is issued by Wood &amp; Wood Products (GSTIN 19AADFW7733P1ZB) but the cash advance of 02.06.2026 was taken in the name of BG Timber.</w:t>
       </w:r>
     </w:p>
     <w:p>
@@ -4188,7 +4615,7 @@
           <w:sz w:val="22"/>
           <w:szCs w:val="22"/>
         </w:rPr>
-        <w:t xml:space="preserve">The client has been supplied a tax invoice for Rs. 80,000/- against the original consignment and has raised a corresponding invoice on his own customer for the same value, the customer being aware from the outset that the balance would not be invoiced. The claim for the unbilled balance of Rs. 1,41,200/- therefore rests entirely on the bank trail and on the WhatsApp messages by which the Noticee nominated the third-party accounts. Please examine that record before settling the figures in this notice.</w:t>
+        <w:t xml:space="preserve">MATTERS ADVERSE TO THE CLIENT, on which he must be advised before this notice is issued. First, the Noticee’s signed order note of 02.06.2026 itself records “+ 50% Bill”, so the partial-billing arrangement is documented and was known to both sides; the client’s customer was also aware of it. Second, on 11.02.2026 the client himself asked the Noticee “Agr koi Kachhe me Maal lene khojega to kese bhejenge ??”. Third, on 21.08.2026 at 16:26 hrs the client wrote “Bill nahi dene se bhi chalega… i will manage…”, which weakens the complaint at paragraph 3.7 so far as the despatch of 22.08.2026 is concerned; the demand for the challan was however repeated on 21.08.2026 and again on 22.08.2026 and is preserved. Please consider whether paragraph 3.7 should be confined to the ASF Plywood invoice and to the challan.</w:t>
       </w:r>
     </w:p>
     <w:p>
@@ -4208,7 +4635,107 @@
           <w:sz w:val="22"/>
           <w:szCs w:val="22"/>
         </w:rPr>
-        <w:t xml:space="preserve">The demands relating to GST reporting and credit notes are included solely to protect the client’s own input tax credit position and his statutory records. They are not to be framed, and must not be understood, as any threat of a complaint to the tax authorities.</w:t>
+        <w:t xml:space="preserve">Of the consideration of Rs 2,21,200, only Rs 80,000 reached the Noticee firm’s own current account. Rs 20,000 was paid in cash and Rs 1,21,200 into savings accounts of three individuals nominated by the Noticee (Sri Ajay Sharma, Sri Ramkrishna Mondal and, at one stage, Sri Anuj Kumar Pandey). Proof of payment rests entirely on the WhatsApp messages by which the Noticee furnished those account particulars; those messages must be preserved and certified. Please also advise the client separately on Section 40A(3) of the Income-tax Act, 1961 in respect of the cash payment, and on his own books and input tax credit, BEFORE this notice is issued.</w:t>
+      </w:r>
+    </w:p>
+    <w:p>
+      <w:pPr>
+        <w:pStyle w:val="ListParagraph"/>
+        <w:numPr>
+          <w:ilvl w:val="0"/>
+          <w:numId w:val="3"/>
+        </w:numPr>
+        <w:spacing w:after="80" w:line="276"/>
+      </w:pPr>
+      <w:r>
+        <w:rPr>
+          <w:rFonts w:ascii="Calibri" w:cs="Calibri" w:eastAsia="Calibri" w:hAnsi="Calibri"/>
+          <w:i/>
+          <w:iCs/>
+          <w:sz w:val="22"/>
+          <w:szCs w:val="22"/>
+        </w:rPr>
+        <w:t xml:space="preserve">The rates recorded in the signed note of 02.06.2026 (Lamination 140, Membrane Rosewood 135) do not match the rates actually billed (Lamination 122, short sizes 132, Membrane 105). Please take the client’s instructions on this before settling paragraph 3.5, as the discrepancy may be explained by the design codes BGL 10 and BG 26.</w:t>
+      </w:r>
+    </w:p>
+    <w:p>
+      <w:pPr>
+        <w:pStyle w:val="ListParagraph"/>
+        <w:numPr>
+          <w:ilvl w:val="0"/>
+          <w:numId w:val="3"/>
+        </w:numPr>
+        <w:spacing w:after="80" w:line="276"/>
+      </w:pPr>
+      <w:r>
+        <w:rPr>
+          <w:rFonts w:ascii="Calibri" w:cs="Calibri" w:eastAsia="Calibri" w:hAnsi="Calibri"/>
+          <w:i/>
+          <w:iCs/>
+          <w:sz w:val="22"/>
+          <w:szCs w:val="22"/>
+        </w:rPr>
+        <w:t xml:space="preserve">The aggregate claim is presently below the specified value of Rs 3,00,000 under the Commercial Courts Act, 2015 unless loss of business is quantified and included. Please advise the client on the appropriate forum and, if the Commercial Courts Act is attracted, on pre-institution mediation under Section 12A.</w:t>
+      </w:r>
+    </w:p>
+    <w:p>
+      <w:pPr>
+        <w:pStyle w:val="ListParagraph"/>
+        <w:numPr>
+          <w:ilvl w:val="0"/>
+          <w:numId w:val="3"/>
+        </w:numPr>
+        <w:spacing w:after="80" w:line="276"/>
+      </w:pPr>
+      <w:r>
+        <w:rPr>
+          <w:rFonts w:ascii="Calibri" w:cs="Calibri" w:eastAsia="Calibri" w:hAnsi="Calibri"/>
+          <w:i/>
+          <w:iCs/>
+          <w:sz w:val="22"/>
+          <w:szCs w:val="22"/>
+        </w:rPr>
+        <w:t xml:space="preserve">The client is a trader who purchased the goods for onward resale; the availability of a remedy under the Consumer Protection Act, 2019 in view of Section 2(7) may require consideration.</w:t>
+      </w:r>
+    </w:p>
+    <w:p>
+      <w:pPr>
+        <w:pStyle w:val="ListParagraph"/>
+        <w:numPr>
+          <w:ilvl w:val="0"/>
+          <w:numId w:val="3"/>
+        </w:numPr>
+        <w:spacing w:after="80" w:line="276"/>
+      </w:pPr>
+      <w:r>
+        <w:rPr>
+          <w:rFonts w:ascii="Calibri" w:cs="Calibri" w:eastAsia="Calibri" w:hAnsi="Calibri"/>
+          <w:i/>
+          <w:iCs/>
+          <w:sz w:val="22"/>
+          <w:szCs w:val="22"/>
+        </w:rPr>
+        <w:t xml:space="preserve">The client holds audio recordings of conversations to which he was himself a party, and video recordings made at the Noticee’s factory on 22.08.2026. Please preserve the originals on the original device and prepare the certificate under Section 63 of the Bharatiya Sakshya Adhiniyam, 2023.</w:t>
+      </w:r>
+    </w:p>
+    <w:p>
+      <w:pPr>
+        <w:pStyle w:val="ListParagraph"/>
+        <w:numPr>
+          <w:ilvl w:val="0"/>
+          <w:numId w:val="3"/>
+        </w:numPr>
+        <w:spacing w:after="80" w:line="276"/>
+      </w:pPr>
+      <w:r>
+        <w:rPr>
+          <w:rFonts w:ascii="Calibri" w:cs="Calibri" w:eastAsia="Calibri" w:hAnsi="Calibri"/>
+          <w:i/>
+          <w:iCs/>
+          <w:sz w:val="22"/>
+          <w:szCs w:val="22"/>
+        </w:rPr>
+        <w:t xml:space="preserve">The demands relating to credit notes and challans are included solely to protect the client’s own statutory records. They are not to be framed, and must not be understood, as any threat of a complaint to the tax authorities.</w:t>
       </w:r>
     </w:p>
     <w:sectPr>

</xml_diff>

<commit_message>
Correct how the 2 June memorandum is characterised
The memorandum is in the supplier's handwriting but the signature at its
foot is the buyer's, taken as a receipt for the cash advance, and the
supplier kept the original. Pleads it instead as the supplier's own
writing and as a statement transmitted to him the same day and never
denied, and adds advocate notes on producing the original and on the
buyer's disabled read receipts.

Co-Authored-By: Claude Opus 5 <noreply@anthropic.com>
Claude-Session: https://claude.ai/code/session_01JwS8aN6FDpkQcEk2vsBb7X
</commit_message>
<xml_diff>
--- a/legal/Legal-Notice-Draft-Wood-and-Wood-Products.docx
+++ b/legal/Legal-Notice-Draft-Wood-and-Wood-Products.docx
@@ -1631,7 +1631,7 @@
                 <w:sz w:val="22"/>
                 <w:szCs w:val="22"/>
               </w:rPr>
-              <w:t xml:space="preserve">My client and his customer attended the Noticee’s office. The order was recorded in the Noticee’s own order book, dated and signed 2/06/26, in the following terms: “Kolkata Plywood 2/6/26 — (1) BGL 10 Lamination 140/- (2) BG 26 Membrane Rosewood 135/- — + Delivery Jhargram — + 50% Bill — 2/6 20000 Advance — Total 40% Advance”. Rs 20,000 was paid in cash to M/s BG Timber the same day. DELIVERY AT JHARGRAM WAS THUS PART OF THE CONTRACT.</w:t>
+              <w:t xml:space="preserve">My client and his customer attended the Noticee’s office. Rs 20,000 was paid there in cash to M/s BG Timber. You thereupon wrote out, in your own hand and on your own pad, a memorandum of the terms in the following words: “Kolkata Plywood 2/6/26 — (1) BGL 10 Lamination 140/- (2) BG 26 Membrane Rosewood 135/- — + Delivery Jhargram — + 50% Bill — 2/6 20000 Advance — Total 40% Advance”, and required my client to sign it in acknowledgement of the cash paid. You retained the original in your own custody and did not hand it over, permitting my client only to photograph it. My client transmitted that photograph to you on WhatsApp the same day at 17:19 hrs with the endorsement “20000/- cash Paid (As a Advance) To BG timber From Kolkata Plywood &amp; Co.” You did not then, or at any time in the eleven weeks since, dispute a single word of it. DELIVERY AT JHARGRAM WAS THUS PART OF THE CONTRACT.</w:t>
             </w:r>
           </w:p>
         </w:tc>
@@ -2806,7 +2806,7 @@
           <w:sz w:val="22"/>
           <w:szCs w:val="22"/>
         </w:rPr>
-        <w:t xml:space="preserve">3.8  DELIVERY AT JHARGRAM WAS YOUR OBLIGATION. Your own signed order note of 02.06.2026 records “+ Delivery Jhargram”. Delivery at the customer’s site therefore formed part of the bargain and the freight was to your account. Notwithstanding this, and notwithstanding that the return of the goods was occasioned wholly by your own admitted default, you refused to bear either the freight of Rs 7,000 for the return of the 21 defective doors on 29.07.2026 or the freight of Rs 6,940 for their re-transport on 22.08.2026, both of which my client has borne out of his own pocket.</w:t>
+        <w:t xml:space="preserve">3.8  DELIVERY AT JHARGRAM WAS YOUR OBLIGATION. The memorandum of 02.06.2026 records “+ Delivery Jhargram”. That memorandum is in your own handwriting, was written on your own pad at your own office, and was retained by you. Its photograph was sent to you on WhatsApp the same day and you have never disputed its contents. Delivery at the customer’s site therefore formed part of the bargain and the freight was to your account. Notwithstanding this, and notwithstanding that the return of the goods was occasioned wholly by your own admitted default, you refused to bear either the freight of Rs 7,000 for the return of the 21 defective doors on 29.07.2026 or the freight of Rs 6,940 for their re-transport on 22.08.2026, both of which my client has borne out of his own pocket.</w:t>
       </w:r>
     </w:p>
     <w:p>
@@ -4576,6 +4576,46 @@
           <w:szCs w:val="24"/>
         </w:rPr>
         <w:t xml:space="preserve">NOTES FOR THE ADVOCATE (to be deleted before issue)</w:t>
+      </w:r>
+    </w:p>
+    <w:p>
+      <w:pPr>
+        <w:pStyle w:val="ListParagraph"/>
+        <w:numPr>
+          <w:ilvl w:val="0"/>
+          <w:numId w:val="3"/>
+        </w:numPr>
+        <w:spacing w:after="80" w:line="276"/>
+      </w:pPr>
+      <w:r>
+        <w:rPr>
+          <w:rFonts w:ascii="Calibri" w:cs="Calibri" w:eastAsia="Calibri" w:hAnsi="Calibri"/>
+          <w:i/>
+          <w:iCs/>
+          <w:sz w:val="22"/>
+          <w:szCs w:val="22"/>
+        </w:rPr>
+        <w:t xml:space="preserve">THE MEMORANDUM OF 02.06.2026 — how it must be pleaded. The body of the memorandum is in the NOTICEE’S handwriting; the signature at its foot is the CLIENT’S, taken by the Noticee as an acknowledgement of the Rs 20,000 cash. The Noticee kept the original and allowed only a photograph. It should therefore be pleaded not as a document executed by the Noticee but (a) as a writing in the Noticee’s own hand recording the terms he himself dictated, and (b) as a statement communicated to him on WhatsApp the same day at 17:19 hrs and never denied by him over the following eleven weeks, and so admitted by his silence and by his subsequent conduct. Please also consider a notice to produce the original, which remains in his custody; its non-production or destruction will support an adverse inference.</w:t>
+      </w:r>
+    </w:p>
+    <w:p>
+      <w:pPr>
+        <w:pStyle w:val="ListParagraph"/>
+        <w:numPr>
+          <w:ilvl w:val="0"/>
+          <w:numId w:val="3"/>
+        </w:numPr>
+        <w:spacing w:after="80" w:line="276"/>
+      </w:pPr>
+      <w:r>
+        <w:rPr>
+          <w:rFonts w:ascii="Calibri" w:cs="Calibri" w:eastAsia="Calibri" w:hAnsi="Calibri"/>
+          <w:i/>
+          <w:iCs/>
+          <w:sz w:val="22"/>
+          <w:szCs w:val="22"/>
+        </w:rPr>
+        <w:t xml:space="preserve">The client has read receipts disabled on WhatsApp, so his outgoing messages do not display a read indicator. Receipt of the material messages is nevertheless established by the Noticee’s own replies to them, and by delivery, which suffices for the purposes of notice under the contract. Please have the device examined and the messages certified accordingly.</w:t>
       </w:r>
     </w:p>
     <w:p>

</xml_diff>

<commit_message>
Correct the description of the 2 June memorandum sheet
It was written on a plain sheet with no firm letterhead, not on a
company pad. Adjusts the pleading to rest on the handwriting, the
same-day transmission and the eleven weeks of silence.

Co-Authored-By: Claude Opus 5 <noreply@anthropic.com>
Claude-Session: https://claude.ai/code/session_01JwS8aN6FDpkQcEk2vsBb7X
</commit_message>
<xml_diff>
--- a/legal/Legal-Notice-Draft-Wood-and-Wood-Products.docx
+++ b/legal/Legal-Notice-Draft-Wood-and-Wood-Products.docx
@@ -1631,7 +1631,7 @@
                 <w:sz w:val="22"/>
                 <w:szCs w:val="22"/>
               </w:rPr>
-              <w:t xml:space="preserve">My client and his customer attended the Noticee’s office. Rs 20,000 was paid there in cash to M/s BG Timber. You thereupon wrote out, in your own hand and on your own pad, a memorandum of the terms in the following words: “Kolkata Plywood 2/6/26 — (1) BGL 10 Lamination 140/- (2) BG 26 Membrane Rosewood 135/- — + Delivery Jhargram — + 50% Bill — 2/6 20000 Advance — Total 40% Advance”, and required my client to sign it in acknowledgement of the cash paid. You retained the original in your own custody and did not hand it over, permitting my client only to photograph it. My client transmitted that photograph to you on WhatsApp the same day at 17:19 hrs with the endorsement “20000/- cash Paid (As a Advance) To BG timber From Kolkata Plywood &amp; Co.” You did not then, or at any time in the eleven weeks since, dispute a single word of it. DELIVERY AT JHARGRAM WAS THUS PART OF THE CONTRACT.</w:t>
+              <w:t xml:space="preserve">My client and his customer attended the Noticee’s office. Rs 20,000 was paid there in cash to M/s BG Timber. You thereupon wrote out, in your own hand and on a plain sheet of paper bearing no printed particulars of any firm, a memorandum of the terms in the following words: “Kolkata Plywood 2/6/26 — (1) BGL 10 Lamination 140/- (2) BG 26 Membrane Rosewood 135/- — + Delivery Jhargram — + 50% Bill — 2/6 20000 Advance — Total 40% Advance”, and required my client to sign it in acknowledgement of the cash paid. You retained the original in your own custody and did not hand it over, permitting my client only to photograph it. My client transmitted that photograph to you on WhatsApp the same day at 17:19 hrs with the endorsement “20000/- cash Paid (As a Advance) To BG timber From Kolkata Plywood &amp; Co.” You did not then, or at any time in the eleven weeks since, dispute a single word of it. DELIVERY AT JHARGRAM WAS THUS PART OF THE CONTRACT.</w:t>
             </w:r>
           </w:p>
         </w:tc>
@@ -2806,7 +2806,7 @@
           <w:sz w:val="22"/>
           <w:szCs w:val="22"/>
         </w:rPr>
-        <w:t xml:space="preserve">3.8  DELIVERY AT JHARGRAM WAS YOUR OBLIGATION. The memorandum of 02.06.2026 records “+ Delivery Jhargram”. That memorandum is in your own handwriting, was written on your own pad at your own office, and was retained by you. Its photograph was sent to you on WhatsApp the same day and you have never disputed its contents. Delivery at the customer’s site therefore formed part of the bargain and the freight was to your account. Notwithstanding this, and notwithstanding that the return of the goods was occasioned wholly by your own admitted default, you refused to bear either the freight of Rs 7,000 for the return of the 21 defective doors on 29.07.2026 or the freight of Rs 6,940 for their re-transport on 22.08.2026, both of which my client has borne out of his own pocket.</w:t>
+        <w:t xml:space="preserve">3.8  DELIVERY AT JHARGRAM WAS YOUR OBLIGATION. The memorandum of 02.06.2026 records “+ Delivery Jhargram”. That memorandum is in your own handwriting, was written at your own office and was retained by you, my client being permitted only to photograph it. Its photograph was sent to you on WhatsApp the same day and you have never disputed its contents. Delivery at the customer’s site therefore formed part of the bargain and the freight was to your account. Notwithstanding this, and notwithstanding that the return of the goods was occasioned wholly by your own admitted default, you refused to bear either the freight of Rs 7,000 for the return of the 21 defective doors on 29.07.2026 or the freight of Rs 6,940 for their re-transport on 22.08.2026, both of which my client has borne out of his own pocket.</w:t>
       </w:r>
     </w:p>
     <w:p>
@@ -4595,7 +4595,7 @@
           <w:sz w:val="22"/>
           <w:szCs w:val="22"/>
         </w:rPr>
-        <w:t xml:space="preserve">THE MEMORANDUM OF 02.06.2026 — how it must be pleaded. The body of the memorandum is in the NOTICEE’S handwriting; the signature at its foot is the CLIENT’S, taken by the Noticee as an acknowledgement of the Rs 20,000 cash. The Noticee kept the original and allowed only a photograph. It should therefore be pleaded not as a document executed by the Noticee but (a) as a writing in the Noticee’s own hand recording the terms he himself dictated, and (b) as a statement communicated to him on WhatsApp the same day at 17:19 hrs and never denied by him over the following eleven weeks, and so admitted by his silence and by his subsequent conduct. Please also consider a notice to produce the original, which remains in his custody; its non-production or destruction will support an adverse inference.</w:t>
+        <w:t xml:space="preserve">THE MEMORANDUM OF 02.06.2026 — how it must be pleaded. The body of the memorandum is in the NOTICEE’S handwriting on a plain unheaded sheet; the signature at its foot is the CLIENT’S, taken by the Noticee as an acknowledgement of the Rs 20,000 cash. The absence of any letterhead makes it the more important to plead the handwriting, the transmission and the eleven weeks of silence, rather than the document itself. The Noticee kept the original and allowed only a photograph. It should therefore be pleaded not as a document executed by the Noticee but (a) as a writing in the Noticee’s own hand recording the terms he himself dictated, and (b) as a statement communicated to him on WhatsApp the same day at 17:19 hrs and never denied by him over the following eleven weeks, and so admitted by his silence and by his subsequent conduct. Please also consider a notice to produce the original, which remains in his custody; its non-production or destruction will support an adverse inference.</w:t>
       </w:r>
     </w:p>
     <w:p>

</xml_diff>

<commit_message>
Correct the billing figures from the supplier's 11 July statement
The 11 July statement totals Rs 2,21,214.50 against Rs 2,21,200 paid, so
there was no overpayment; the earlier Rs 7,462 excess claim is withdrawn.
What the statement does show is that the price rose Rs 7,476.50 in three
days, on the day of despatch, by adding the cutting and loading charges,
re-measuring the area and re-rating 15 pieces. Also records that Rs 13,000
was charged as tempo, that the carpentry charge is Rs 7,300, that no
credit note was issued on the return, and the full sequence of 22 August
including the exhausted skin. Damages restated at Rs 28,774. Adds an
index of the fifteen call recordings for the Section 63 certificate.

Co-Authored-By: Claude Opus 5 <noreply@anthropic.com>
Claude-Session: https://claude.ai/code/session_01JwS8aN6FDpkQcEk2vsBb7X
</commit_message>
<xml_diff>
--- a/legal/Legal-Notice-Draft-Wood-and-Wood-Products.docx
+++ b/legal/Legal-Notice-Draft-Wood-and-Wood-Products.docx
@@ -2595,7 +2595,7 @@
                 <w:sz w:val="22"/>
                 <w:szCs w:val="22"/>
               </w:rPr>
-              <w:t xml:space="preserve">22.08.2026, afternoon</w:t>
+              <w:t xml:space="preserve">22.08.2026, 2:00 p.m.</w:t>
             </w:r>
           </w:p>
         </w:tc>
@@ -2619,7 +2619,59 @@
                 <w:sz w:val="22"/>
                 <w:szCs w:val="22"/>
               </w:rPr>
-              <w:t xml:space="preserve">My client attended with a hired vehicle at the appointed hour. Only 18 of the 21 doors had been made and those were still under manufacture. The vehicle was detained 4 hours 06 minutes, of which 156 minutes were charged as waiting time (Trip CRN113083391386, vehicle WB-01-BB-8397). At 17:03 hrs my client recorded that he had waited three hours without lunch and again asked for the challan.</w:t>
+              <w:t xml:space="preserve">My client attended with a hired vehicle at the appointed hour. Not one of the 21 doors was complete. 18 of them were finished on one side only and were still under manufacture. The vehicle was detained 4 hours 06 minutes, of which 156 minutes were charged as waiting time (Trip CRN113083391386, vehicle WB-01-BB-8397). At 17:03 hrs my client recorded that he had been waiting three hours without lunch and again asked for the challan.</w:t>
+            </w:r>
+          </w:p>
+        </w:tc>
+      </w:tr>
+      <w:tr>
+        <w:tc>
+          <w:tcPr>
+            <w:tcW w:type="dxa" w:w="2100"/>
+            <w:tcMar>
+              <w:top w:type="dxa" w:w="80"/>
+              <w:left w:type="dxa" w:w="110"/>
+              <w:bottom w:type="dxa" w:w="80"/>
+              <w:right w:type="dxa" w:w="110"/>
+            </w:tcMar>
+          </w:tcPr>
+          <w:p>
+            <w:pPr>
+              <w:spacing w:after="0" w:line="276"/>
+            </w:pPr>
+            <w:r>
+              <w:rPr>
+                <w:rFonts w:ascii="Calibri" w:cs="Calibri" w:eastAsia="Calibri" w:hAnsi="Calibri"/>
+                <w:b/>
+                <w:bCs/>
+                <w:sz w:val="22"/>
+                <w:szCs w:val="22"/>
+              </w:rPr>
+              <w:t xml:space="preserve">22.08.2026, 5:00 p.m. onwards</w:t>
+            </w:r>
+          </w:p>
+        </w:tc>
+        <w:tc>
+          <w:tcPr>
+            <w:tcW w:type="dxa" w:w="7200"/>
+            <w:tcMar>
+              <w:top w:type="dxa" w:w="80"/>
+              <w:left w:type="dxa" w:w="110"/>
+              <w:bottom w:type="dxa" w:w="80"/>
+              <w:right w:type="dxa" w:w="110"/>
+            </w:tcMar>
+          </w:tcPr>
+          <w:p>
+            <w:pPr>
+              <w:spacing w:after="0" w:line="276"/>
+            </w:pPr>
+            <w:r>
+              <w:rPr>
+                <w:rFonts w:ascii="Calibri" w:cs="Calibri" w:eastAsia="Calibri" w:hAnsi="Calibri"/>
+                <w:sz w:val="22"/>
+                <w:szCs w:val="22"/>
+              </w:rPr>
+              <w:t xml:space="preserve">The 18 pieces were completed only at about 5:00 p.m., after which the remaining 3 were taken up. It then emerged that the skin which the customer had selected was exhausted at your factory, so that my client had to photograph an alternative skin, send it to his customer on WhatsApp and obtain his approval on the spot before manufacture could proceed. The goods were finished at about 6:00 p.m.</w:t>
             </w:r>
           </w:p>
         </w:tc>
@@ -2780,7 +2832,7 @@
           <w:sz w:val="22"/>
           <w:szCs w:val="22"/>
         </w:rPr>
-        <w:t xml:space="preserve">3.6  EXCESS RECOVERY. Your own statement of account of 08.07.2026 put the final sum payable at Rs 2,13,738. My client has in fact paid Rs 2,21,200 at your instance, being Rs 7,462 in excess of your own figure. That excess is refundable.</w:t>
+        <w:t xml:space="preserve">3.6  THE PRICE WAS INFLATED AT THE LAST MOMENT. On 08.07.2026 you sent my client a statement putting the sum payable at Rs 2,13,738. On 11.07.2026, on the very day of despatch and after Rs 1,70,000 had already been paid, you sent a fresh statement putting the figure at Rs 2,21,214.50 — an increase of Rs 7,476.50 within three days. The increase is made up of the cutting charge of Rs 3,245.81 and the loading charge of Rs 1,000 introduced for the first time, the sq. ft. having been re-measured upward, and 15 pcs being re-rated at Rs 132 in place of Rs 122. By that stage the goods were loaded and my client had no practical choice but to pay.</w:t>
       </w:r>
     </w:p>
     <w:p>
@@ -2793,7 +2845,7 @@
           <w:sz w:val="22"/>
           <w:szCs w:val="22"/>
         </w:rPr>
-        <w:t xml:space="preserve">3.7  FAILURE AS TO DOCUMENTS. The invoice issued on 11.07.2026 was made out in the name of a stranger, “ASF Plywood”, and had to be corrected only after my client pointed it out. Worse, on 22.08.2026 the replacement goods were released from your factory at about 6:40 p.m. without any document at all — no delivery challan under Rule 55 of the Central Goods and Services Tax Rules, 2017, no invoice and no e-way bill — although my client had asked for the challan in writing on 21.08.2026 at 16:14 hrs and again on 22.08.2026 at 17:03 hrs.</w:t>
+        <w:t xml:space="preserve">3.7  FAILURE AS TO DOCUMENTS. The invoice issued on 11.07.2026 was made out in the name of a stranger, “ASF Plywood”, and had to be corrected only after my client pointed it out. Worse, on 22.08.2026 the replacement goods were released from your factory at about 6:40 p.m. without any document at all — no delivery challan under Rule 55 of the Central Goods and Services Tax Rules, 2017, no invoice and no e-way bill — although my client had asked for the challan in writing on 21.08.2026 at 16:14 hrs and again on 22.08.2026 at 17:03 hrs. Further, when the 21 defective pieces were returned to your factory on 30.07.2026 you issued no credit note and accepted no debit note, so that goods for which my client has paid in full, and which have been lying in your possession for over three weeks, remain unaccounted for in the records of both parties.</w:t>
       </w:r>
     </w:p>
     <w:p>
@@ -2806,7 +2858,7 @@
           <w:sz w:val="22"/>
           <w:szCs w:val="22"/>
         </w:rPr>
-        <w:t xml:space="preserve">3.8  DELIVERY AT JHARGRAM WAS YOUR OBLIGATION. The memorandum of 02.06.2026 records “+ Delivery Jhargram”. That memorandum is in your own handwriting, was written at your own office and was retained by you, my client being permitted only to photograph it. Its photograph was sent to you on WhatsApp the same day and you have never disputed its contents. Delivery at the customer’s site therefore formed part of the bargain and the freight was to your account. Notwithstanding this, and notwithstanding that the return of the goods was occasioned wholly by your own admitted default, you refused to bear either the freight of Rs 7,000 for the return of the 21 defective doors on 29.07.2026 or the freight of Rs 6,940 for their re-transport on 22.08.2026, both of which my client has borne out of his own pocket.</w:t>
+        <w:t xml:space="preserve">3.8  FREIGHT. Delivery at Jhargram was part of the bargain from the outset, as your own memorandum of 02.06.2026 records in the words “+ Delivery Jhargram”, and my client has already paid you Rs 13,000 on that account under the head “TEMPO” in your statement of 11.07.2026. The freight so paid was rendered wholly infructuous as to the 21 defective pieces. The return of those pieces on 29.07.2026 and their re-transport on 22.08.2026 were occasioned solely by your own admitted default, and the cost of both — Rs 7,000 and Rs 6,940 respectively — has been borne by my client out of his own pocket because you expressly refused to bear it. A party in breach cannot require the innocent party to pay twice over for carriage made necessary by that breach.</w:t>
       </w:r>
     </w:p>
     <w:p>
@@ -3247,7 +3299,7 @@
                 <w:sz w:val="22"/>
                 <w:szCs w:val="22"/>
               </w:rPr>
-              <w:t xml:space="preserve">Charges paid to my client’s own carpenter for re-measurement and segregation of the consignment</w:t>
+              <w:t xml:space="preserve">Charges paid to my client’s own carpenter for two days’ re-measurement and segregation of the consignment</w:t>
             </w:r>
           </w:p>
         </w:tc>
@@ -3322,7 +3374,7 @@
                 <w:sz w:val="22"/>
                 <w:szCs w:val="22"/>
               </w:rPr>
-              <w:t xml:space="preserve">Cutting and re-fitting charges for 73 doors at Rs 100 per door, paid to the customer’s carpenters</w:t>
+              <w:t xml:space="preserve">Cutting and re-fitting charges for 73 doors at Rs 100 per door, paid to the customer’s carpenters, the customer having otherwise required the entire consignment to be taken back</w:t>
             </w:r>
           </w:p>
         </w:tc>
@@ -3347,7 +3399,7 @@
                 <w:sz w:val="22"/>
                 <w:szCs w:val="22"/>
               </w:rPr>
-              <w:t xml:space="preserve">7,000</w:t>
+              <w:t xml:space="preserve">7,300</w:t>
             </w:r>
           </w:p>
         </w:tc>
@@ -3397,7 +3449,7 @@
                 <w:sz w:val="22"/>
                 <w:szCs w:val="22"/>
               </w:rPr>
-              <w:t xml:space="preserve">Excess recovered over the Noticee’s own final figure of Rs 2,13,738</w:t>
+              <w:t xml:space="preserve">Cutting charge of Rs 2 per sq. ft. on 1622.907 sq. ft., introduced for the first time on the date of despatch</w:t>
             </w:r>
           </w:p>
         </w:tc>
@@ -3422,7 +3474,7 @@
                 <w:sz w:val="22"/>
                 <w:szCs w:val="22"/>
               </w:rPr>
-              <w:t xml:space="preserve">7,462</w:t>
+              <w:t xml:space="preserve">3,246</w:t>
             </w:r>
           </w:p>
         </w:tc>
@@ -3472,7 +3524,7 @@
                 <w:sz w:val="22"/>
                 <w:szCs w:val="22"/>
               </w:rPr>
-              <w:t xml:space="preserve">Cutting charge of Rs 2 per sq. ft. on 1622.907 sq. ft. levied without prior disclosure</w:t>
+              <w:t xml:space="preserve">Loading charge, introduced for the first time on the date of despatch</w:t>
             </w:r>
           </w:p>
         </w:tc>
@@ -3497,7 +3549,7 @@
                 <w:sz w:val="22"/>
                 <w:szCs w:val="22"/>
               </w:rPr>
-              <w:t xml:space="preserve">3,246</w:t>
+              <w:t xml:space="preserve">1,000</w:t>
             </w:r>
           </w:p>
         </w:tc>
@@ -3547,7 +3599,7 @@
                 <w:sz w:val="22"/>
                 <w:szCs w:val="22"/>
               </w:rPr>
-              <w:t xml:space="preserve">Loading charge levied without prior disclosure</w:t>
+              <w:t xml:space="preserve">Differential of Rs 10 per sq. ft. on 228.79 sq. ft. re-rated at Rs 132 in place of Rs 122, introduced for the first time on the date of despatch</w:t>
             </w:r>
           </w:p>
         </w:tc>
@@ -3572,7 +3624,7 @@
                 <w:sz w:val="22"/>
                 <w:szCs w:val="22"/>
               </w:rPr>
-              <w:t xml:space="preserve">1,000</w:t>
+              <w:t xml:space="preserve">2,288</w:t>
             </w:r>
           </w:p>
         </w:tc>
@@ -3622,7 +3674,7 @@
                 <w:sz w:val="22"/>
                 <w:szCs w:val="22"/>
               </w:rPr>
-              <w:t xml:space="preserve">Differential of Rs 10 per sq. ft. on 228.79 sq. ft. charged at Rs 132 in place of Rs 122, without prior disclosure</w:t>
+              <w:t xml:space="preserve">Travel, lodging and incidental expenses at Kolkata on 09.07.2026 to 11.07.2026 and on 22.08.2026</w:t>
             </w:r>
           </w:p>
         </w:tc>
@@ -3647,7 +3699,7 @@
                 <w:sz w:val="22"/>
                 <w:szCs w:val="22"/>
               </w:rPr>
-              <w:t xml:space="preserve">2,288</w:t>
+              <w:t xml:space="preserve">[AMOUNT]</w:t>
             </w:r>
           </w:p>
         </w:tc>
@@ -3670,81 +3722,6 @@
             <w:r>
               <w:rPr>
                 <w:rFonts w:ascii="Calibri" w:cs="Calibri" w:eastAsia="Calibri" w:hAnsi="Calibri"/>
-                <w:sz w:val="22"/>
-                <w:szCs w:val="22"/>
-              </w:rPr>
-              <w:t xml:space="preserve">10.</w:t>
-            </w:r>
-          </w:p>
-        </w:tc>
-        <w:tc>
-          <w:tcPr>
-            <w:tcW w:type="dxa" w:w="6800"/>
-            <w:tcMar>
-              <w:top w:type="dxa" w:w="80"/>
-              <w:left w:type="dxa" w:w="110"/>
-              <w:bottom w:type="dxa" w:w="80"/>
-              <w:right w:type="dxa" w:w="110"/>
-            </w:tcMar>
-          </w:tcPr>
-          <w:p>
-            <w:pPr>
-              <w:spacing w:after="0" w:line="276"/>
-            </w:pPr>
-            <w:r>
-              <w:rPr>
-                <w:rFonts w:ascii="Calibri" w:cs="Calibri" w:eastAsia="Calibri" w:hAnsi="Calibri"/>
-                <w:sz w:val="22"/>
-                <w:szCs w:val="22"/>
-              </w:rPr>
-              <w:t xml:space="preserve">Travel, lodging and incidental expenses at Kolkata on 09.07.2026 to 11.07.2026 and on 22.08.2026</w:t>
-            </w:r>
-          </w:p>
-        </w:tc>
-        <w:tc>
-          <w:tcPr>
-            <w:tcW w:type="dxa" w:w="1800"/>
-            <w:tcMar>
-              <w:top w:type="dxa" w:w="80"/>
-              <w:left w:type="dxa" w:w="110"/>
-              <w:bottom w:type="dxa" w:w="80"/>
-              <w:right w:type="dxa" w:w="110"/>
-            </w:tcMar>
-          </w:tcPr>
-          <w:p>
-            <w:pPr>
-              <w:spacing w:after="0" w:line="276"/>
-              <w:jc w:val="right"/>
-            </w:pPr>
-            <w:r>
-              <w:rPr>
-                <w:rFonts w:ascii="Calibri" w:cs="Calibri" w:eastAsia="Calibri" w:hAnsi="Calibri"/>
-                <w:sz w:val="22"/>
-                <w:szCs w:val="22"/>
-              </w:rPr>
-              <w:t xml:space="preserve">[AMOUNT]</w:t>
-            </w:r>
-          </w:p>
-        </w:tc>
-      </w:tr>
-      <w:tr>
-        <w:tc>
-          <w:tcPr>
-            <w:tcW w:type="dxa" w:w="700"/>
-            <w:tcMar>
-              <w:top w:type="dxa" w:w="80"/>
-              <w:left w:type="dxa" w:w="110"/>
-              <w:bottom w:type="dxa" w:w="80"/>
-              <w:right w:type="dxa" w:w="110"/>
-            </w:tcMar>
-          </w:tcPr>
-          <w:p>
-            <w:pPr>
-              <w:spacing w:after="0" w:line="276"/>
-            </w:pPr>
-            <w:r>
-              <w:rPr>
-                <w:rFonts w:ascii="Calibri" w:cs="Calibri" w:eastAsia="Calibri" w:hAnsi="Calibri"/>
                 <w:b/>
                 <w:bCs/>
                 <w:sz w:val="22"/>
@@ -3776,7 +3753,7 @@
                 <w:sz w:val="22"/>
                 <w:szCs w:val="22"/>
               </w:rPr>
-              <w:t xml:space="preserve">Total quantified out-of-pocket loss (item 3 being included within item 2, and excluding item 10)</w:t>
+              <w:t xml:space="preserve">Total quantified out-of-pocket loss (item 3 being included within item 2, and excluding item 9)</w:t>
             </w:r>
           </w:p>
         </w:tc>
@@ -3803,7 +3780,7 @@
                 <w:sz w:val="22"/>
                 <w:szCs w:val="22"/>
               </w:rPr>
-              <w:t xml:space="preserve">35,936</w:t>
+              <w:t xml:space="preserve">28,774</w:t>
             </w:r>
           </w:p>
         </w:tc>
@@ -3942,7 +3919,7 @@
           <w:sz w:val="22"/>
           <w:szCs w:val="22"/>
         </w:rPr>
-        <w:t xml:space="preserve">Reimburse to my client the freight of Rs 7,000 paid on 29.07.2026 and Rs 6,940 paid on 22.08.2026, delivery at Jhargram being your obligation under your own signed order note of 02.06.2026;</w:t>
+        <w:t xml:space="preserve">Reimburse to my client the freight of Rs 7,000 paid on 29.07.2026 and Rs 6,940 paid on 22.08.2026, both having been made necessary solely by your own admitted default, my client having already paid you Rs 13,000 towards carriage under your statement of 11.07.2026;</w:t>
       </w:r>
     </w:p>
     <w:p>
@@ -3960,7 +3937,7 @@
           <w:sz w:val="22"/>
           <w:szCs w:val="22"/>
         </w:rPr>
-        <w:t xml:space="preserve">Reimburse to my client Rs 1,000 towards re-measurement and Rs 7,000 towards the cutting and re-fitting of 73 doors at the customer’s site;</w:t>
+        <w:t xml:space="preserve">Reimburse to my client Rs 1,000 towards re-measurement and Rs 7,300 towards the cutting and re-fitting of 73 doors at the customer’s site;</w:t>
       </w:r>
     </w:p>
     <w:p>
@@ -3978,7 +3955,7 @@
           <w:sz w:val="22"/>
           <w:szCs w:val="22"/>
         </w:rPr>
-        <w:t xml:space="preserve">Refund the sum of Rs 7,462 recovered in excess of your own final figure of Rs 2,13,738;</w:t>
+        <w:t xml:space="preserve">Account for the increase of Rs 7,476.50 made between your statement of 08.07.2026 and your statement of 11.07.2026, and refund so much of it as represents the cutting charge, the loading charge and the re-rating of the short sizes;</w:t>
       </w:r>
     </w:p>
     <w:p>
@@ -4014,7 +3991,7 @@
           <w:sz w:val="22"/>
           <w:szCs w:val="22"/>
         </w:rPr>
-        <w:t xml:space="preserve">Issue a credit note and/or delivery challan in respect of the 21 pcs returned to you on 30.07.2026, so as to enable my client to correctly reflect the transaction in his statutory records.</w:t>
+        <w:t xml:space="preserve">Issue forthwith a credit note in respect of the 21 pcs returned to you on 30.07.2026, no credit note having been issued and no debit note accepted at the time, so as to enable my client to correctly reflect the transaction in his statutory records.</w:t>
       </w:r>
     </w:p>
     <w:p>

</xml_diff>

<commit_message>
Correct the delay computation and add further facts
The interval from the 2 June order to delivery on 12 July is 40 days,
not 37. Adds the oral 10-working-day representation made at the office
on 2 June, the four payment-chasing calls between 4 and 9 June, the
thickness mismatch against the sample shown at the office, the call
disconnected on 21 August over the labour day-off claim, and the
manager's statement on 22 August that the supplier had refused to issue
any bill.

Co-Authored-By: Claude Opus 5 <noreply@anthropic.com>
Claude-Session: https://claude.ai/code/session_01JwS8aN6FDpkQcEk2vsBb7X
</commit_message>
<xml_diff>
--- a/legal/Legal-Notice-Draft-Wood-and-Wood-Products.docx
+++ b/legal/Legal-Notice-Draft-Wood-and-Wood-Products.docx
@@ -1763,7 +1763,7 @@
                 <w:sz w:val="22"/>
                 <w:szCs w:val="22"/>
               </w:rPr>
-              <w:t xml:space="preserve">09.06.2026</w:t>
+              <w:t xml:space="preserve">04.06.2026 to 09.06.2026</w:t>
             </w:r>
           </w:p>
         </w:tc>
@@ -1787,7 +1787,7 @@
                 <w:sz w:val="22"/>
                 <w:szCs w:val="22"/>
               </w:rPr>
-              <w:t xml:space="preserve">Rs 80,000 transferred to the said account of M/s Wood and Wood Products.</w:t>
+              <w:t xml:space="preserve">You telephoned my client four times in these six days to press for the balance advance. At no point in any of those calls was any cutting charge, loading charge or differential rate mentioned.</w:t>
             </w:r>
           </w:p>
         </w:tc>
@@ -1815,7 +1815,7 @@
                 <w:sz w:val="22"/>
                 <w:szCs w:val="22"/>
               </w:rPr>
-              <w:t xml:space="preserve">22.06.2026</w:t>
+              <w:t xml:space="preserve">09.06.2026</w:t>
             </w:r>
           </w:p>
         </w:tc>
@@ -1839,7 +1839,7 @@
                 <w:sz w:val="22"/>
                 <w:szCs w:val="22"/>
               </w:rPr>
-              <w:t xml:space="preserve">My client recorded in writing: “13-Days ho gya hai Payment kiye ?? 10-15din Maximum bole thy…” No delivery was made.</w:t>
+              <w:t xml:space="preserve">Rs 80,000 transferred to the said account of M/s Wood and Wood Products.</w:t>
             </w:r>
           </w:p>
         </w:tc>
@@ -1867,7 +1867,7 @@
                 <w:sz w:val="22"/>
                 <w:szCs w:val="22"/>
               </w:rPr>
-              <w:t xml:space="preserve">08.07.2026</w:t>
+              <w:t xml:space="preserve">22.06.2026</w:t>
             </w:r>
           </w:p>
         </w:tc>
@@ -1891,7 +1891,7 @@
                 <w:sz w:val="22"/>
                 <w:szCs w:val="22"/>
               </w:rPr>
-              <w:t xml:space="preserve">The Noticee furnished the details of two savings accounts of third parties — a PhonePe collect code of Sri Ramkrishna Mondal and the number +91 90621 80929 of Sri Ajay Sharma — against which Rs 50,000 and Rs 20,000 respectively were paid the same evening.</w:t>
+              <w:t xml:space="preserve">My client recorded in writing: “13-Days ho gya hai Payment kiye ?? 10-15din Maximum bole thy…” No delivery was made.</w:t>
             </w:r>
           </w:p>
         </w:tc>
@@ -1919,7 +1919,7 @@
                 <w:sz w:val="22"/>
                 <w:szCs w:val="22"/>
               </w:rPr>
-              <w:t xml:space="preserve">11.07.2026</w:t>
+              <w:t xml:space="preserve">08.07.2026</w:t>
             </w:r>
           </w:p>
         </w:tc>
@@ -1943,7 +1943,7 @@
                 <w:sz w:val="22"/>
                 <w:szCs w:val="22"/>
               </w:rPr>
-              <w:t xml:space="preserve">The Noticee again nominated the account of Sri Ajay Sharma and Rs 51,200 was transferred. The goods were despatched. The tax invoice sent was made out in the name of a stranger, “ASF PLYWOOD, 163 Ishwaripur, PS Rahara”, and not in the name of my client.</w:t>
+              <w:t xml:space="preserve">The Noticee furnished the details of two savings accounts of third parties — a PhonePe collect code of Sri Ramkrishna Mondal and the number +91 90621 80929 of Sri Ajay Sharma — against which Rs 50,000 and Rs 20,000 respectively were paid the same evening.</w:t>
             </w:r>
           </w:p>
         </w:tc>
@@ -1971,7 +1971,7 @@
                 <w:sz w:val="22"/>
                 <w:szCs w:val="22"/>
               </w:rPr>
-              <w:t xml:space="preserve">12.07.2026</w:t>
+              <w:t xml:space="preserve">11.07.2026</w:t>
             </w:r>
           </w:p>
         </w:tc>
@@ -1995,7 +1995,7 @@
                 <w:sz w:val="22"/>
                 <w:szCs w:val="22"/>
               </w:rPr>
-              <w:t xml:space="preserve">The goods reached the customer’s site at Jhargram — 37 days after the order. My client pointed out at 11:18 hrs that the invoice was in the name of ASF Plywood. The Noticee replied that a revised invoice would be sent.</w:t>
+              <w:t xml:space="preserve">The Noticee again nominated the account of Sri Ajay Sharma and Rs 51,200 was transferred. The goods were despatched. The tax invoice sent was made out in the name of a stranger, “ASF PLYWOOD, 163 Ishwaripur, PS Rahara”, and not in the name of my client.</w:t>
             </w:r>
           </w:p>
         </w:tc>
@@ -2023,7 +2023,7 @@
                 <w:sz w:val="22"/>
                 <w:szCs w:val="22"/>
               </w:rPr>
-              <w:t xml:space="preserve">13.07.2026</w:t>
+              <w:t xml:space="preserve">12.07.2026</w:t>
             </w:r>
           </w:p>
         </w:tc>
@@ -2047,7 +2047,7 @@
                 <w:sz w:val="22"/>
                 <w:szCs w:val="22"/>
               </w:rPr>
-              <w:t xml:space="preserve">Revised tax invoice no. 18/WWP/26-27 dated 13-07-2026 issued, billed to my client and shipped to M/s Kriti Construction, Jhargram, along with e-way bill no. 8517 1317 0306 and motor vehicle no. WB19S0857.</w:t>
+              <w:t xml:space="preserve">The goods reached the customer’s site at Jhargram — 40 days after the order of 02.06.2026 and 38 days after the specification of 04.06.2026. My client pointed out at 11:18 hrs that the invoice was in the name of ASF Plywood. The Noticee replied that a revised invoice would be sent.</w:t>
             </w:r>
           </w:p>
         </w:tc>
@@ -2075,7 +2075,7 @@
                 <w:sz w:val="22"/>
                 <w:szCs w:val="22"/>
               </w:rPr>
-              <w:t xml:space="preserve">16.07.2026</w:t>
+              <w:t xml:space="preserve">13.07.2026</w:t>
             </w:r>
           </w:p>
         </w:tc>
@@ -2099,7 +2099,7 @@
                 <w:sz w:val="22"/>
                 <w:szCs w:val="22"/>
               </w:rPr>
-              <w:t xml:space="preserve">On inspection my client recorded the defects in writing: of the 69 pcs lamination ordered (all widths within 32″), 10 pcs had been manufactured 36″/36.5″ wide, and 11 pcs had been supplied in MEMBRANE where LAMINATION had been ordered. Several lamination doors were supplied with one-side design although both-side design had been agreed, and the thickness was not uniform.</w:t>
+              <w:t xml:space="preserve">Revised tax invoice no. 18/WWP/26-27 dated 13-07-2026 issued, billed to my client and shipped to M/s Kriti Construction, Jhargram, along with e-way bill no. 8517 1317 0306 and motor vehicle no. WB19S0857.</w:t>
             </w:r>
           </w:p>
         </w:tc>
@@ -2127,7 +2127,7 @@
                 <w:sz w:val="22"/>
                 <w:szCs w:val="22"/>
               </w:rPr>
-              <w:t xml:space="preserve">17.07.2026</w:t>
+              <w:t xml:space="preserve">16.07.2026</w:t>
             </w:r>
           </w:p>
         </w:tc>
@@ -2151,7 +2151,7 @@
                 <w:sz w:val="22"/>
                 <w:szCs w:val="22"/>
               </w:rPr>
-              <w:t xml:space="preserve">The Noticee admitted the defect in writing: “Aur isko return karwa dijiye, change karke bhejwa denge.” On being asked who would bear the freight and by when the replacement would come, the Noticee replied only “Jab ayega usko dhek ke Bata panga”.</w:t>
+              <w:t xml:space="preserve">On inspection my client recorded the defects in writing: of the 69 pcs lamination ordered (all widths within 32″), 10 pcs had been manufactured 36″/36.5″ wide, and 11 pcs had been supplied in MEMBRANE where LAMINATION had been ordered. Several lamination doors were supplied with one-side design although both-side design had been agreed, and the thickness was not uniform.</w:t>
             </w:r>
           </w:p>
         </w:tc>
@@ -2179,7 +2179,7 @@
                 <w:sz w:val="22"/>
                 <w:szCs w:val="22"/>
               </w:rPr>
-              <w:t xml:space="preserve">20.07.2026</w:t>
+              <w:t xml:space="preserve">17.07.2026</w:t>
             </w:r>
           </w:p>
         </w:tc>
@@ -2203,7 +2203,7 @@
                 <w:sz w:val="22"/>
                 <w:szCs w:val="22"/>
               </w:rPr>
-              <w:t xml:space="preserve">My client sent five pages of measurements comparing the ordered size against the size actually supplied, recording that the sizes were out by 2 suta to 1 inch throughout, and that two carpenters had spent a full day measuring. He recorded that the customer would bear no extra cost and that the freight of Rs 7,000 each way arose from the Noticee’s default.</w:t>
+              <w:t xml:space="preserve">The Noticee admitted the defect in writing: “Aur isko return karwa dijiye, change karke bhejwa denge.” On being asked who would bear the freight and by when the replacement would come, the Noticee replied only “Jab ayega usko dhek ke Bata panga”.</w:t>
             </w:r>
           </w:p>
         </w:tc>
@@ -2231,7 +2231,7 @@
                 <w:sz w:val="22"/>
                 <w:szCs w:val="22"/>
               </w:rPr>
-              <w:t xml:space="preserve">29.07.2026</w:t>
+              <w:t xml:space="preserve">20.07.2026</w:t>
             </w:r>
           </w:p>
         </w:tc>
@@ -2255,7 +2255,7 @@
                 <w:sz w:val="22"/>
                 <w:szCs w:val="22"/>
               </w:rPr>
-              <w:t xml:space="preserve">The 21 defective doors were despatched to the Noticee’s factory at my client’s own cost of Rs 7,000, the Noticee having refused to bear it.</w:t>
+              <w:t xml:space="preserve">My client sent five pages of measurements comparing the ordered size against the size actually supplied, recording that the sizes were out by 2 suta to 1 inch throughout, and that two carpenters had spent a full day measuring. He recorded that the customer would bear no extra cost and that the freight of Rs 7,000 each way arose from the Noticee’s default.</w:t>
             </w:r>
           </w:p>
         </w:tc>
@@ -2283,7 +2283,7 @@
                 <w:sz w:val="22"/>
                 <w:szCs w:val="22"/>
               </w:rPr>
-              <w:t xml:space="preserve">30.07.2026</w:t>
+              <w:t xml:space="preserve">29.07.2026</w:t>
             </w:r>
           </w:p>
         </w:tc>
@@ -2307,7 +2307,7 @@
                 <w:sz w:val="22"/>
                 <w:szCs w:val="22"/>
               </w:rPr>
-              <w:t xml:space="preserve">The goods reached the factory and were measured and noted by the Noticee’s own man. The Noticee stated: “This will take time — Will rectify and send — Cannot confirm exact time now.” My client called upon the Noticee to refund the price of the 21 pcs if they could not be delivered by Tuesday. No refund was made.</w:t>
+              <w:t xml:space="preserve">The 21 defective doors were despatched to the Noticee’s factory at my client’s own cost of Rs 7,000, the Noticee having refused to bear it.</w:t>
             </w:r>
           </w:p>
         </w:tc>
@@ -2335,7 +2335,7 @@
                 <w:sz w:val="22"/>
                 <w:szCs w:val="22"/>
               </w:rPr>
-              <w:t xml:space="preserve">31.07.2026</w:t>
+              <w:t xml:space="preserve">30.07.2026</w:t>
             </w:r>
           </w:p>
         </w:tc>
@@ -2359,7 +2359,7 @@
                 <w:sz w:val="22"/>
                 <w:szCs w:val="22"/>
               </w:rPr>
-              <w:t xml:space="preserve">My client had set out for the factory to inspect. The Noticee messaged “No need to come.”</w:t>
+              <w:t xml:space="preserve">The goods reached the factory and were measured and noted by the Noticee’s own man. The Noticee stated: “This will take time — Will rectify and send — Cannot confirm exact time now.” My client called upon the Noticee to refund the price of the 21 pcs if they could not be delivered by Tuesday. No refund was made.</w:t>
             </w:r>
           </w:p>
         </w:tc>
@@ -2387,7 +2387,7 @@
                 <w:sz w:val="22"/>
                 <w:szCs w:val="22"/>
               </w:rPr>
-              <w:t xml:space="preserve">07.08.2026 &amp; 11.08.2026</w:t>
+              <w:t xml:space="preserve">31.07.2026</w:t>
             </w:r>
           </w:p>
         </w:tc>
@@ -2411,7 +2411,7 @@
                 <w:sz w:val="22"/>
                 <w:szCs w:val="22"/>
               </w:rPr>
-              <w:t xml:space="preserve">My client’s customer abused him and attended his office. On being pressed, the Noticee replied: “Then wait kariye”, “I don’t care. Mereko mat boliye” and “But koi bakwass nai sunuenga”.</w:t>
+              <w:t xml:space="preserve">My client had set out for the factory to inspect. The Noticee messaged “No need to come.”</w:t>
             </w:r>
           </w:p>
         </w:tc>
@@ -2439,6 +2439,58 @@
                 <w:sz w:val="22"/>
                 <w:szCs w:val="22"/>
               </w:rPr>
+              <w:t xml:space="preserve">07.08.2026 &amp; 11.08.2026</w:t>
+            </w:r>
+          </w:p>
+        </w:tc>
+        <w:tc>
+          <w:tcPr>
+            <w:tcW w:type="dxa" w:w="7200"/>
+            <w:tcMar>
+              <w:top w:type="dxa" w:w="80"/>
+              <w:left w:type="dxa" w:w="110"/>
+              <w:bottom w:type="dxa" w:w="80"/>
+              <w:right w:type="dxa" w:w="110"/>
+            </w:tcMar>
+          </w:tcPr>
+          <w:p>
+            <w:pPr>
+              <w:spacing w:after="0" w:line="276"/>
+            </w:pPr>
+            <w:r>
+              <w:rPr>
+                <w:rFonts w:ascii="Calibri" w:cs="Calibri" w:eastAsia="Calibri" w:hAnsi="Calibri"/>
+                <w:sz w:val="22"/>
+                <w:szCs w:val="22"/>
+              </w:rPr>
+              <w:t xml:space="preserve">My client’s customer abused him and attended his office. On being pressed, the Noticee replied: “Then wait kariye”, “I don’t care. Mereko mat boliye” and “But koi bakwass nai sunuenga”.</w:t>
+            </w:r>
+          </w:p>
+        </w:tc>
+      </w:tr>
+      <w:tr>
+        <w:tc>
+          <w:tcPr>
+            <w:tcW w:type="dxa" w:w="2100"/>
+            <w:tcMar>
+              <w:top w:type="dxa" w:w="80"/>
+              <w:left w:type="dxa" w:w="110"/>
+              <w:bottom w:type="dxa" w:w="80"/>
+              <w:right w:type="dxa" w:w="110"/>
+            </w:tcMar>
+          </w:tcPr>
+          <w:p>
+            <w:pPr>
+              <w:spacing w:after="0" w:line="276"/>
+            </w:pPr>
+            <w:r>
+              <w:rPr>
+                <w:rFonts w:ascii="Calibri" w:cs="Calibri" w:eastAsia="Calibri" w:hAnsi="Calibri"/>
+                <w:b/>
+                <w:bCs/>
+                <w:sz w:val="22"/>
+                <w:szCs w:val="22"/>
+              </w:rPr>
               <w:t xml:space="preserve">12.08.2026 to 21.08.2026</w:t>
             </w:r>
           </w:p>
@@ -2464,6 +2516,58 @@
                 <w:szCs w:val="22"/>
               </w:rPr>
               <w:t xml:space="preserve">The ready-date was shifted from Friday, to “Tomorrow evening”, to Monday (confirmed “Pakka Final Na??” — “Yes.”), and then abandoned on 17.08.2026 with “Nai. Weather dhek rhe hai?”.</w:t>
+            </w:r>
+          </w:p>
+        </w:tc>
+      </w:tr>
+      <w:tr>
+        <w:tc>
+          <w:tcPr>
+            <w:tcW w:type="dxa" w:w="2100"/>
+            <w:tcMar>
+              <w:top w:type="dxa" w:w="80"/>
+              <w:left w:type="dxa" w:w="110"/>
+              <w:bottom w:type="dxa" w:w="80"/>
+              <w:right w:type="dxa" w:w="110"/>
+            </w:tcMar>
+          </w:tcPr>
+          <w:p>
+            <w:pPr>
+              <w:spacing w:after="0" w:line="276"/>
+            </w:pPr>
+            <w:r>
+              <w:rPr>
+                <w:rFonts w:ascii="Calibri" w:cs="Calibri" w:eastAsia="Calibri" w:hAnsi="Calibri"/>
+                <w:b/>
+                <w:bCs/>
+                <w:sz w:val="22"/>
+                <w:szCs w:val="22"/>
+              </w:rPr>
+              <w:t xml:space="preserve">21.08.2026, 4:00 p.m.</w:t>
+            </w:r>
+          </w:p>
+        </w:tc>
+        <w:tc>
+          <w:tcPr>
+            <w:tcW w:type="dxa" w:w="7200"/>
+            <w:tcMar>
+              <w:top w:type="dxa" w:w="80"/>
+              <w:left w:type="dxa" w:w="110"/>
+              <w:bottom w:type="dxa" w:w="80"/>
+              <w:right w:type="dxa" w:w="110"/>
+            </w:tcMar>
+          </w:tcPr>
+          <w:p>
+            <w:pPr>
+              <w:spacing w:after="0" w:line="276"/>
+            </w:pPr>
+            <w:r>
+              <w:rPr>
+                <w:rFonts w:ascii="Calibri" w:cs="Calibri" w:eastAsia="Calibri" w:hAnsi="Calibri"/>
+                <w:sz w:val="22"/>
+                <w:szCs w:val="22"/>
+              </w:rPr>
+              <w:t xml:space="preserve">The Noticee disconnected my client’s call without hearing him out, asserting that my client had caused the labour to be given the day off. The labour deny that any day off was given.</w:t>
             </w:r>
           </w:p>
         </w:tc>
@@ -2767,7 +2871,7 @@
           <w:sz w:val="22"/>
           <w:szCs w:val="22"/>
         </w:rPr>
-        <w:t xml:space="preserve">3.1  DELAY IN DELIVERY. On 19.07.2025 you represented in writing that your terms were “40% advance / 12-13 days delivery”. The order was placed on 02.06.2026, the specification furnished on 04.06.2026, and 40% of the price stood paid by 09.06.2026. Delivery was nevertheless effected only on 11.07.2026 and the goods reached the site on 12.07.2026, being 37 days from the date of the order. Time was of the essence and you were aware throughout that the goods were required for onward supply to a builder at a live construction site.</w:t>
+        <w:t xml:space="preserve">3.1  DELAY IN DELIVERY. On 19.07.2025 you represented in writing that your terms were “40% advance / 12-13 days delivery”. The order was placed on 02.06.2026, the specification furnished on 04.06.2026, and 40% of the price stood paid by 09.06.2026. At the meeting of 02.06.2026 you repeated orally that despatch would be within 10 working days, and that the monsoon might extend this to 15 days at the outside. Delivery was nevertheless effected only on 11.07.2026 and the goods reached the site on 12.07.2026, being 40 days from the date of the order and 38 days from the date of the specification. Time was of the essence and you were aware throughout that the goods were required for onward supply to a builder at a live construction site.</w:t>
       </w:r>
     </w:p>
     <w:p>
@@ -2780,7 +2884,7 @@
           <w:sz w:val="22"/>
           <w:szCs w:val="22"/>
         </w:rPr>
-        <w:t xml:space="preserve">3.2  MISREPRESENTATION AS TO CAPACITY. When my client asked, before placing the order, whether there would be any difficulty as to quality, you represented in writing that “humlog 3000-3500 monthly banate hai, aisse toh koi dikkat aata nai”. On the strength of that representation my client placed the order. An order of 94 pieces then took 37 days, and the replacement of 21 pieces has taken a further six weeks and is still incomplete.</w:t>
+        <w:t xml:space="preserve">3.2  MISREPRESENTATION AS TO CAPACITY. When my client asked, before placing the order, whether there would be any difficulty as to quality, you represented in writing that “humlog 3000-3500 monthly banate hai, aisse toh koi dikkat aata nai”. On the strength of that representation my client placed the order. An order of 94 pieces then took 40 days, and the replacement of 21 pieces has taken a further six weeks and is still incomplete.</w:t>
       </w:r>
     </w:p>
     <w:p>
@@ -2806,7 +2910,7 @@
           <w:sz w:val="22"/>
           <w:szCs w:val="22"/>
         </w:rPr>
-        <w:t xml:space="preserve">3.4  SUPPLY OF NON-CONFORMING GOODS. Against the size list of 04.06.2026, in which every lamination door was within 32 inches in width, you manufactured 10 pcs at 36 inches and 36.5 inches. You further supplied 11 pcs in MEMBRANE where LAMINATION had been ordered. You supplied lamination doors with a design on one side only although both-side design had been agreed, and the thickness of the doors was not uniform. The sizes of the remaining doors were out by between 2 suta and 1 inch, so that my client’s customer had to engage carpenters to cut and re-fit the consignment.</w:t>
+        <w:t xml:space="preserve">3.4  SUPPLY OF NON-CONFORMING GOODS. Against the size list of 04.06.2026, in which every lamination door was within 32 inches in width, you manufactured 10 pcs at 36 inches and 36.5 inches. You further supplied 11 pcs in MEMBRANE where LAMINATION had been ordered. You supplied lamination doors with a design on one side only although both-side design had been agreed, and the thickness of the doors was neither uniform among themselves nor matching the sample you had shown my client at your office on 02.06.2026. The sizes of the remaining doors were out by between 2 suta and 1 inch, so that my client’s customer had to engage carpenters to cut and re-fit the consignment.</w:t>
       </w:r>
     </w:p>
     <w:p>

</xml_diff>

<commit_message>
Record the supplier's reply of 23 August
His answer to the full written account was "You can do whatever you feel
is right", disputing nothing and offering neither the challan, the credit
note nor any settlement. Pleaded as an admission by non-denial and as a
refusal to remedy.

Co-Authored-By: Claude Opus 5 <noreply@anthropic.com>
Claude-Session: https://claude.ai/code/session_01JwS8aN6FDpkQcEk2vsBb7X
</commit_message>
<xml_diff>
--- a/legal/Legal-Notice-Draft-Wood-and-Wood-Products.docx
+++ b/legal/Legal-Notice-Draft-Wood-and-Wood-Products.docx
@@ -2832,6 +2832,110 @@
           </w:p>
         </w:tc>
       </w:tr>
+      <w:tr>
+        <w:tc>
+          <w:tcPr>
+            <w:tcW w:type="dxa" w:w="2100"/>
+            <w:tcMar>
+              <w:top w:type="dxa" w:w="80"/>
+              <w:left w:type="dxa" w:w="110"/>
+              <w:bottom w:type="dxa" w:w="80"/>
+              <w:right w:type="dxa" w:w="110"/>
+            </w:tcMar>
+          </w:tcPr>
+          <w:p>
+            <w:pPr>
+              <w:spacing w:after="0" w:line="276"/>
+            </w:pPr>
+            <w:r>
+              <w:rPr>
+                <w:rFonts w:ascii="Calibri" w:cs="Calibri" w:eastAsia="Calibri" w:hAnsi="Calibri"/>
+                <w:b/>
+                <w:bCs/>
+                <w:sz w:val="22"/>
+                <w:szCs w:val="22"/>
+              </w:rPr>
+              <w:t xml:space="preserve">22.08.2026, 23:58 hrs</w:t>
+            </w:r>
+          </w:p>
+        </w:tc>
+        <w:tc>
+          <w:tcPr>
+            <w:tcW w:type="dxa" w:w="7200"/>
+            <w:tcMar>
+              <w:top w:type="dxa" w:w="80"/>
+              <w:left w:type="dxa" w:w="110"/>
+              <w:bottom w:type="dxa" w:w="80"/>
+              <w:right w:type="dxa" w:w="110"/>
+            </w:tcMar>
+          </w:tcPr>
+          <w:p>
+            <w:pPr>
+              <w:spacing w:after="0" w:line="276"/>
+            </w:pPr>
+            <w:r>
+              <w:rPr>
+                <w:rFonts w:ascii="Calibri" w:cs="Calibri" w:eastAsia="Calibri" w:hAnsi="Calibri"/>
+                <w:sz w:val="22"/>
+                <w:szCs w:val="22"/>
+              </w:rPr>
+              <w:t xml:space="preserve">My client sent you a detailed written account of the entire transaction — the delivery promise, the 40-day delay, the rate increased on the day of despatch, the non-conforming goods, the freight borne three times, the absence of any credit note, the events of 21 and 22 August, the fact that the doors were dried indoors within the shed with no sunlight involved at all, and the defects in the replacement goods — followed at 00:00 hrs by video recorded at your own factory.</w:t>
+            </w:r>
+          </w:p>
+        </w:tc>
+      </w:tr>
+      <w:tr>
+        <w:tc>
+          <w:tcPr>
+            <w:tcW w:type="dxa" w:w="2100"/>
+            <w:tcMar>
+              <w:top w:type="dxa" w:w="80"/>
+              <w:left w:type="dxa" w:w="110"/>
+              <w:bottom w:type="dxa" w:w="80"/>
+              <w:right w:type="dxa" w:w="110"/>
+            </w:tcMar>
+          </w:tcPr>
+          <w:p>
+            <w:pPr>
+              <w:spacing w:after="0" w:line="276"/>
+            </w:pPr>
+            <w:r>
+              <w:rPr>
+                <w:rFonts w:ascii="Calibri" w:cs="Calibri" w:eastAsia="Calibri" w:hAnsi="Calibri"/>
+                <w:b/>
+                <w:bCs/>
+                <w:sz w:val="22"/>
+                <w:szCs w:val="22"/>
+              </w:rPr>
+              <w:t xml:space="preserve">23.08.2026, 02:15 hrs</w:t>
+            </w:r>
+          </w:p>
+        </w:tc>
+        <w:tc>
+          <w:tcPr>
+            <w:tcW w:type="dxa" w:w="7200"/>
+            <w:tcMar>
+              <w:top w:type="dxa" w:w="80"/>
+              <w:left w:type="dxa" w:w="110"/>
+              <w:bottom w:type="dxa" w:w="80"/>
+              <w:right w:type="dxa" w:w="110"/>
+            </w:tcMar>
+          </w:tcPr>
+          <w:p>
+            <w:pPr>
+              <w:spacing w:after="0" w:line="276"/>
+            </w:pPr>
+            <w:r>
+              <w:rPr>
+                <w:rFonts w:ascii="Calibri" w:cs="Calibri" w:eastAsia="Calibri" w:hAnsi="Calibri"/>
+                <w:sz w:val="22"/>
+                <w:szCs w:val="22"/>
+              </w:rPr>
+              <w:t xml:space="preserve">You replied, in full: “You can do whatever you feel is right”. You did not dispute a single fact stated in that account. You offered no delivery challan, no credit note and no settlement. That reply is a refusal to remedy, and your failure to deny any part of the account is relied upon as an admission.</w:t>
+            </w:r>
+          </w:p>
+        </w:tc>
+      </w:tr>
     </w:tbl>
     <w:p>
       <w:pPr>
@@ -3002,6 +3106,19 @@
           <w:szCs w:val="22"/>
         </w:rPr>
         <w:t xml:space="preserve">3.11  THE REPLACEMENT GOODS ARE THEMSELVES DEFECTIVE. On inspection at your factory on 22.08.2026 the resin and skin in several of the replacement doors were found not to have adhered properly, leaving the core paper visible. My client reserves all his rights in respect of these defects, which are being separately documented upon receipt.</w:t>
+      </w:r>
+    </w:p>
+    <w:p>
+      <w:pPr>
+        <w:spacing w:after="120" w:line="276"/>
+      </w:pPr>
+      <w:r>
+        <w:rPr>
+          <w:rFonts w:ascii="Calibri" w:cs="Calibri" w:eastAsia="Calibri" w:hAnsi="Calibri"/>
+          <w:sz w:val="22"/>
+          <w:szCs w:val="22"/>
+        </w:rPr>
+        <w:t xml:space="preserve">3.12  YOUR OWN ANSWER. On the night of 22.08.2026 my client set out to you in writing, in detail and with dates, every matter stated in this notice, and sent you video recorded at your own factory. At 02:15 hrs on 23.08.2026 you replied in these words and no others: “You can do whatever you feel is right.” You did not dispute one fact. You did not offer the challan, the credit note or any settlement. Every allegation in that account therefore stands admitted by your silence, and your reply is itself a refusal to make good your admitted default.</w:t>
       </w:r>
     </w:p>
     <w:p>

</xml_diff>